<commit_message>
docs(report 2): Added introduction.
Moving over to use word on windows so as to get the formatting correct
and not have the issue of formatting on libreoffice.
</commit_message>
<xml_diff>
--- a/Documentation/report_2/COM629_DIS_AE2_Oliver_Myers.docx
+++ b/Documentation/report_2/COM629_DIS_AE2_Oliver_Myers.docx
@@ -152,7 +152,7 @@
         <w:rPr>
           <w:rFonts w:cs="Arial" w:ascii="Trebuchet MS" w:hAnsi="Trebuchet MS"/>
           <w:bCs/>
-          <w:color w:val="FF0000"/>
+          <w:color w:val="auto"/>
           <w:sz w:val="32"/>
         </w:rPr>
         <w:t>Computing</w:t>
@@ -182,7 +182,7 @@
         <w:rPr>
           <w:rFonts w:cs="Arial" w:ascii="Trebuchet MS" w:hAnsi="Trebuchet MS"/>
           <w:bCs/>
-          <w:color w:val="FF0000"/>
+          <w:color w:val="auto"/>
           <w:sz w:val="32"/>
         </w:rPr>
         <w:t>Oliver Myers</w:t>
@@ -216,7 +216,7 @@
           <w:rStyle w:val="TitleChar"/>
           <w:rFonts w:cs="Arial" w:ascii="Trebuchet MS" w:hAnsi="Trebuchet MS"/>
           <w:bCs/>
-          <w:color w:val="FF0000"/>
+          <w:color w:val="auto"/>
           <w:sz w:val="44"/>
           <w:szCs w:val="44"/>
         </w:rPr>
@@ -633,7 +633,7 @@
           <w:rFonts w:cs="Arial"/>
           <w:b w:val="false"/>
           <w:bCs/>
-          <w:color w:val="FF0000"/>
+          <w:color w:val="auto"/>
           <w:szCs w:val="28"/>
         </w:rPr>
         <w:t>Nick Whitelegg</w:t>
@@ -664,7 +664,7 @@
           <w:rFonts w:cs="Arial"/>
           <w:b w:val="false"/>
           <w:bCs/>
-          <w:color w:val="FF0000"/>
+          <w:color w:val="auto"/>
           <w:szCs w:val="28"/>
         </w:rPr>
         <w:t>May 2026</w:t>
@@ -698,18 +698,6 @@
           <w:sz w:val="32"/>
           <w:szCs w:val="32"/>
         </w:rPr>
-      </w:pPr>
-      <w:r>
-        <w:rPr>
-          <w:rFonts w:cs="Arial" w:ascii="Trebuchet MS" w:hAnsi="Trebuchet MS"/>
-          <w:b/>
-          <w:sz w:val="32"/>
-          <w:szCs w:val="32"/>
-        </w:rPr>
-      </w:r>
-    </w:p>
-    <w:p>
-      <w:pPr>
         <w:sectPr>
           <w:footerReference w:type="even" r:id="rId2"/>
           <w:footerReference w:type="default" r:id="rId3"/>
@@ -725,12 +713,21 @@
         </w:sectPr>
       </w:pPr>
       <w:r>
+        <w:rPr>
+          <w:rFonts w:cs="Arial" w:ascii="Trebuchet MS" w:hAnsi="Trebuchet MS"/>
+          <w:b/>
+          <w:sz w:val="32"/>
+          <w:szCs w:val="32"/>
+        </w:rPr>
+      </w:r>
+      <w:r>
         <w:br w:type="page"/>
       </w:r>
     </w:p>
     <w:p>
       <w:pPr>
         <w:pStyle w:val="Heading1"/>
+        <w:spacing w:before="0" w:after="0"/>
         <w:rPr>
           <w:color w:themeColor="text1" w:val="000000"/>
         </w:rPr>
@@ -854,7 +851,7 @@
     <w:p>
       <w:pPr>
         <w:pStyle w:val="Normal"/>
-        <w:spacing w:lineRule="auto" w:line="360" w:before="0" w:after="200"/>
+        <w:spacing w:lineRule="auto" w:line="360" w:before="0" w:after="0"/>
         <w:rPr>
           <w:rFonts w:ascii="Trebuchet MS" w:hAnsi="Trebuchet MS"/>
           <w:color w:val="FF0000"/>
@@ -882,7 +879,7 @@
           <w:pgNumType w:start="1" w:fmt="decimal"/>
           <w:formProt w:val="false"/>
           <w:textDirection w:val="lrTb"/>
-          <w:docGrid w:type="default" w:linePitch="312" w:charSpace="4294961151"/>
+          <w:docGrid w:type="default" w:linePitch="312" w:charSpace="0"/>
         </w:sectPr>
       </w:pPr>
       <w:r>
@@ -922,7 +919,7 @@
               <w:tab w:val="right" w:pos="8664" w:leader="dot"/>
             </w:tabs>
             <w:rPr>
-              <w:rFonts w:ascii="Trebuchet MS" w:hAnsi="Trebuchet MS" w:eastAsia="ＭＳ 明朝" w:cs="" w:cstheme="minorBidi" w:eastAsiaTheme="minorEastAsia"/>
+              <w:rFonts w:ascii="Trebuchet MS" w:hAnsi="Trebuchet MS" w:eastAsia="" w:cs="" w:cstheme="minorBidi" w:eastAsiaTheme="minorEastAsia"/>
               <w:b w:val="false"/>
               <w:bCs w:val="false"/>
               <w:i w:val="false"/>
@@ -942,6 +939,7 @@
               <w:bCs w:val="false"/>
               <w:i w:val="false"/>
               <w:iCs w:val="false"/>
+              <w:vanish w:val="false"/>
               <w:webHidden/>
             </w:rPr>
             <w:instrText xml:space="preserve"> TOC \z \o "1-3" \u \h</w:instrText>
@@ -954,41 +952,12 @@
               <w:bCs w:val="false"/>
               <w:i w:val="false"/>
               <w:iCs w:val="false"/>
+              <w:vanish w:val="false"/>
               <w:webHidden/>
             </w:rPr>
             <w:fldChar w:fldCharType="separate"/>
           </w:r>
           <w:hyperlink w:anchor="_Toc224457909">
-            <w:r>
-              <w:rPr>
-                <w:rStyle w:val="IndexLink"/>
-                <w:rFonts w:ascii="Trebuchet MS" w:hAnsi="Trebuchet MS"/>
-                <w:b w:val="false"/>
-                <w:bCs w:val="false"/>
-                <w:i w:val="false"/>
-                <w:iCs w:val="false"/>
-                <w:webHidden/>
-              </w:rPr>
-              <w:t>Acknowledgements</w:t>
-            </w:r>
-            <w:r>
-              <w:rPr>
-                <w:webHidden/>
-              </w:rPr>
-              <w:fldChar w:fldCharType="begin"/>
-            </w:r>
-            <w:r>
-              <w:rPr>
-                <w:webHidden/>
-              </w:rPr>
-              <w:instrText xml:space="preserve">PAGEREF _Toc224457909 \h</w:instrText>
-            </w:r>
-            <w:r>
-              <w:rPr>
-                <w:webHidden/>
-              </w:rPr>
-              <w:fldChar w:fldCharType="separate"/>
-            </w:r>
             <w:r>
               <w:rPr>
                 <w:rStyle w:val="IndexLink"/>
@@ -998,8 +967,50 @@
                 <w:i w:val="false"/>
                 <w:iCs w:val="false"/>
                 <w:vanish w:val="false"/>
+                <w:webHidden/>
+              </w:rPr>
+              <w:t>Acknowledgements</w:t>
+            </w:r>
+            <w:r>
+              <w:rPr>
+                <w:rStyle w:val="IndexLink"/>
+                <w:rFonts w:ascii="Trebuchet MS" w:hAnsi="Trebuchet MS"/>
+                <w:b w:val="false"/>
+                <w:bCs w:val="false"/>
+                <w:i w:val="false"/>
+                <w:iCs w:val="false"/>
+                <w:vanish w:val="false"/>
               </w:rPr>
               <w:tab/>
+            </w:r>
+            <w:r>
+              <w:rPr>
+                <w:webHidden/>
+              </w:rPr>
+              <w:fldChar w:fldCharType="begin"/>
+            </w:r>
+            <w:r>
+              <w:rPr>
+                <w:webHidden/>
+              </w:rPr>
+              <w:instrText xml:space="preserve">PAGEREF _Toc224457909 \h</w:instrText>
+            </w:r>
+            <w:r>
+              <w:rPr>
+                <w:webHidden/>
+              </w:rPr>
+              <w:fldChar w:fldCharType="separate"/>
+            </w:r>
+            <w:r>
+              <w:rPr>
+                <w:rStyle w:val="IndexLink"/>
+                <w:rFonts w:ascii="Trebuchet MS" w:hAnsi="Trebuchet MS"/>
+                <w:b w:val="false"/>
+                <w:bCs w:val="false"/>
+                <w:i w:val="false"/>
+                <w:iCs w:val="false"/>
+                <w:vanish w:val="false"/>
+              </w:rPr>
               <w:t>i</w:t>
             </w:r>
             <w:r>
@@ -1018,7 +1029,7 @@
               <w:tab w:val="right" w:pos="8664" w:leader="dot"/>
             </w:tabs>
             <w:rPr>
-              <w:rFonts w:ascii="Trebuchet MS" w:hAnsi="Trebuchet MS" w:eastAsia="ＭＳ 明朝" w:cs="" w:cstheme="minorBidi" w:eastAsiaTheme="minorEastAsia"/>
+              <w:rFonts w:ascii="Trebuchet MS" w:hAnsi="Trebuchet MS" w:eastAsia="" w:cs="" w:cstheme="minorBidi" w:eastAsiaTheme="minorEastAsia"/>
               <w:b w:val="false"/>
               <w:bCs w:val="false"/>
               <w:i w:val="false"/>
@@ -1036,27 +1047,10 @@
                 <w:bCs w:val="false"/>
                 <w:i w:val="false"/>
                 <w:iCs w:val="false"/>
+                <w:vanish w:val="false"/>
                 <w:webHidden/>
               </w:rPr>
               <w:t>Abstract</w:t>
-            </w:r>
-            <w:r>
-              <w:rPr>
-                <w:webHidden/>
-              </w:rPr>
-              <w:fldChar w:fldCharType="begin"/>
-            </w:r>
-            <w:r>
-              <w:rPr>
-                <w:webHidden/>
-              </w:rPr>
-              <w:instrText xml:space="preserve">PAGEREF _Toc224457910 \h</w:instrText>
-            </w:r>
-            <w:r>
-              <w:rPr>
-                <w:webHidden/>
-              </w:rPr>
-              <w:fldChar w:fldCharType="separate"/>
             </w:r>
             <w:r>
               <w:rPr>
@@ -1069,6 +1063,35 @@
                 <w:vanish w:val="false"/>
               </w:rPr>
               <w:tab/>
+            </w:r>
+            <w:r>
+              <w:rPr>
+                <w:webHidden/>
+              </w:rPr>
+              <w:fldChar w:fldCharType="begin"/>
+            </w:r>
+            <w:r>
+              <w:rPr>
+                <w:webHidden/>
+              </w:rPr>
+              <w:instrText xml:space="preserve">PAGEREF _Toc224457910 \h</w:instrText>
+            </w:r>
+            <w:r>
+              <w:rPr>
+                <w:webHidden/>
+              </w:rPr>
+              <w:fldChar w:fldCharType="separate"/>
+            </w:r>
+            <w:r>
+              <w:rPr>
+                <w:rStyle w:val="IndexLink"/>
+                <w:rFonts w:ascii="Trebuchet MS" w:hAnsi="Trebuchet MS"/>
+                <w:b w:val="false"/>
+                <w:bCs w:val="false"/>
+                <w:i w:val="false"/>
+                <w:iCs w:val="false"/>
+                <w:vanish w:val="false"/>
+              </w:rPr>
               <w:t>ii</w:t>
             </w:r>
             <w:r>
@@ -1087,7 +1110,7 @@
               <w:tab w:val="right" w:pos="8664" w:leader="dot"/>
             </w:tabs>
             <w:rPr>
-              <w:rFonts w:ascii="Trebuchet MS" w:hAnsi="Trebuchet MS" w:eastAsia="ＭＳ 明朝" w:cs="" w:cstheme="minorBidi" w:eastAsiaTheme="minorEastAsia"/>
+              <w:rFonts w:ascii="Trebuchet MS" w:hAnsi="Trebuchet MS" w:eastAsia="" w:cs="" w:cstheme="minorBidi" w:eastAsiaTheme="minorEastAsia"/>
               <w:b w:val="false"/>
               <w:bCs w:val="false"/>
               <w:i w:val="false"/>
@@ -1105,27 +1128,10 @@
                 <w:bCs w:val="false"/>
                 <w:i w:val="false"/>
                 <w:iCs w:val="false"/>
+                <w:vanish w:val="false"/>
                 <w:webHidden/>
               </w:rPr>
               <w:t>1. Introduction</w:t>
-            </w:r>
-            <w:r>
-              <w:rPr>
-                <w:webHidden/>
-              </w:rPr>
-              <w:fldChar w:fldCharType="begin"/>
-            </w:r>
-            <w:r>
-              <w:rPr>
-                <w:webHidden/>
-              </w:rPr>
-              <w:instrText xml:space="preserve">PAGEREF _Toc224457911 \h</w:instrText>
-            </w:r>
-            <w:r>
-              <w:rPr>
-                <w:webHidden/>
-              </w:rPr>
-              <w:fldChar w:fldCharType="separate"/>
             </w:r>
             <w:r>
               <w:rPr>
@@ -1138,6 +1144,35 @@
                 <w:vanish w:val="false"/>
               </w:rPr>
               <w:tab/>
+            </w:r>
+            <w:r>
+              <w:rPr>
+                <w:webHidden/>
+              </w:rPr>
+              <w:fldChar w:fldCharType="begin"/>
+            </w:r>
+            <w:r>
+              <w:rPr>
+                <w:webHidden/>
+              </w:rPr>
+              <w:instrText xml:space="preserve">PAGEREF _Toc224457911 \h</w:instrText>
+            </w:r>
+            <w:r>
+              <w:rPr>
+                <w:webHidden/>
+              </w:rPr>
+              <w:fldChar w:fldCharType="separate"/>
+            </w:r>
+            <w:r>
+              <w:rPr>
+                <w:rStyle w:val="IndexLink"/>
+                <w:rFonts w:ascii="Trebuchet MS" w:hAnsi="Trebuchet MS"/>
+                <w:b w:val="false"/>
+                <w:bCs w:val="false"/>
+                <w:i w:val="false"/>
+                <w:iCs w:val="false"/>
+                <w:vanish w:val="false"/>
+              </w:rPr>
               <w:t>3</w:t>
             </w:r>
             <w:r>
@@ -1156,7 +1191,7 @@
               <w:tab w:val="right" w:pos="8664" w:leader="dot"/>
             </w:tabs>
             <w:rPr>
-              <w:rFonts w:ascii="Trebuchet MS" w:hAnsi="Trebuchet MS" w:eastAsia="ＭＳ 明朝" w:cs="" w:cstheme="minorBidi" w:eastAsiaTheme="minorEastAsia"/>
+              <w:rFonts w:ascii="Trebuchet MS" w:hAnsi="Trebuchet MS" w:eastAsia="" w:cs="" w:cstheme="minorBidi" w:eastAsiaTheme="minorEastAsia"/>
               <w:b w:val="false"/>
               <w:bCs w:val="false"/>
               <w:i w:val="false"/>
@@ -1174,27 +1209,10 @@
                 <w:bCs w:val="false"/>
                 <w:i w:val="false"/>
                 <w:iCs w:val="false"/>
+                <w:vanish w:val="false"/>
                 <w:webHidden/>
               </w:rPr>
               <w:t>2. Literature Survey</w:t>
-            </w:r>
-            <w:r>
-              <w:rPr>
-                <w:webHidden/>
-              </w:rPr>
-              <w:fldChar w:fldCharType="begin"/>
-            </w:r>
-            <w:r>
-              <w:rPr>
-                <w:webHidden/>
-              </w:rPr>
-              <w:instrText xml:space="preserve">PAGEREF _Toc224457912 \h</w:instrText>
-            </w:r>
-            <w:r>
-              <w:rPr>
-                <w:webHidden/>
-              </w:rPr>
-              <w:fldChar w:fldCharType="separate"/>
             </w:r>
             <w:r>
               <w:rPr>
@@ -1207,6 +1225,35 @@
                 <w:vanish w:val="false"/>
               </w:rPr>
               <w:tab/>
+            </w:r>
+            <w:r>
+              <w:rPr>
+                <w:webHidden/>
+              </w:rPr>
+              <w:fldChar w:fldCharType="begin"/>
+            </w:r>
+            <w:r>
+              <w:rPr>
+                <w:webHidden/>
+              </w:rPr>
+              <w:instrText xml:space="preserve">PAGEREF _Toc224457912 \h</w:instrText>
+            </w:r>
+            <w:r>
+              <w:rPr>
+                <w:webHidden/>
+              </w:rPr>
+              <w:fldChar w:fldCharType="separate"/>
+            </w:r>
+            <w:r>
+              <w:rPr>
+                <w:rStyle w:val="IndexLink"/>
+                <w:rFonts w:ascii="Trebuchet MS" w:hAnsi="Trebuchet MS"/>
+                <w:b w:val="false"/>
+                <w:bCs w:val="false"/>
+                <w:i w:val="false"/>
+                <w:iCs w:val="false"/>
+                <w:vanish w:val="false"/>
+              </w:rPr>
               <w:t>4</w:t>
             </w:r>
             <w:r>
@@ -1225,7 +1272,7 @@
               <w:tab w:val="right" w:pos="8664" w:leader="dot"/>
             </w:tabs>
             <w:rPr>
-              <w:rFonts w:ascii="Trebuchet MS" w:hAnsi="Trebuchet MS" w:eastAsia="ＭＳ 明朝" w:cs="" w:cstheme="minorBidi" w:eastAsiaTheme="minorEastAsia"/>
+              <w:rFonts w:ascii="Trebuchet MS" w:hAnsi="Trebuchet MS" w:eastAsia="" w:cs="" w:cstheme="minorBidi" w:eastAsiaTheme="minorEastAsia"/>
               <w:b w:val="false"/>
               <w:bCs w:val="false"/>
               <w:kern w:val="2"/>
@@ -1241,27 +1288,10 @@
                 <w:rFonts w:ascii="Trebuchet MS" w:hAnsi="Trebuchet MS"/>
                 <w:b w:val="false"/>
                 <w:bCs w:val="false"/>
+                <w:vanish w:val="false"/>
                 <w:webHidden/>
               </w:rPr>
               <w:t>2.1 Sub Section</w:t>
-            </w:r>
-            <w:r>
-              <w:rPr>
-                <w:webHidden/>
-              </w:rPr>
-              <w:fldChar w:fldCharType="begin"/>
-            </w:r>
-            <w:r>
-              <w:rPr>
-                <w:webHidden/>
-              </w:rPr>
-              <w:instrText xml:space="preserve">PAGEREF _Toc224457913 \h</w:instrText>
-            </w:r>
-            <w:r>
-              <w:rPr>
-                <w:webHidden/>
-              </w:rPr>
-              <w:fldChar w:fldCharType="separate"/>
             </w:r>
             <w:r>
               <w:rPr>
@@ -1272,6 +1302,33 @@
                 <w:vanish w:val="false"/>
               </w:rPr>
               <w:tab/>
+            </w:r>
+            <w:r>
+              <w:rPr>
+                <w:webHidden/>
+              </w:rPr>
+              <w:fldChar w:fldCharType="begin"/>
+            </w:r>
+            <w:r>
+              <w:rPr>
+                <w:webHidden/>
+              </w:rPr>
+              <w:instrText xml:space="preserve">PAGEREF _Toc224457913 \h</w:instrText>
+            </w:r>
+            <w:r>
+              <w:rPr>
+                <w:webHidden/>
+              </w:rPr>
+              <w:fldChar w:fldCharType="separate"/>
+            </w:r>
+            <w:r>
+              <w:rPr>
+                <w:rStyle w:val="IndexLink"/>
+                <w:rFonts w:ascii="Trebuchet MS" w:hAnsi="Trebuchet MS"/>
+                <w:b w:val="false"/>
+                <w:bCs w:val="false"/>
+                <w:vanish w:val="false"/>
+              </w:rPr>
               <w:t>4</w:t>
             </w:r>
             <w:r>
@@ -1290,7 +1347,7 @@
               <w:tab w:val="right" w:pos="8664" w:leader="dot"/>
             </w:tabs>
             <w:rPr>
-              <w:rFonts w:ascii="Trebuchet MS" w:hAnsi="Trebuchet MS" w:eastAsia="ＭＳ 明朝" w:cs="" w:cstheme="minorBidi" w:eastAsiaTheme="minorEastAsia"/>
+              <w:rFonts w:ascii="Trebuchet MS" w:hAnsi="Trebuchet MS" w:eastAsia="" w:cs="" w:cstheme="minorBidi" w:eastAsiaTheme="minorEastAsia"/>
               <w:b w:val="false"/>
               <w:bCs w:val="false"/>
               <w:kern w:val="2"/>
@@ -1306,27 +1363,10 @@
                 <w:rFonts w:ascii="Trebuchet MS" w:hAnsi="Trebuchet MS"/>
                 <w:b w:val="false"/>
                 <w:bCs w:val="false"/>
+                <w:vanish w:val="false"/>
                 <w:webHidden/>
               </w:rPr>
               <w:t>2.2 Sub Section</w:t>
-            </w:r>
-            <w:r>
-              <w:rPr>
-                <w:webHidden/>
-              </w:rPr>
-              <w:fldChar w:fldCharType="begin"/>
-            </w:r>
-            <w:r>
-              <w:rPr>
-                <w:webHidden/>
-              </w:rPr>
-              <w:instrText xml:space="preserve">PAGEREF _Toc224457914 \h</w:instrText>
-            </w:r>
-            <w:r>
-              <w:rPr>
-                <w:webHidden/>
-              </w:rPr>
-              <w:fldChar w:fldCharType="separate"/>
             </w:r>
             <w:r>
               <w:rPr>
@@ -1337,6 +1377,33 @@
                 <w:vanish w:val="false"/>
               </w:rPr>
               <w:tab/>
+            </w:r>
+            <w:r>
+              <w:rPr>
+                <w:webHidden/>
+              </w:rPr>
+              <w:fldChar w:fldCharType="begin"/>
+            </w:r>
+            <w:r>
+              <w:rPr>
+                <w:webHidden/>
+              </w:rPr>
+              <w:instrText xml:space="preserve">PAGEREF _Toc224457914 \h</w:instrText>
+            </w:r>
+            <w:r>
+              <w:rPr>
+                <w:webHidden/>
+              </w:rPr>
+              <w:fldChar w:fldCharType="separate"/>
+            </w:r>
+            <w:r>
+              <w:rPr>
+                <w:rStyle w:val="IndexLink"/>
+                <w:rFonts w:ascii="Trebuchet MS" w:hAnsi="Trebuchet MS"/>
+                <w:b w:val="false"/>
+                <w:bCs w:val="false"/>
+                <w:vanish w:val="false"/>
+              </w:rPr>
               <w:t>4</w:t>
             </w:r>
             <w:r>
@@ -1355,7 +1422,7 @@
               <w:tab w:val="right" w:pos="8664" w:leader="dot"/>
             </w:tabs>
             <w:rPr>
-              <w:rFonts w:ascii="Trebuchet MS" w:hAnsi="Trebuchet MS" w:eastAsia="ＭＳ 明朝" w:cs="" w:cstheme="minorBidi" w:eastAsiaTheme="minorEastAsia"/>
+              <w:rFonts w:ascii="Trebuchet MS" w:hAnsi="Trebuchet MS" w:eastAsia="" w:cs="" w:cstheme="minorBidi" w:eastAsiaTheme="minorEastAsia"/>
               <w:b w:val="false"/>
               <w:bCs w:val="false"/>
               <w:i w:val="false"/>
@@ -1373,27 +1440,10 @@
                 <w:bCs w:val="false"/>
                 <w:i w:val="false"/>
                 <w:iCs w:val="false"/>
+                <w:vanish w:val="false"/>
                 <w:webHidden/>
               </w:rPr>
               <w:t>3. Methodology</w:t>
-            </w:r>
-            <w:r>
-              <w:rPr>
-                <w:webHidden/>
-              </w:rPr>
-              <w:fldChar w:fldCharType="begin"/>
-            </w:r>
-            <w:r>
-              <w:rPr>
-                <w:webHidden/>
-              </w:rPr>
-              <w:instrText xml:space="preserve">PAGEREF _Toc224457915 \h</w:instrText>
-            </w:r>
-            <w:r>
-              <w:rPr>
-                <w:webHidden/>
-              </w:rPr>
-              <w:fldChar w:fldCharType="separate"/>
             </w:r>
             <w:r>
               <w:rPr>
@@ -1406,6 +1456,35 @@
                 <w:vanish w:val="false"/>
               </w:rPr>
               <w:tab/>
+            </w:r>
+            <w:r>
+              <w:rPr>
+                <w:webHidden/>
+              </w:rPr>
+              <w:fldChar w:fldCharType="begin"/>
+            </w:r>
+            <w:r>
+              <w:rPr>
+                <w:webHidden/>
+              </w:rPr>
+              <w:instrText xml:space="preserve">PAGEREF _Toc224457915 \h</w:instrText>
+            </w:r>
+            <w:r>
+              <w:rPr>
+                <w:webHidden/>
+              </w:rPr>
+              <w:fldChar w:fldCharType="separate"/>
+            </w:r>
+            <w:r>
+              <w:rPr>
+                <w:rStyle w:val="IndexLink"/>
+                <w:rFonts w:ascii="Trebuchet MS" w:hAnsi="Trebuchet MS"/>
+                <w:b w:val="false"/>
+                <w:bCs w:val="false"/>
+                <w:i w:val="false"/>
+                <w:iCs w:val="false"/>
+                <w:vanish w:val="false"/>
+              </w:rPr>
               <w:t>5</w:t>
             </w:r>
             <w:r>
@@ -1424,7 +1503,7 @@
               <w:tab w:val="right" w:pos="8664" w:leader="dot"/>
             </w:tabs>
             <w:rPr>
-              <w:rFonts w:ascii="Trebuchet MS" w:hAnsi="Trebuchet MS" w:eastAsia="ＭＳ 明朝" w:cs="" w:cstheme="minorBidi" w:eastAsiaTheme="minorEastAsia"/>
+              <w:rFonts w:ascii="Trebuchet MS" w:hAnsi="Trebuchet MS" w:eastAsia="" w:cs="" w:cstheme="minorBidi" w:eastAsiaTheme="minorEastAsia"/>
               <w:b w:val="false"/>
               <w:bCs w:val="false"/>
               <w:kern w:val="2"/>
@@ -1440,27 +1519,10 @@
                 <w:rFonts w:ascii="Trebuchet MS" w:hAnsi="Trebuchet MS"/>
                 <w:b w:val="false"/>
                 <w:bCs w:val="false"/>
+                <w:vanish w:val="false"/>
                 <w:webHidden/>
               </w:rPr>
               <w:t>3.1 Methods Section</w:t>
-            </w:r>
-            <w:r>
-              <w:rPr>
-                <w:webHidden/>
-              </w:rPr>
-              <w:fldChar w:fldCharType="begin"/>
-            </w:r>
-            <w:r>
-              <w:rPr>
-                <w:webHidden/>
-              </w:rPr>
-              <w:instrText xml:space="preserve">PAGEREF _Toc224457916 \h</w:instrText>
-            </w:r>
-            <w:r>
-              <w:rPr>
-                <w:webHidden/>
-              </w:rPr>
-              <w:fldChar w:fldCharType="separate"/>
             </w:r>
             <w:r>
               <w:rPr>
@@ -1471,6 +1533,33 @@
                 <w:vanish w:val="false"/>
               </w:rPr>
               <w:tab/>
+            </w:r>
+            <w:r>
+              <w:rPr>
+                <w:webHidden/>
+              </w:rPr>
+              <w:fldChar w:fldCharType="begin"/>
+            </w:r>
+            <w:r>
+              <w:rPr>
+                <w:webHidden/>
+              </w:rPr>
+              <w:instrText xml:space="preserve">PAGEREF _Toc224457916 \h</w:instrText>
+            </w:r>
+            <w:r>
+              <w:rPr>
+                <w:webHidden/>
+              </w:rPr>
+              <w:fldChar w:fldCharType="separate"/>
+            </w:r>
+            <w:r>
+              <w:rPr>
+                <w:rStyle w:val="IndexLink"/>
+                <w:rFonts w:ascii="Trebuchet MS" w:hAnsi="Trebuchet MS"/>
+                <w:b w:val="false"/>
+                <w:bCs w:val="false"/>
+                <w:vanish w:val="false"/>
+              </w:rPr>
               <w:t>5</w:t>
             </w:r>
             <w:r>
@@ -1489,7 +1578,7 @@
               <w:tab w:val="right" w:pos="8664" w:leader="dot"/>
             </w:tabs>
             <w:rPr>
-              <w:rFonts w:ascii="Trebuchet MS" w:hAnsi="Trebuchet MS" w:eastAsia="ＭＳ 明朝" w:cs="" w:cstheme="minorBidi" w:eastAsiaTheme="minorEastAsia"/>
+              <w:rFonts w:ascii="Trebuchet MS" w:hAnsi="Trebuchet MS" w:eastAsia="" w:cs="" w:cstheme="minorBidi" w:eastAsiaTheme="minorEastAsia"/>
               <w:b w:val="false"/>
               <w:bCs w:val="false"/>
               <w:kern w:val="2"/>
@@ -1505,27 +1594,10 @@
                 <w:rFonts w:ascii="Trebuchet MS" w:hAnsi="Trebuchet MS"/>
                 <w:b w:val="false"/>
                 <w:bCs w:val="false"/>
+                <w:vanish w:val="false"/>
                 <w:webHidden/>
               </w:rPr>
               <w:t>3.2 Methods Section</w:t>
-            </w:r>
-            <w:r>
-              <w:rPr>
-                <w:webHidden/>
-              </w:rPr>
-              <w:fldChar w:fldCharType="begin"/>
-            </w:r>
-            <w:r>
-              <w:rPr>
-                <w:webHidden/>
-              </w:rPr>
-              <w:instrText xml:space="preserve">PAGEREF _Toc224457917 \h</w:instrText>
-            </w:r>
-            <w:r>
-              <w:rPr>
-                <w:webHidden/>
-              </w:rPr>
-              <w:fldChar w:fldCharType="separate"/>
             </w:r>
             <w:r>
               <w:rPr>
@@ -1536,6 +1608,33 @@
                 <w:vanish w:val="false"/>
               </w:rPr>
               <w:tab/>
+            </w:r>
+            <w:r>
+              <w:rPr>
+                <w:webHidden/>
+              </w:rPr>
+              <w:fldChar w:fldCharType="begin"/>
+            </w:r>
+            <w:r>
+              <w:rPr>
+                <w:webHidden/>
+              </w:rPr>
+              <w:instrText xml:space="preserve">PAGEREF _Toc224457917 \h</w:instrText>
+            </w:r>
+            <w:r>
+              <w:rPr>
+                <w:webHidden/>
+              </w:rPr>
+              <w:fldChar w:fldCharType="separate"/>
+            </w:r>
+            <w:r>
+              <w:rPr>
+                <w:rStyle w:val="IndexLink"/>
+                <w:rFonts w:ascii="Trebuchet MS" w:hAnsi="Trebuchet MS"/>
+                <w:b w:val="false"/>
+                <w:bCs w:val="false"/>
+                <w:vanish w:val="false"/>
+              </w:rPr>
               <w:t>5</w:t>
             </w:r>
             <w:r>
@@ -1554,7 +1653,7 @@
               <w:tab w:val="right" w:pos="8664" w:leader="dot"/>
             </w:tabs>
             <w:rPr>
-              <w:rFonts w:ascii="Trebuchet MS" w:hAnsi="Trebuchet MS" w:eastAsia="ＭＳ 明朝" w:cs="" w:cstheme="minorBidi" w:eastAsiaTheme="minorEastAsia"/>
+              <w:rFonts w:ascii="Trebuchet MS" w:hAnsi="Trebuchet MS" w:eastAsia="" w:cs="" w:cstheme="minorBidi" w:eastAsiaTheme="minorEastAsia"/>
               <w:b w:val="false"/>
               <w:bCs w:val="false"/>
               <w:kern w:val="2"/>
@@ -1570,27 +1669,10 @@
                 <w:rFonts w:ascii="Trebuchet MS" w:hAnsi="Trebuchet MS"/>
                 <w:b w:val="false"/>
                 <w:bCs w:val="false"/>
+                <w:vanish w:val="false"/>
                 <w:webHidden/>
               </w:rPr>
               <w:t>3.3 Professional, Legal and Ethical issues</w:t>
-            </w:r>
-            <w:r>
-              <w:rPr>
-                <w:webHidden/>
-              </w:rPr>
-              <w:fldChar w:fldCharType="begin"/>
-            </w:r>
-            <w:r>
-              <w:rPr>
-                <w:webHidden/>
-              </w:rPr>
-              <w:instrText xml:space="preserve">PAGEREF _Toc224457918 \h</w:instrText>
-            </w:r>
-            <w:r>
-              <w:rPr>
-                <w:webHidden/>
-              </w:rPr>
-              <w:fldChar w:fldCharType="separate"/>
             </w:r>
             <w:r>
               <w:rPr>
@@ -1601,6 +1683,33 @@
                 <w:vanish w:val="false"/>
               </w:rPr>
               <w:tab/>
+            </w:r>
+            <w:r>
+              <w:rPr>
+                <w:webHidden/>
+              </w:rPr>
+              <w:fldChar w:fldCharType="begin"/>
+            </w:r>
+            <w:r>
+              <w:rPr>
+                <w:webHidden/>
+              </w:rPr>
+              <w:instrText xml:space="preserve">PAGEREF _Toc224457918 \h</w:instrText>
+            </w:r>
+            <w:r>
+              <w:rPr>
+                <w:webHidden/>
+              </w:rPr>
+              <w:fldChar w:fldCharType="separate"/>
+            </w:r>
+            <w:r>
+              <w:rPr>
+                <w:rStyle w:val="IndexLink"/>
+                <w:rFonts w:ascii="Trebuchet MS" w:hAnsi="Trebuchet MS"/>
+                <w:b w:val="false"/>
+                <w:bCs w:val="false"/>
+                <w:vanish w:val="false"/>
+              </w:rPr>
               <w:t>5</w:t>
             </w:r>
             <w:r>
@@ -1619,7 +1728,7 @@
               <w:tab w:val="right" w:pos="8664" w:leader="dot"/>
             </w:tabs>
             <w:rPr>
-              <w:rFonts w:ascii="Trebuchet MS" w:hAnsi="Trebuchet MS" w:eastAsia="ＭＳ 明朝" w:cs="" w:cstheme="minorBidi" w:eastAsiaTheme="minorEastAsia"/>
+              <w:rFonts w:ascii="Trebuchet MS" w:hAnsi="Trebuchet MS" w:eastAsia="" w:cs="" w:cstheme="minorBidi" w:eastAsiaTheme="minorEastAsia"/>
               <w:b w:val="false"/>
               <w:bCs w:val="false"/>
               <w:kern w:val="2"/>
@@ -1635,27 +1744,10 @@
                 <w:rFonts w:ascii="Trebuchet MS" w:hAnsi="Trebuchet MS"/>
                 <w:b w:val="false"/>
                 <w:bCs w:val="false"/>
+                <w:vanish w:val="false"/>
                 <w:webHidden/>
               </w:rPr>
               <w:t>3.3 Project Management</w:t>
-            </w:r>
-            <w:r>
-              <w:rPr>
-                <w:webHidden/>
-              </w:rPr>
-              <w:fldChar w:fldCharType="begin"/>
-            </w:r>
-            <w:r>
-              <w:rPr>
-                <w:webHidden/>
-              </w:rPr>
-              <w:instrText xml:space="preserve">PAGEREF _Toc224457919 \h</w:instrText>
-            </w:r>
-            <w:r>
-              <w:rPr>
-                <w:webHidden/>
-              </w:rPr>
-              <w:fldChar w:fldCharType="separate"/>
             </w:r>
             <w:r>
               <w:rPr>
@@ -1666,6 +1758,33 @@
                 <w:vanish w:val="false"/>
               </w:rPr>
               <w:tab/>
+            </w:r>
+            <w:r>
+              <w:rPr>
+                <w:webHidden/>
+              </w:rPr>
+              <w:fldChar w:fldCharType="begin"/>
+            </w:r>
+            <w:r>
+              <w:rPr>
+                <w:webHidden/>
+              </w:rPr>
+              <w:instrText xml:space="preserve">PAGEREF _Toc224457919 \h</w:instrText>
+            </w:r>
+            <w:r>
+              <w:rPr>
+                <w:webHidden/>
+              </w:rPr>
+              <w:fldChar w:fldCharType="separate"/>
+            </w:r>
+            <w:r>
+              <w:rPr>
+                <w:rStyle w:val="IndexLink"/>
+                <w:rFonts w:ascii="Trebuchet MS" w:hAnsi="Trebuchet MS"/>
+                <w:b w:val="false"/>
+                <w:bCs w:val="false"/>
+                <w:vanish w:val="false"/>
+              </w:rPr>
               <w:t>6</w:t>
             </w:r>
             <w:r>
@@ -1684,7 +1803,7 @@
               <w:tab w:val="right" w:pos="8664" w:leader="dot"/>
             </w:tabs>
             <w:rPr>
-              <w:rFonts w:ascii="Trebuchet MS" w:hAnsi="Trebuchet MS" w:eastAsia="ＭＳ 明朝" w:cs="" w:cstheme="minorBidi" w:eastAsiaTheme="minorEastAsia"/>
+              <w:rFonts w:ascii="Trebuchet MS" w:hAnsi="Trebuchet MS" w:eastAsia="" w:cs="" w:cstheme="minorBidi" w:eastAsiaTheme="minorEastAsia"/>
               <w:b w:val="false"/>
               <w:bCs w:val="false"/>
               <w:i w:val="false"/>
@@ -1702,27 +1821,10 @@
                 <w:bCs w:val="false"/>
                 <w:i w:val="false"/>
                 <w:iCs w:val="false"/>
+                <w:vanish w:val="false"/>
                 <w:webHidden/>
               </w:rPr>
               <w:t>4. Design &amp; implementation</w:t>
-            </w:r>
-            <w:r>
-              <w:rPr>
-                <w:webHidden/>
-              </w:rPr>
-              <w:fldChar w:fldCharType="begin"/>
-            </w:r>
-            <w:r>
-              <w:rPr>
-                <w:webHidden/>
-              </w:rPr>
-              <w:instrText xml:space="preserve">PAGEREF _Toc224457920 \h</w:instrText>
-            </w:r>
-            <w:r>
-              <w:rPr>
-                <w:webHidden/>
-              </w:rPr>
-              <w:fldChar w:fldCharType="separate"/>
             </w:r>
             <w:r>
               <w:rPr>
@@ -1735,6 +1837,35 @@
                 <w:vanish w:val="false"/>
               </w:rPr>
               <w:tab/>
+            </w:r>
+            <w:r>
+              <w:rPr>
+                <w:webHidden/>
+              </w:rPr>
+              <w:fldChar w:fldCharType="begin"/>
+            </w:r>
+            <w:r>
+              <w:rPr>
+                <w:webHidden/>
+              </w:rPr>
+              <w:instrText xml:space="preserve">PAGEREF _Toc224457920 \h</w:instrText>
+            </w:r>
+            <w:r>
+              <w:rPr>
+                <w:webHidden/>
+              </w:rPr>
+              <w:fldChar w:fldCharType="separate"/>
+            </w:r>
+            <w:r>
+              <w:rPr>
+                <w:rStyle w:val="IndexLink"/>
+                <w:rFonts w:ascii="Trebuchet MS" w:hAnsi="Trebuchet MS"/>
+                <w:b w:val="false"/>
+                <w:bCs w:val="false"/>
+                <w:i w:val="false"/>
+                <w:iCs w:val="false"/>
+                <w:vanish w:val="false"/>
+              </w:rPr>
               <w:t>6</w:t>
             </w:r>
             <w:r>
@@ -1753,7 +1884,7 @@
               <w:tab w:val="right" w:pos="8664" w:leader="dot"/>
             </w:tabs>
             <w:rPr>
-              <w:rFonts w:ascii="Trebuchet MS" w:hAnsi="Trebuchet MS" w:eastAsia="ＭＳ 明朝" w:cs="" w:cstheme="minorBidi" w:eastAsiaTheme="minorEastAsia"/>
+              <w:rFonts w:ascii="Trebuchet MS" w:hAnsi="Trebuchet MS" w:eastAsia="" w:cs="" w:cstheme="minorBidi" w:eastAsiaTheme="minorEastAsia"/>
               <w:b w:val="false"/>
               <w:bCs w:val="false"/>
               <w:i w:val="false"/>
@@ -1771,27 +1902,10 @@
                 <w:bCs w:val="false"/>
                 <w:i w:val="false"/>
                 <w:iCs w:val="false"/>
+                <w:vanish w:val="false"/>
                 <w:webHidden/>
               </w:rPr>
               <w:t>5. Results</w:t>
-            </w:r>
-            <w:r>
-              <w:rPr>
-                <w:webHidden/>
-              </w:rPr>
-              <w:fldChar w:fldCharType="begin"/>
-            </w:r>
-            <w:r>
-              <w:rPr>
-                <w:webHidden/>
-              </w:rPr>
-              <w:instrText xml:space="preserve">PAGEREF _Toc224457921 \h</w:instrText>
-            </w:r>
-            <w:r>
-              <w:rPr>
-                <w:webHidden/>
-              </w:rPr>
-              <w:fldChar w:fldCharType="separate"/>
             </w:r>
             <w:r>
               <w:rPr>
@@ -1804,6 +1918,35 @@
                 <w:vanish w:val="false"/>
               </w:rPr>
               <w:tab/>
+            </w:r>
+            <w:r>
+              <w:rPr>
+                <w:webHidden/>
+              </w:rPr>
+              <w:fldChar w:fldCharType="begin"/>
+            </w:r>
+            <w:r>
+              <w:rPr>
+                <w:webHidden/>
+              </w:rPr>
+              <w:instrText xml:space="preserve">PAGEREF _Toc224457921 \h</w:instrText>
+            </w:r>
+            <w:r>
+              <w:rPr>
+                <w:webHidden/>
+              </w:rPr>
+              <w:fldChar w:fldCharType="separate"/>
+            </w:r>
+            <w:r>
+              <w:rPr>
+                <w:rStyle w:val="IndexLink"/>
+                <w:rFonts w:ascii="Trebuchet MS" w:hAnsi="Trebuchet MS"/>
+                <w:b w:val="false"/>
+                <w:bCs w:val="false"/>
+                <w:i w:val="false"/>
+                <w:iCs w:val="false"/>
+                <w:vanish w:val="false"/>
+              </w:rPr>
               <w:t>8</w:t>
             </w:r>
             <w:r>
@@ -1822,7 +1965,7 @@
               <w:tab w:val="right" w:pos="8664" w:leader="dot"/>
             </w:tabs>
             <w:rPr>
-              <w:rFonts w:ascii="Trebuchet MS" w:hAnsi="Trebuchet MS" w:eastAsia="ＭＳ 明朝" w:cs="" w:cstheme="minorBidi" w:eastAsiaTheme="minorEastAsia"/>
+              <w:rFonts w:ascii="Trebuchet MS" w:hAnsi="Trebuchet MS" w:eastAsia="" w:cs="" w:cstheme="minorBidi" w:eastAsiaTheme="minorEastAsia"/>
               <w:b w:val="false"/>
               <w:bCs w:val="false"/>
               <w:i w:val="false"/>
@@ -1840,27 +1983,10 @@
                 <w:bCs w:val="false"/>
                 <w:i w:val="false"/>
                 <w:iCs w:val="false"/>
+                <w:vanish w:val="false"/>
                 <w:webHidden/>
               </w:rPr>
               <w:t>6. Conclusions</w:t>
-            </w:r>
-            <w:r>
-              <w:rPr>
-                <w:webHidden/>
-              </w:rPr>
-              <w:fldChar w:fldCharType="begin"/>
-            </w:r>
-            <w:r>
-              <w:rPr>
-                <w:webHidden/>
-              </w:rPr>
-              <w:instrText xml:space="preserve">PAGEREF _Toc224457922 \h</w:instrText>
-            </w:r>
-            <w:r>
-              <w:rPr>
-                <w:webHidden/>
-              </w:rPr>
-              <w:fldChar w:fldCharType="separate"/>
             </w:r>
             <w:r>
               <w:rPr>
@@ -1873,6 +1999,35 @@
                 <w:vanish w:val="false"/>
               </w:rPr>
               <w:tab/>
+            </w:r>
+            <w:r>
+              <w:rPr>
+                <w:webHidden/>
+              </w:rPr>
+              <w:fldChar w:fldCharType="begin"/>
+            </w:r>
+            <w:r>
+              <w:rPr>
+                <w:webHidden/>
+              </w:rPr>
+              <w:instrText xml:space="preserve">PAGEREF _Toc224457922 \h</w:instrText>
+            </w:r>
+            <w:r>
+              <w:rPr>
+                <w:webHidden/>
+              </w:rPr>
+              <w:fldChar w:fldCharType="separate"/>
+            </w:r>
+            <w:r>
+              <w:rPr>
+                <w:rStyle w:val="IndexLink"/>
+                <w:rFonts w:ascii="Trebuchet MS" w:hAnsi="Trebuchet MS"/>
+                <w:b w:val="false"/>
+                <w:bCs w:val="false"/>
+                <w:i w:val="false"/>
+                <w:iCs w:val="false"/>
+                <w:vanish w:val="false"/>
+              </w:rPr>
               <w:t>9</w:t>
             </w:r>
             <w:r>
@@ -1891,7 +2046,7 @@
               <w:tab w:val="right" w:pos="8664" w:leader="dot"/>
             </w:tabs>
             <w:rPr>
-              <w:rFonts w:ascii="Trebuchet MS" w:hAnsi="Trebuchet MS" w:eastAsia="ＭＳ 明朝" w:cs="" w:cstheme="minorBidi" w:eastAsiaTheme="minorEastAsia"/>
+              <w:rFonts w:ascii="Trebuchet MS" w:hAnsi="Trebuchet MS" w:eastAsia="" w:cs="" w:cstheme="minorBidi" w:eastAsiaTheme="minorEastAsia"/>
               <w:b w:val="false"/>
               <w:bCs w:val="false"/>
               <w:i w:val="false"/>
@@ -1909,27 +2064,10 @@
                 <w:bCs w:val="false"/>
                 <w:i w:val="false"/>
                 <w:iCs w:val="false"/>
+                <w:vanish w:val="false"/>
                 <w:webHidden/>
               </w:rPr>
               <w:t>7. Recommendations</w:t>
-            </w:r>
-            <w:r>
-              <w:rPr>
-                <w:webHidden/>
-              </w:rPr>
-              <w:fldChar w:fldCharType="begin"/>
-            </w:r>
-            <w:r>
-              <w:rPr>
-                <w:webHidden/>
-              </w:rPr>
-              <w:instrText xml:space="preserve">PAGEREF _Toc224457923 \h</w:instrText>
-            </w:r>
-            <w:r>
-              <w:rPr>
-                <w:webHidden/>
-              </w:rPr>
-              <w:fldChar w:fldCharType="separate"/>
             </w:r>
             <w:r>
               <w:rPr>
@@ -1942,6 +2080,35 @@
                 <w:vanish w:val="false"/>
               </w:rPr>
               <w:tab/>
+            </w:r>
+            <w:r>
+              <w:rPr>
+                <w:webHidden/>
+              </w:rPr>
+              <w:fldChar w:fldCharType="begin"/>
+            </w:r>
+            <w:r>
+              <w:rPr>
+                <w:webHidden/>
+              </w:rPr>
+              <w:instrText xml:space="preserve">PAGEREF _Toc224457923 \h</w:instrText>
+            </w:r>
+            <w:r>
+              <w:rPr>
+                <w:webHidden/>
+              </w:rPr>
+              <w:fldChar w:fldCharType="separate"/>
+            </w:r>
+            <w:r>
+              <w:rPr>
+                <w:rStyle w:val="IndexLink"/>
+                <w:rFonts w:ascii="Trebuchet MS" w:hAnsi="Trebuchet MS"/>
+                <w:b w:val="false"/>
+                <w:bCs w:val="false"/>
+                <w:i w:val="false"/>
+                <w:iCs w:val="false"/>
+                <w:vanish w:val="false"/>
+              </w:rPr>
               <w:t>10</w:t>
             </w:r>
             <w:r>
@@ -1960,7 +2127,7 @@
               <w:tab w:val="right" w:pos="8664" w:leader="dot"/>
             </w:tabs>
             <w:rPr>
-              <w:rFonts w:ascii="Trebuchet MS" w:hAnsi="Trebuchet MS" w:eastAsia="ＭＳ 明朝" w:cs="" w:cstheme="minorBidi" w:eastAsiaTheme="minorEastAsia"/>
+              <w:rFonts w:ascii="Trebuchet MS" w:hAnsi="Trebuchet MS" w:eastAsia="" w:cs="" w:cstheme="minorBidi" w:eastAsiaTheme="minorEastAsia"/>
               <w:b w:val="false"/>
               <w:bCs w:val="false"/>
               <w:i w:val="false"/>
@@ -1978,27 +2145,10 @@
                 <w:bCs w:val="false"/>
                 <w:i w:val="false"/>
                 <w:iCs w:val="false"/>
+                <w:vanish w:val="false"/>
                 <w:webHidden/>
               </w:rPr>
               <w:t>8. Reference list</w:t>
-            </w:r>
-            <w:r>
-              <w:rPr>
-                <w:webHidden/>
-              </w:rPr>
-              <w:fldChar w:fldCharType="begin"/>
-            </w:r>
-            <w:r>
-              <w:rPr>
-                <w:webHidden/>
-              </w:rPr>
-              <w:instrText xml:space="preserve">PAGEREF _Toc224457924 \h</w:instrText>
-            </w:r>
-            <w:r>
-              <w:rPr>
-                <w:webHidden/>
-              </w:rPr>
-              <w:fldChar w:fldCharType="separate"/>
             </w:r>
             <w:r>
               <w:rPr>
@@ -2011,6 +2161,35 @@
                 <w:vanish w:val="false"/>
               </w:rPr>
               <w:tab/>
+            </w:r>
+            <w:r>
+              <w:rPr>
+                <w:webHidden/>
+              </w:rPr>
+              <w:fldChar w:fldCharType="begin"/>
+            </w:r>
+            <w:r>
+              <w:rPr>
+                <w:webHidden/>
+              </w:rPr>
+              <w:instrText xml:space="preserve">PAGEREF _Toc224457924 \h</w:instrText>
+            </w:r>
+            <w:r>
+              <w:rPr>
+                <w:webHidden/>
+              </w:rPr>
+              <w:fldChar w:fldCharType="separate"/>
+            </w:r>
+            <w:r>
+              <w:rPr>
+                <w:rStyle w:val="IndexLink"/>
+                <w:rFonts w:ascii="Trebuchet MS" w:hAnsi="Trebuchet MS"/>
+                <w:b w:val="false"/>
+                <w:bCs w:val="false"/>
+                <w:i w:val="false"/>
+                <w:iCs w:val="false"/>
+                <w:vanish w:val="false"/>
+              </w:rPr>
               <w:t>11</w:t>
             </w:r>
             <w:r>
@@ -2029,7 +2208,7 @@
               <w:tab w:val="right" w:pos="8664" w:leader="dot"/>
             </w:tabs>
             <w:rPr>
-              <w:rFonts w:ascii="Trebuchet MS" w:hAnsi="Trebuchet MS" w:eastAsia="ＭＳ 明朝" w:cs="" w:cstheme="minorBidi" w:eastAsiaTheme="minorEastAsia"/>
+              <w:rFonts w:ascii="Trebuchet MS" w:hAnsi="Trebuchet MS" w:eastAsia="" w:cs="" w:cstheme="minorBidi" w:eastAsiaTheme="minorEastAsia"/>
               <w:b w:val="false"/>
               <w:bCs w:val="false"/>
               <w:i w:val="false"/>
@@ -2047,27 +2226,10 @@
                 <w:bCs w:val="false"/>
                 <w:i w:val="false"/>
                 <w:iCs w:val="false"/>
+                <w:vanish w:val="false"/>
                 <w:webHidden/>
               </w:rPr>
               <w:t>10. Appendices</w:t>
-            </w:r>
-            <w:r>
-              <w:rPr>
-                <w:webHidden/>
-              </w:rPr>
-              <w:fldChar w:fldCharType="begin"/>
-            </w:r>
-            <w:r>
-              <w:rPr>
-                <w:webHidden/>
-              </w:rPr>
-              <w:instrText xml:space="preserve">PAGEREF _Toc224457925 \h</w:instrText>
-            </w:r>
-            <w:r>
-              <w:rPr>
-                <w:webHidden/>
-              </w:rPr>
-              <w:fldChar w:fldCharType="separate"/>
             </w:r>
             <w:r>
               <w:rPr>
@@ -2080,6 +2242,35 @@
                 <w:vanish w:val="false"/>
               </w:rPr>
               <w:tab/>
+            </w:r>
+            <w:r>
+              <w:rPr>
+                <w:webHidden/>
+              </w:rPr>
+              <w:fldChar w:fldCharType="begin"/>
+            </w:r>
+            <w:r>
+              <w:rPr>
+                <w:webHidden/>
+              </w:rPr>
+              <w:instrText xml:space="preserve">PAGEREF _Toc224457925 \h</w:instrText>
+            </w:r>
+            <w:r>
+              <w:rPr>
+                <w:webHidden/>
+              </w:rPr>
+              <w:fldChar w:fldCharType="separate"/>
+            </w:r>
+            <w:r>
+              <w:rPr>
+                <w:rStyle w:val="IndexLink"/>
+                <w:rFonts w:ascii="Trebuchet MS" w:hAnsi="Trebuchet MS"/>
+                <w:b w:val="false"/>
+                <w:bCs w:val="false"/>
+                <w:i w:val="false"/>
+                <w:iCs w:val="false"/>
+                <w:vanish w:val="false"/>
+              </w:rPr>
               <w:t>12</w:t>
             </w:r>
             <w:r>
@@ -2098,7 +2289,7 @@
               <w:tab w:val="right" w:pos="8664" w:leader="dot"/>
             </w:tabs>
             <w:rPr>
-              <w:rFonts w:ascii="Trebuchet MS" w:hAnsi="Trebuchet MS" w:eastAsia="ＭＳ 明朝" w:cs="" w:cstheme="minorBidi" w:eastAsiaTheme="minorEastAsia"/>
+              <w:rFonts w:ascii="Trebuchet MS" w:hAnsi="Trebuchet MS" w:eastAsia="" w:cs="" w:cstheme="minorBidi" w:eastAsiaTheme="minorEastAsia"/>
               <w:b w:val="false"/>
               <w:bCs w:val="false"/>
               <w:kern w:val="2"/>
@@ -2114,27 +2305,10 @@
                 <w:rFonts w:ascii="Trebuchet MS" w:hAnsi="Trebuchet MS"/>
                 <w:b w:val="false"/>
                 <w:bCs w:val="false"/>
+                <w:vanish w:val="false"/>
                 <w:webHidden/>
               </w:rPr>
               <w:t>Appendix A: Artificial Intelligence (AI) Declaration</w:t>
-            </w:r>
-            <w:r>
-              <w:rPr>
-                <w:webHidden/>
-              </w:rPr>
-              <w:fldChar w:fldCharType="begin"/>
-            </w:r>
-            <w:r>
-              <w:rPr>
-                <w:webHidden/>
-              </w:rPr>
-              <w:instrText xml:space="preserve">PAGEREF _Toc224457926 \h</w:instrText>
-            </w:r>
-            <w:r>
-              <w:rPr>
-                <w:webHidden/>
-              </w:rPr>
-              <w:fldChar w:fldCharType="separate"/>
             </w:r>
             <w:r>
               <w:rPr>
@@ -2145,6 +2319,33 @@
                 <w:vanish w:val="false"/>
               </w:rPr>
               <w:tab/>
+            </w:r>
+            <w:r>
+              <w:rPr>
+                <w:webHidden/>
+              </w:rPr>
+              <w:fldChar w:fldCharType="begin"/>
+            </w:r>
+            <w:r>
+              <w:rPr>
+                <w:webHidden/>
+              </w:rPr>
+              <w:instrText xml:space="preserve">PAGEREF _Toc224457926 \h</w:instrText>
+            </w:r>
+            <w:r>
+              <w:rPr>
+                <w:webHidden/>
+              </w:rPr>
+              <w:fldChar w:fldCharType="separate"/>
+            </w:r>
+            <w:r>
+              <w:rPr>
+                <w:rStyle w:val="IndexLink"/>
+                <w:rFonts w:ascii="Trebuchet MS" w:hAnsi="Trebuchet MS"/>
+                <w:b w:val="false"/>
+                <w:bCs w:val="false"/>
+                <w:vanish w:val="false"/>
+              </w:rPr>
               <w:t>A</w:t>
             </w:r>
             <w:r>
@@ -2163,7 +2364,7 @@
               <w:tab w:val="right" w:pos="8664" w:leader="dot"/>
             </w:tabs>
             <w:rPr>
-              <w:rFonts w:ascii="Trebuchet MS" w:hAnsi="Trebuchet MS" w:eastAsia="ＭＳ 明朝" w:cs="" w:cstheme="minorBidi" w:eastAsiaTheme="minorEastAsia"/>
+              <w:rFonts w:ascii="Trebuchet MS" w:hAnsi="Trebuchet MS" w:eastAsia="" w:cs="" w:cstheme="minorBidi" w:eastAsiaTheme="minorEastAsia"/>
               <w:b w:val="false"/>
               <w:bCs w:val="false"/>
               <w:kern w:val="2"/>
@@ -2179,27 +2380,10 @@
                 <w:rFonts w:ascii="Trebuchet MS" w:hAnsi="Trebuchet MS"/>
                 <w:b w:val="false"/>
                 <w:bCs w:val="false"/>
+                <w:vanish w:val="false"/>
                 <w:webHidden/>
               </w:rPr>
               <w:t>Appendix B: Ethical Release</w:t>
-            </w:r>
-            <w:r>
-              <w:rPr>
-                <w:webHidden/>
-              </w:rPr>
-              <w:fldChar w:fldCharType="begin"/>
-            </w:r>
-            <w:r>
-              <w:rPr>
-                <w:webHidden/>
-              </w:rPr>
-              <w:instrText xml:space="preserve">PAGEREF _Toc224457927 \h</w:instrText>
-            </w:r>
-            <w:r>
-              <w:rPr>
-                <w:webHidden/>
-              </w:rPr>
-              <w:fldChar w:fldCharType="separate"/>
             </w:r>
             <w:r>
               <w:rPr>
@@ -2210,6 +2394,33 @@
                 <w:vanish w:val="false"/>
               </w:rPr>
               <w:tab/>
+            </w:r>
+            <w:r>
+              <w:rPr>
+                <w:webHidden/>
+              </w:rPr>
+              <w:fldChar w:fldCharType="begin"/>
+            </w:r>
+            <w:r>
+              <w:rPr>
+                <w:webHidden/>
+              </w:rPr>
+              <w:instrText xml:space="preserve">PAGEREF _Toc224457927 \h</w:instrText>
+            </w:r>
+            <w:r>
+              <w:rPr>
+                <w:webHidden/>
+              </w:rPr>
+              <w:fldChar w:fldCharType="separate"/>
+            </w:r>
+            <w:r>
+              <w:rPr>
+                <w:rStyle w:val="IndexLink"/>
+                <w:rFonts w:ascii="Trebuchet MS" w:hAnsi="Trebuchet MS"/>
+                <w:b w:val="false"/>
+                <w:bCs w:val="false"/>
+                <w:vanish w:val="false"/>
+              </w:rPr>
               <w:t>B</w:t>
             </w:r>
             <w:r>
@@ -2228,7 +2439,7 @@
               <w:tab w:val="right" w:pos="8664" w:leader="dot"/>
             </w:tabs>
             <w:rPr>
-              <w:rFonts w:ascii="Trebuchet MS" w:hAnsi="Trebuchet MS" w:eastAsia="ＭＳ 明朝" w:cs="" w:cstheme="minorBidi" w:eastAsiaTheme="minorEastAsia"/>
+              <w:rFonts w:ascii="Trebuchet MS" w:hAnsi="Trebuchet MS" w:eastAsia="" w:cs="" w:cstheme="minorBidi" w:eastAsiaTheme="minorEastAsia"/>
               <w:b w:val="false"/>
               <w:bCs w:val="false"/>
               <w:kern w:val="2"/>
@@ -2244,27 +2455,10 @@
                 <w:rFonts w:ascii="Trebuchet MS" w:hAnsi="Trebuchet MS"/>
                 <w:b w:val="false"/>
                 <w:bCs w:val="false"/>
+                <w:vanish w:val="false"/>
                 <w:webHidden/>
               </w:rPr>
               <w:t>Appendix C: Title</w:t>
-            </w:r>
-            <w:r>
-              <w:rPr>
-                <w:webHidden/>
-              </w:rPr>
-              <w:fldChar w:fldCharType="begin"/>
-            </w:r>
-            <w:r>
-              <w:rPr>
-                <w:webHidden/>
-              </w:rPr>
-              <w:instrText xml:space="preserve">PAGEREF _Toc224457928 \h</w:instrText>
-            </w:r>
-            <w:r>
-              <w:rPr>
-                <w:webHidden/>
-              </w:rPr>
-              <w:fldChar w:fldCharType="separate"/>
             </w:r>
             <w:r>
               <w:rPr>
@@ -2275,6 +2469,33 @@
                 <w:vanish w:val="false"/>
               </w:rPr>
               <w:tab/>
+            </w:r>
+            <w:r>
+              <w:rPr>
+                <w:webHidden/>
+              </w:rPr>
+              <w:fldChar w:fldCharType="begin"/>
+            </w:r>
+            <w:r>
+              <w:rPr>
+                <w:webHidden/>
+              </w:rPr>
+              <w:instrText xml:space="preserve">PAGEREF _Toc224457928 \h</w:instrText>
+            </w:r>
+            <w:r>
+              <w:rPr>
+                <w:webHidden/>
+              </w:rPr>
+              <w:fldChar w:fldCharType="separate"/>
+            </w:r>
+            <w:r>
+              <w:rPr>
+                <w:rStyle w:val="IndexLink"/>
+                <w:rFonts w:ascii="Trebuchet MS" w:hAnsi="Trebuchet MS"/>
+                <w:b w:val="false"/>
+                <w:bCs w:val="false"/>
+                <w:vanish w:val="false"/>
+              </w:rPr>
               <w:t>C</w:t>
             </w:r>
             <w:r>
@@ -2293,7 +2514,7 @@
               <w:tab w:val="right" w:pos="8664" w:leader="dot"/>
             </w:tabs>
             <w:rPr>
-              <w:rFonts w:eastAsia="ＭＳ 明朝" w:cs="" w:cstheme="minorBidi" w:eastAsiaTheme="minorEastAsia"/>
+              <w:rFonts w:eastAsia="" w:cs="" w:cstheme="minorBidi" w:eastAsiaTheme="minorEastAsia"/>
               <w:b w:val="false"/>
               <w:bCs w:val="false"/>
               <w:kern w:val="2"/>
@@ -2309,27 +2530,10 @@
                 <w:rFonts w:ascii="Trebuchet MS" w:hAnsi="Trebuchet MS"/>
                 <w:b w:val="false"/>
                 <w:bCs w:val="false"/>
+                <w:vanish w:val="false"/>
                 <w:webHidden/>
               </w:rPr>
               <w:t>Appendix D: Title</w:t>
-            </w:r>
-            <w:r>
-              <w:rPr>
-                <w:webHidden/>
-              </w:rPr>
-              <w:fldChar w:fldCharType="begin"/>
-            </w:r>
-            <w:r>
-              <w:rPr>
-                <w:webHidden/>
-              </w:rPr>
-              <w:instrText xml:space="preserve">PAGEREF _Toc224457929 \h</w:instrText>
-            </w:r>
-            <w:r>
-              <w:rPr>
-                <w:webHidden/>
-              </w:rPr>
-              <w:fldChar w:fldCharType="separate"/>
             </w:r>
             <w:r>
               <w:rPr>
@@ -2340,6 +2544,33 @@
                 <w:vanish w:val="false"/>
               </w:rPr>
               <w:tab/>
+            </w:r>
+            <w:r>
+              <w:rPr>
+                <w:webHidden/>
+              </w:rPr>
+              <w:fldChar w:fldCharType="begin"/>
+            </w:r>
+            <w:r>
+              <w:rPr>
+                <w:webHidden/>
+              </w:rPr>
+              <w:instrText xml:space="preserve">PAGEREF _Toc224457929 \h</w:instrText>
+            </w:r>
+            <w:r>
+              <w:rPr>
+                <w:webHidden/>
+              </w:rPr>
+              <w:fldChar w:fldCharType="separate"/>
+            </w:r>
+            <w:r>
+              <w:rPr>
+                <w:rStyle w:val="IndexLink"/>
+                <w:rFonts w:ascii="Trebuchet MS" w:hAnsi="Trebuchet MS"/>
+                <w:b w:val="false"/>
+                <w:bCs w:val="false"/>
+                <w:vanish w:val="false"/>
+              </w:rPr>
               <w:t>D</w:t>
             </w:r>
             <w:r>
@@ -2699,7 +2930,7 @@
       <w:pPr>
         <w:pStyle w:val="Normal"/>
         <w:rPr>
-          <w:rFonts w:ascii="Calibri" w:hAnsi="Calibri" w:eastAsia="ＭＳ ゴシック" w:cs="" w:asciiTheme="majorHAnsi" w:cstheme="majorBidi" w:eastAsiaTheme="majorEastAsia" w:hAnsiTheme="majorHAnsi"/>
+          <w:rFonts w:ascii="Calibri" w:hAnsi="Calibri" w:eastAsia="" w:cs="" w:asciiTheme="majorHAnsi" w:cstheme="majorBidi" w:eastAsiaTheme="majorEastAsia" w:hAnsiTheme="majorHAnsi"/>
           <w:b/>
           <w:bCs/>
           <w:color w:themeColor="accent1" w:themeShade="b5" w:val="345A8A"/>
@@ -2709,7 +2940,7 @@
       </w:pPr>
       <w:r>
         <w:rPr>
-          <w:rFonts w:eastAsia="ＭＳ ゴシック" w:cs="" w:cstheme="majorBidi" w:eastAsiaTheme="majorEastAsia" w:ascii="Calibri" w:hAnsi="Calibri"/>
+          <w:rFonts w:eastAsia="" w:cs="" w:cstheme="majorBidi" w:eastAsiaTheme="majorEastAsia" w:ascii="Calibri" w:hAnsi="Calibri"/>
           <w:b/>
           <w:bCs/>
           <w:color w:themeColor="accent1" w:themeShade="b5" w:val="345A8A"/>
@@ -2740,49 +2971,22 @@
     </w:p>
     <w:p>
       <w:pPr>
-        <w:pStyle w:val="Essayparagraphtext"/>
-        <w:spacing w:before="0" w:after="200"/>
-        <w:rPr>
-          <w:rFonts w:cs="Arial"/>
-          <w:color w:val="FF0000"/>
-        </w:rPr>
-      </w:pPr>
-      <w:r>
-        <w:rPr>
-          <w:rFonts w:cs="Arial"/>
-          <w:color w:val="FF0000"/>
-        </w:rPr>
-        <w:t>The introduction sets the direction of the project and forms the reader’s first judgement, so clarity and focus are essential. Briefly introduce the area of study, explain why it is currently important, and define a clear, specific problem or hypnotise. The section can offer an action</w:t>
-        <w:noBreakHyphen/>
-        <w:t>focused project aim supported by measurable objectives and provide a high</w:t>
-        <w:noBreakHyphen/>
-        <w:t>level overview of the proposed solution without technical detail. It should clearly define the project scope and boundaries, identify target users or stakeholders (if applicable) and explain both the practical value of the work, linking this value directly to the problem or hypnotise. The introduction should be concise, supported by sources facts and figures, and avoid common mistakes such as generic background history, unclear scope, repeated objectives, or early design detail.</w:t>
-      </w:r>
-    </w:p>
-    <w:p>
-      <w:pPr>
-        <w:pStyle w:val="Essayparagraphtext"/>
-        <w:spacing w:before="0" w:after="200"/>
-        <w:rPr>
-          <w:rFonts w:cs="Arial"/>
-          <w:color w:val="FF0000"/>
-        </w:rPr>
-      </w:pPr>
-      <w:r>
-        <w:rPr>
-          <w:rFonts w:cs="Arial"/>
-          <w:b/>
-          <w:bCs/>
-          <w:color w:val="FF0000"/>
-        </w:rPr>
-        <w:t>As with all guidance notes provided in this template, these suggestions are intended to help you get started. Your supervisor will provide further guidance based on the expectations of your degree pathway and your chosen approach to the project</w:t>
-      </w:r>
-      <w:r>
-        <w:rPr>
-          <w:rFonts w:cs="Arial"/>
-          <w:color w:val="FF0000"/>
-        </w:rPr>
-        <w:t>.</w:t>
+        <w:pStyle w:val="Normal"/>
+        <w:rPr>
+          <w:rFonts w:ascii="Calibri" w:hAnsi="Calibri"/>
+          <w:color w:val="auto"/>
+          <w:sz w:val="26"/>
+          <w:szCs w:val="26"/>
+        </w:rPr>
+      </w:pPr>
+      <w:r>
+        <w:rPr>
+          <w:rFonts w:cs="Calibri" w:ascii="Calibri" w:hAnsi="Calibri"/>
+          <w:color w:val="auto"/>
+          <w:sz w:val="26"/>
+          <w:szCs w:val="26"/>
+        </w:rPr>
+        <w:t>Through talking to peers who are interested in and produce screenplays, I understand that the screenwriting software market is heavily saturated but there is not a free product that meets the requirements of a screenwriter. The idea to provide a solution to this problem was the beginning of this project. This was followed by questions such as what features of a screenwriting application are critical to functionality and what other features does the market provide that screenwriters appreciate. From these questions the underlying idea was developed into: Creation of a professional pure screenwriting software application that follows industry standards, for free.</w:t>
       </w:r>
     </w:p>
     <w:p>
@@ -3733,7 +3937,7 @@
       <w:pPr>
         <w:pStyle w:val="Normal"/>
         <w:rPr>
-          <w:rFonts w:ascii="Calibri" w:hAnsi="Calibri" w:eastAsia="ＭＳ ゴシック" w:cs="" w:asciiTheme="majorHAnsi" w:cstheme="majorBidi" w:eastAsiaTheme="majorEastAsia" w:hAnsiTheme="majorHAnsi"/>
+          <w:rFonts w:ascii="Calibri" w:hAnsi="Calibri" w:eastAsia="" w:cs="" w:asciiTheme="majorHAnsi" w:cstheme="majorBidi" w:eastAsiaTheme="majorEastAsia" w:hAnsiTheme="majorHAnsi"/>
           <w:b/>
           <w:bCs/>
           <w:color w:themeColor="accent1" w:themeShade="b5" w:val="345A8A"/>
@@ -3743,7 +3947,7 @@
       </w:pPr>
       <w:r>
         <w:rPr>
-          <w:rFonts w:eastAsia="ＭＳ ゴシック" w:cs="" w:cstheme="majorBidi" w:eastAsiaTheme="majorEastAsia" w:ascii="Calibri" w:hAnsi="Calibri"/>
+          <w:rFonts w:eastAsia="" w:cs="" w:cstheme="majorBidi" w:eastAsiaTheme="majorEastAsia" w:ascii="Calibri" w:hAnsi="Calibri"/>
           <w:b/>
           <w:bCs/>
           <w:color w:themeColor="accent1" w:themeShade="b5" w:val="345A8A"/>
@@ -4278,11 +4482,12 @@
         <w:jc w:val="center"/>
         <w:rPr/>
         <w:sectPr>
-          <w:headerReference w:type="default" r:id="rId13"/>
-          <w:headerReference w:type="first" r:id="rId14"/>
-          <w:footerReference w:type="even" r:id="rId15"/>
-          <w:footerReference w:type="default" r:id="rId16"/>
-          <w:footerReference w:type="first" r:id="rId17"/>
+          <w:headerReference w:type="even" r:id="rId13"/>
+          <w:headerReference w:type="default" r:id="rId14"/>
+          <w:headerReference w:type="first" r:id="rId15"/>
+          <w:footerReference w:type="even" r:id="rId16"/>
+          <w:footerReference w:type="default" r:id="rId17"/>
+          <w:footerReference w:type="first" r:id="rId18"/>
           <w:type w:val="nextPage"/>
           <w:pgSz w:w="11906" w:h="16838"/>
           <w:pgMar w:left="1814" w:right="1418" w:gutter="0" w:header="709" w:top="2155" w:footer="709" w:bottom="2155"/>
@@ -4375,23 +4580,13 @@
           <w:color w:val="FF0000"/>
           <w:szCs w:val="28"/>
         </w:rPr>
-      </w:pPr>
-      <w:r>
-        <w:rPr>
-          <w:rFonts w:cs="Arial"/>
-          <w:color w:val="FF0000"/>
-          <w:szCs w:val="28"/>
-        </w:rPr>
-      </w:r>
-    </w:p>
-    <w:p>
-      <w:pPr>
         <w:sectPr>
-          <w:headerReference w:type="default" r:id="rId18"/>
-          <w:headerReference w:type="first" r:id="rId19"/>
-          <w:footerReference w:type="even" r:id="rId20"/>
-          <w:footerReference w:type="default" r:id="rId21"/>
-          <w:footerReference w:type="first" r:id="rId22"/>
+          <w:headerReference w:type="even" r:id="rId19"/>
+          <w:headerReference w:type="default" r:id="rId20"/>
+          <w:headerReference w:type="first" r:id="rId21"/>
+          <w:footerReference w:type="even" r:id="rId22"/>
+          <w:footerReference w:type="default" r:id="rId23"/>
+          <w:footerReference w:type="first" r:id="rId24"/>
           <w:type w:val="nextPage"/>
           <w:pgSz w:w="11906" w:h="16838"/>
           <w:pgMar w:left="1814" w:right="1418" w:gutter="0" w:header="709" w:top="2155" w:footer="709" w:bottom="2155"/>
@@ -4402,6 +4597,13 @@
         </w:sectPr>
       </w:pPr>
       <w:r>
+        <w:rPr>
+          <w:rFonts w:cs="Arial"/>
+          <w:color w:val="FF0000"/>
+          <w:szCs w:val="28"/>
+        </w:rPr>
+      </w:r>
+      <w:r>
         <w:br w:type="page"/>
       </w:r>
     </w:p>
@@ -4410,7 +4612,7 @@
         <w:pStyle w:val="Normal"/>
         <w:spacing w:before="0" w:after="0"/>
         <w:rPr>
-          <w:rFonts w:ascii="Calibri" w:hAnsi="Calibri" w:eastAsia="ＭＳ ゴシック" w:cs="" w:asciiTheme="majorHAnsi" w:cstheme="majorBidi" w:eastAsiaTheme="majorEastAsia" w:hAnsiTheme="majorHAnsi"/>
+          <w:rFonts w:ascii="Calibri" w:hAnsi="Calibri" w:eastAsia="" w:cs="" w:asciiTheme="majorHAnsi" w:cstheme="majorBidi" w:eastAsiaTheme="majorEastAsia" w:hAnsiTheme="majorHAnsi"/>
           <w:color w:themeColor="accent1" w:themeShade="bf" w:val="365F91"/>
           <w:sz w:val="26"/>
           <w:szCs w:val="26"/>
@@ -4418,7 +4620,7 @@
       </w:pPr>
       <w:r>
         <w:rPr>
-          <w:rFonts w:eastAsia="ＭＳ ゴシック" w:cs="" w:cstheme="majorBidi" w:eastAsiaTheme="majorEastAsia" w:ascii="Calibri" w:hAnsi="Calibri"/>
+          <w:rFonts w:eastAsia="" w:cs="" w:cstheme="majorBidi" w:eastAsiaTheme="majorEastAsia" w:ascii="Calibri" w:hAnsi="Calibri"/>
           <w:color w:themeColor="accent1" w:themeShade="bf" w:val="365F91"/>
           <w:sz w:val="26"/>
           <w:szCs w:val="26"/>
@@ -4687,38 +4889,35 @@
     <w:p>
       <w:pPr>
         <w:pStyle w:val="Essayparagraphtext"/>
-        <w:spacing w:before="0" w:after="200"/>
-        <w:rPr>
-          <w:rFonts w:cs="Arial"/>
-        </w:rPr>
-      </w:pPr>
-      <w:r>
-        <w:rPr>
-          <w:bCs/>
-          <w:color w:val="FF0000"/>
-          <w:sz w:val="21"/>
-          <w:szCs w:val="21"/>
-        </w:rPr>
-        <w:br/>
-      </w:r>
-    </w:p>
-    <w:p>
-      <w:pPr>
+        <w:spacing w:before="0" w:after="0"/>
+        <w:rPr>
+          <w:rFonts w:cs="Arial"/>
+        </w:rPr>
         <w:sectPr>
-          <w:headerReference w:type="default" r:id="rId23"/>
-          <w:headerReference w:type="first" r:id="rId24"/>
-          <w:footerReference w:type="even" r:id="rId25"/>
-          <w:footerReference w:type="default" r:id="rId26"/>
-          <w:footerReference w:type="first" r:id="rId27"/>
+          <w:headerReference w:type="even" r:id="rId25"/>
+          <w:headerReference w:type="default" r:id="rId26"/>
+          <w:headerReference w:type="first" r:id="rId27"/>
+          <w:footerReference w:type="even" r:id="rId28"/>
+          <w:footerReference w:type="default" r:id="rId29"/>
+          <w:footerReference w:type="first" r:id="rId30"/>
           <w:type w:val="nextPage"/>
           <w:pgSz w:w="11906" w:h="16838"/>
           <w:pgMar w:left="1814" w:right="1418" w:gutter="0" w:header="709" w:top="2155" w:footer="709" w:bottom="2155"/>
           <w:pgNumType w:fmt="decimal"/>
           <w:formProt w:val="false"/>
           <w:textDirection w:val="lrTb"/>
-          <w:docGrid w:type="default" w:linePitch="312" w:charSpace="4294961151"/>
+          <w:docGrid w:type="default" w:linePitch="312" w:charSpace="0"/>
         </w:sectPr>
       </w:pPr>
+      <w:r>
+        <w:rPr>
+          <w:bCs/>
+          <w:color w:val="FF0000"/>
+          <w:sz w:val="21"/>
+          <w:szCs w:val="21"/>
+        </w:rPr>
+        <w:br/>
+      </w:r>
     </w:p>
     <w:p>
       <w:pPr>
@@ -4742,10 +4941,12 @@
       </w:r>
     </w:p>
     <w:sectPr>
-      <w:headerReference w:type="default" r:id="rId28"/>
-      <w:headerReference w:type="first" r:id="rId29"/>
-      <w:footerReference w:type="default" r:id="rId30"/>
-      <w:footerReference w:type="first" r:id="rId31"/>
+      <w:headerReference w:type="even" r:id="rId31"/>
+      <w:headerReference w:type="default" r:id="rId32"/>
+      <w:headerReference w:type="first" r:id="rId33"/>
+      <w:footerReference w:type="even" r:id="rId34"/>
+      <w:footerReference w:type="default" r:id="rId35"/>
+      <w:footerReference w:type="first" r:id="rId36"/>
       <w:type w:val="nextPage"/>
       <w:pgSz w:w="11906" w:h="16838"/>
       <w:pgMar w:left="1814" w:right="1418" w:gutter="0" w:header="709" w:top="2155" w:footer="709" w:bottom="2155"/>
@@ -4768,12 +4969,10 @@
     </w:pPr>
     <w:r>
       <w:rPr/>
-    </w:r>
-    <w:r>
       <mc:AlternateContent>
         <mc:Choice Requires="wps">
           <w:drawing>
-            <wp:anchor distT="0" distB="0" distL="0" distR="0" simplePos="0" relativeHeight="0" behindDoc="0" locked="0" layoutInCell="1" allowOverlap="1">
+            <wp:anchor distT="0" distB="0" distL="0" distR="0" simplePos="0" relativeHeight="13" behindDoc="1" locked="0" layoutInCell="0" allowOverlap="1">
               <wp:simplePos x="0" y="0"/>
               <wp:positionH relativeFrom="margin">
                 <wp:align>center</wp:align>
@@ -4788,25 +4987,31 @@
               <a:graphic xmlns:a="http://schemas.openxmlformats.org/drawingml/2006/main">
                 <a:graphicData uri="http://schemas.microsoft.com/office/word/2010/wordprocessingShape">
                   <wps:wsp>
-                    <wps:cNvSpPr txBox="1"/>
+                    <wps:cNvSpPr/>
                     <wps:spPr>
                       <a:xfrm>
                         <a:off x="0" y="0"/>
-                        <a:ext cx="14605" cy="14605"/>
+                        <a:ext cx="14760" cy="14760"/>
                       </a:xfrm>
-                      <a:prstGeom prst="rect"/>
-                      <a:solidFill>
-                        <a:srgbClr val="FFFFFF">
-                          <a:alpha val="0"/>
-                        </a:srgbClr>
-                      </a:solidFill>
+                      <a:prstGeom prst="rect">
+                        <a:avLst/>
+                      </a:prstGeom>
+                      <a:noFill/>
+                      <a:ln w="0">
+                        <a:noFill/>
+                      </a:ln>
                     </wps:spPr>
+                    <wps:style>
+                      <a:lnRef idx="0"/>
+                      <a:fillRef idx="0"/>
+                      <a:effectRef idx="0"/>
+                      <a:fontRef idx="minor"/>
+                    </wps:style>
                     <wps:txbx>
                       <w:txbxContent>
                         <w:p>
                           <w:pPr>
                             <w:pStyle w:val="Footer"/>
-                            <w:pBdr/>
                             <w:rPr>
                               <w:rStyle w:val="PageNumber"/>
                             </w:rPr>
@@ -4844,7 +5049,7 @@
                         </w:p>
                       </w:txbxContent>
                     </wps:txbx>
-                    <wps:bodyPr anchor="t" lIns="0" tIns="0" rIns="0" bIns="0">
+                    <wps:bodyPr lIns="0" rIns="0" tIns="0" bIns="0" anchor="t">
                       <a:spAutoFit/>
                     </wps:bodyPr>
                   </wps:wsp>
@@ -4855,14 +5060,14 @@
         </mc:Choice>
         <mc:Fallback>
           <w:pict>
-            <v:rect fillcolor="#FFFFFF" style="position:absolute;rotation:-0;width:1.15pt;height:1.15pt;mso-wrap-distance-left:0pt;mso-wrap-distance-right:0pt;mso-wrap-distance-top:0pt;mso-wrap-distance-bottom:0pt;margin-top:0.05pt;mso-position-vertical-relative:text;margin-left:0pt;mso-position-horizontal:center;mso-position-horizontal-relative:margin">
-              <v:fill opacity="0f"/>
-              <v:textbox inset="0in,0in,0in,0in">
+            <v:rect id="shape_0" fillcolor="white" stroked="f" o:allowincell="f" style="position:absolute;margin-left:0pt;margin-top:0.05pt;width:1.1pt;height:1.1pt;mso-wrap-style:square;v-text-anchor:top;mso-position-horizontal:center;mso-position-horizontal-relative:margin">
+              <v:fill o:detectmouseclick="t" type="solid" color2="black" opacity="0"/>
+              <v:stroke color="#3465a4" joinstyle="round" endcap="flat"/>
+              <v:textbox>
                 <w:txbxContent>
                   <w:p>
                     <w:pPr>
                       <w:pStyle w:val="Footer"/>
-                      <w:pBdr/>
                       <w:rPr>
                         <w:rStyle w:val="PageNumber"/>
                       </w:rPr>
@@ -5072,12 +5277,10 @@
         <w:b/>
         <w:sz w:val="20"/>
       </w:rPr>
-    </w:r>
-    <w:r>
       <mc:AlternateContent>
         <mc:Choice Requires="wps">
           <w:drawing>
-            <wp:anchor distT="0" distB="0" distL="0" distR="0" simplePos="0" relativeHeight="5" behindDoc="0" locked="0" layoutInCell="0" allowOverlap="1">
+            <wp:anchor distT="0" distB="0" distL="0" distR="0" simplePos="0" relativeHeight="8" behindDoc="1" locked="0" layoutInCell="0" allowOverlap="1">
               <wp:simplePos x="0" y="0"/>
               <wp:positionH relativeFrom="margin">
                 <wp:align>center</wp:align>
@@ -5085,32 +5288,38 @@
               <wp:positionV relativeFrom="paragraph">
                 <wp:posOffset>635</wp:posOffset>
               </wp:positionV>
-              <wp:extent cx="64135" cy="146685"/>
+              <wp:extent cx="64135" cy="145415"/>
               <wp:effectExtent l="0" t="0" r="0" b="0"/>
               <wp:wrapSquare wrapText="bothSides"/>
               <wp:docPr id="3" name="Frame3"/>
               <a:graphic xmlns:a="http://schemas.openxmlformats.org/drawingml/2006/main">
                 <a:graphicData uri="http://schemas.microsoft.com/office/word/2010/wordprocessingShape">
                   <wps:wsp>
-                    <wps:cNvSpPr txBox="1"/>
+                    <wps:cNvSpPr/>
                     <wps:spPr>
                       <a:xfrm>
                         <a:off x="0" y="0"/>
-                        <a:ext cx="64135" cy="146685"/>
+                        <a:ext cx="64080" cy="145440"/>
                       </a:xfrm>
-                      <a:prstGeom prst="rect"/>
-                      <a:solidFill>
-                        <a:srgbClr val="FFFFFF">
-                          <a:alpha val="0"/>
-                        </a:srgbClr>
-                      </a:solidFill>
+                      <a:prstGeom prst="rect">
+                        <a:avLst/>
+                      </a:prstGeom>
+                      <a:noFill/>
+                      <a:ln w="0">
+                        <a:noFill/>
+                      </a:ln>
                     </wps:spPr>
+                    <wps:style>
+                      <a:lnRef idx="0"/>
+                      <a:fillRef idx="0"/>
+                      <a:effectRef idx="0"/>
+                      <a:fontRef idx="minor"/>
+                    </wps:style>
                     <wps:txbx>
                       <w:txbxContent>
                         <w:p>
                           <w:pPr>
                             <w:pStyle w:val="Footer"/>
-                            <w:pBdr/>
                             <w:rPr>
                               <w:rStyle w:val="PageNumber"/>
                               <w:sz w:val="20"/>
@@ -5160,7 +5369,7 @@
                         </w:p>
                       </w:txbxContent>
                     </wps:txbx>
-                    <wps:bodyPr anchor="t" lIns="0" tIns="0" rIns="0" bIns="0">
+                    <wps:bodyPr lIns="0" rIns="0" tIns="0" bIns="0" anchor="t">
                       <a:spAutoFit/>
                     </wps:bodyPr>
                   </wps:wsp>
@@ -5171,14 +5380,14 @@
         </mc:Choice>
         <mc:Fallback>
           <w:pict>
-            <v:rect fillcolor="#FFFFFF" style="position:absolute;rotation:-0;width:5.05pt;height:11.55pt;mso-wrap-distance-left:0pt;mso-wrap-distance-right:0pt;mso-wrap-distance-top:0pt;mso-wrap-distance-bottom:0pt;margin-top:0.05pt;mso-position-vertical-relative:text;margin-left:214.35pt;mso-position-horizontal:center;mso-position-horizontal-relative:margin">
-              <v:fill opacity="0f"/>
-              <v:textbox inset="0in,0in,0in,0in">
+            <v:rect id="shape_0" fillcolor="white" stroked="f" o:allowincell="f" style="position:absolute;margin-left:214.3pt;margin-top:0.05pt;width:5pt;height:11.4pt;mso-wrap-style:square;v-text-anchor:top;mso-position-horizontal:center;mso-position-horizontal-relative:margin">
+              <v:fill o:detectmouseclick="t" type="solid" color2="black" opacity="0"/>
+              <v:stroke color="#3465a4" joinstyle="round" endcap="flat"/>
+              <v:textbox>
                 <w:txbxContent>
                   <w:p>
                     <w:pPr>
                       <w:pStyle w:val="Footer"/>
-                      <w:pBdr/>
                       <w:rPr>
                         <w:rStyle w:val="PageNumber"/>
                         <w:sz w:val="20"/>
@@ -5254,12 +5463,10 @@
         <w:b/>
         <w:sz w:val="20"/>
       </w:rPr>
-    </w:r>
-    <w:r>
       <mc:AlternateContent>
         <mc:Choice Requires="wps">
           <w:drawing>
-            <wp:anchor distT="0" distB="0" distL="0" distR="0" simplePos="0" relativeHeight="5" behindDoc="0" locked="0" layoutInCell="0" allowOverlap="1">
+            <wp:anchor distT="0" distB="0" distL="0" distR="0" simplePos="0" relativeHeight="8" behindDoc="1" locked="0" layoutInCell="0" allowOverlap="1">
               <wp:simplePos x="0" y="0"/>
               <wp:positionH relativeFrom="margin">
                 <wp:align>center</wp:align>
@@ -5267,32 +5474,38 @@
               <wp:positionV relativeFrom="paragraph">
                 <wp:posOffset>635</wp:posOffset>
               </wp:positionV>
-              <wp:extent cx="64135" cy="146685"/>
+              <wp:extent cx="64135" cy="145415"/>
               <wp:effectExtent l="0" t="0" r="0" b="0"/>
               <wp:wrapSquare wrapText="bothSides"/>
               <wp:docPr id="4" name="Frame3"/>
               <a:graphic xmlns:a="http://schemas.openxmlformats.org/drawingml/2006/main">
                 <a:graphicData uri="http://schemas.microsoft.com/office/word/2010/wordprocessingShape">
                   <wps:wsp>
-                    <wps:cNvSpPr txBox="1"/>
+                    <wps:cNvSpPr/>
                     <wps:spPr>
                       <a:xfrm>
                         <a:off x="0" y="0"/>
-                        <a:ext cx="64135" cy="146685"/>
+                        <a:ext cx="64080" cy="145440"/>
                       </a:xfrm>
-                      <a:prstGeom prst="rect"/>
-                      <a:solidFill>
-                        <a:srgbClr val="FFFFFF">
-                          <a:alpha val="0"/>
-                        </a:srgbClr>
-                      </a:solidFill>
+                      <a:prstGeom prst="rect">
+                        <a:avLst/>
+                      </a:prstGeom>
+                      <a:noFill/>
+                      <a:ln w="0">
+                        <a:noFill/>
+                      </a:ln>
                     </wps:spPr>
+                    <wps:style>
+                      <a:lnRef idx="0"/>
+                      <a:fillRef idx="0"/>
+                      <a:effectRef idx="0"/>
+                      <a:fontRef idx="minor"/>
+                    </wps:style>
                     <wps:txbx>
                       <w:txbxContent>
                         <w:p>
                           <w:pPr>
                             <w:pStyle w:val="Footer"/>
-                            <w:pBdr/>
                             <w:rPr>
                               <w:rStyle w:val="PageNumber"/>
                               <w:sz w:val="20"/>
@@ -5342,7 +5555,7 @@
                         </w:p>
                       </w:txbxContent>
                     </wps:txbx>
-                    <wps:bodyPr anchor="t" lIns="0" tIns="0" rIns="0" bIns="0">
+                    <wps:bodyPr lIns="0" rIns="0" tIns="0" bIns="0" anchor="t">
                       <a:spAutoFit/>
                     </wps:bodyPr>
                   </wps:wsp>
@@ -5353,14 +5566,14 @@
         </mc:Choice>
         <mc:Fallback>
           <w:pict>
-            <v:rect fillcolor="#FFFFFF" style="position:absolute;rotation:-0;width:5.05pt;height:11.55pt;mso-wrap-distance-left:0pt;mso-wrap-distance-right:0pt;mso-wrap-distance-top:0pt;mso-wrap-distance-bottom:0pt;margin-top:0.05pt;mso-position-vertical-relative:text;margin-left:214.35pt;mso-position-horizontal:center;mso-position-horizontal-relative:margin">
-              <v:fill opacity="0f"/>
-              <v:textbox inset="0in,0in,0in,0in">
+            <v:rect id="shape_0" fillcolor="white" stroked="f" o:allowincell="f" style="position:absolute;margin-left:214.3pt;margin-top:0.05pt;width:5pt;height:11.4pt;mso-wrap-style:square;v-text-anchor:top;mso-position-horizontal:center;mso-position-horizontal-relative:margin">
+              <v:fill o:detectmouseclick="t" type="solid" color2="black" opacity="0"/>
+              <v:stroke color="#3465a4" joinstyle="round" endcap="flat"/>
+              <v:textbox>
                 <w:txbxContent>
                   <w:p>
                     <w:pPr>
                       <w:pStyle w:val="Footer"/>
-                      <w:pBdr/>
                       <w:rPr>
                         <w:rStyle w:val="PageNumber"/>
                         <w:sz w:val="20"/>
@@ -5425,6 +5638,20 @@
   <w:p>
     <w:pPr>
       <w:pStyle w:val="Footer"/>
+      <w:rPr/>
+    </w:pPr>
+    <w:r>
+      <w:rPr/>
+    </w:r>
+  </w:p>
+</w:ftr>
+</file>
+
+<file path=word/footer17.xml><?xml version="1.0" encoding="utf-8"?>
+<w:ftr xmlns:o="urn:schemas-microsoft-com:office:office" xmlns:r="http://schemas.openxmlformats.org/officeDocument/2006/relationships" xmlns:v="urn:schemas-microsoft-com:vml" xmlns:w="http://schemas.openxmlformats.org/wordprocessingml/2006/main" xmlns:w10="urn:schemas-microsoft-com:office:word" xmlns:wp="http://schemas.openxmlformats.org/drawingml/2006/wordprocessingDrawing" xmlns:pic="http://schemas.openxmlformats.org/drawingml/2006/picture" xmlns:wps="http://schemas.microsoft.com/office/word/2010/wordprocessingShape" xmlns:wpg="http://schemas.microsoft.com/office/word/2010/wordprocessingGroup" xmlns:mc="http://schemas.openxmlformats.org/markup-compatibility/2006" xmlns:wp14="http://schemas.microsoft.com/office/word/2010/wordprocessingDrawing" xmlns:w14="http://schemas.microsoft.com/office/word/2010/wordml" xmlns:w15="http://schemas.microsoft.com/office/word/2012/wordml" mc:Ignorable="w14 wp14 w15">
+  <w:p>
+    <w:pPr>
+      <w:pStyle w:val="Footer"/>
       <w:ind w:end="360"/>
       <w:rPr>
         <w:b/>
@@ -5436,12 +5663,10 @@
         <w:b/>
         <w:sz w:val="20"/>
       </w:rPr>
-    </w:r>
-    <w:r>
       <mc:AlternateContent>
         <mc:Choice Requires="wps">
           <w:drawing>
-            <wp:anchor distT="0" distB="0" distL="0" distR="0" simplePos="0" relativeHeight="6" behindDoc="0" locked="0" layoutInCell="0" allowOverlap="1">
+            <wp:anchor distT="0" distB="0" distL="0" distR="0" simplePos="0" relativeHeight="11" behindDoc="1" locked="0" layoutInCell="0" allowOverlap="1">
               <wp:simplePos x="0" y="0"/>
               <wp:positionH relativeFrom="margin">
                 <wp:align>center</wp:align>
@@ -5449,32 +5674,38 @@
               <wp:positionV relativeFrom="paragraph">
                 <wp:posOffset>635</wp:posOffset>
               </wp:positionV>
-              <wp:extent cx="78105" cy="146685"/>
+              <wp:extent cx="78105" cy="145415"/>
               <wp:effectExtent l="0" t="0" r="0" b="0"/>
               <wp:wrapSquare wrapText="bothSides"/>
               <wp:docPr id="5" name="Frame4"/>
               <a:graphic xmlns:a="http://schemas.openxmlformats.org/drawingml/2006/main">
                 <a:graphicData uri="http://schemas.microsoft.com/office/word/2010/wordprocessingShape">
                   <wps:wsp>
-                    <wps:cNvSpPr txBox="1"/>
+                    <wps:cNvSpPr/>
                     <wps:spPr>
                       <a:xfrm>
                         <a:off x="0" y="0"/>
-                        <a:ext cx="78105" cy="146685"/>
+                        <a:ext cx="78120" cy="145440"/>
                       </a:xfrm>
-                      <a:prstGeom prst="rect"/>
-                      <a:solidFill>
-                        <a:srgbClr val="FFFFFF">
-                          <a:alpha val="0"/>
-                        </a:srgbClr>
-                      </a:solidFill>
+                      <a:prstGeom prst="rect">
+                        <a:avLst/>
+                      </a:prstGeom>
+                      <a:noFill/>
+                      <a:ln w="0">
+                        <a:noFill/>
+                      </a:ln>
                     </wps:spPr>
+                    <wps:style>
+                      <a:lnRef idx="0"/>
+                      <a:fillRef idx="0"/>
+                      <a:effectRef idx="0"/>
+                      <a:fontRef idx="minor"/>
+                    </wps:style>
                     <wps:txbx>
                       <w:txbxContent>
                         <w:p>
                           <w:pPr>
                             <w:pStyle w:val="Footer"/>
-                            <w:pBdr/>
                             <w:rPr>
                               <w:rStyle w:val="PageNumber"/>
                               <w:sz w:val="20"/>
@@ -5524,7 +5755,7 @@
                         </w:p>
                       </w:txbxContent>
                     </wps:txbx>
-                    <wps:bodyPr anchor="t" lIns="0" tIns="0" rIns="0" bIns="0">
+                    <wps:bodyPr lIns="0" rIns="0" tIns="0" bIns="0" anchor="t">
                       <a:spAutoFit/>
                     </wps:bodyPr>
                   </wps:wsp>
@@ -5535,14 +5766,14 @@
         </mc:Choice>
         <mc:Fallback>
           <w:pict>
-            <v:rect fillcolor="#FFFFFF" style="position:absolute;rotation:-0;width:6.15pt;height:11.55pt;mso-wrap-distance-left:0pt;mso-wrap-distance-right:0pt;mso-wrap-distance-top:0pt;mso-wrap-distance-bottom:0pt;margin-top:0.05pt;mso-position-vertical-relative:text;margin-left:213.8pt;mso-position-horizontal:center;mso-position-horizontal-relative:margin">
-              <v:fill opacity="0f"/>
-              <v:textbox inset="0in,0in,0in,0in">
+            <v:rect id="shape_0" fillcolor="white" stroked="f" o:allowincell="f" style="position:absolute;margin-left:213.75pt;margin-top:0.05pt;width:6.1pt;height:11.4pt;mso-wrap-style:square;v-text-anchor:top;mso-position-horizontal:center;mso-position-horizontal-relative:margin">
+              <v:fill o:detectmouseclick="t" type="solid" color2="black" opacity="0"/>
+              <v:stroke color="#3465a4" joinstyle="round" endcap="flat"/>
+              <v:textbox>
                 <w:txbxContent>
                   <w:p>
                     <w:pPr>
                       <w:pStyle w:val="Footer"/>
-                      <w:pBdr/>
                       <w:rPr>
                         <w:rStyle w:val="PageNumber"/>
                         <w:sz w:val="20"/>
@@ -5602,9 +5833,189 @@
 </w:ftr>
 </file>
 
-<file path=word/footer17.xml><?xml version="1.0" encoding="utf-8"?>
+<file path=word/footer18.xml><?xml version="1.0" encoding="utf-8"?>
 <w:ftr xmlns:o="urn:schemas-microsoft-com:office:office" xmlns:r="http://schemas.openxmlformats.org/officeDocument/2006/relationships" xmlns:v="urn:schemas-microsoft-com:vml" xmlns:w="http://schemas.openxmlformats.org/wordprocessingml/2006/main" xmlns:w10="urn:schemas-microsoft-com:office:word" xmlns:wp="http://schemas.openxmlformats.org/drawingml/2006/wordprocessingDrawing" xmlns:pic="http://schemas.openxmlformats.org/drawingml/2006/picture" xmlns:wps="http://schemas.microsoft.com/office/word/2010/wordprocessingShape" xmlns:wpg="http://schemas.microsoft.com/office/word/2010/wordprocessingGroup" xmlns:mc="http://schemas.openxmlformats.org/markup-compatibility/2006" xmlns:wp14="http://schemas.microsoft.com/office/word/2010/wordprocessingDrawing" xmlns:w14="http://schemas.microsoft.com/office/word/2010/wordml" xmlns:w15="http://schemas.microsoft.com/office/word/2012/wordml" mc:Ignorable="w14 wp14 w15">
-  <w:p/>
+  <w:p>
+    <w:pPr>
+      <w:pStyle w:val="Footer"/>
+      <w:ind w:end="360"/>
+      <w:rPr>
+        <w:b/>
+        <w:sz w:val="20"/>
+      </w:rPr>
+    </w:pPr>
+    <w:r>
+      <w:rPr>
+        <w:b/>
+        <w:sz w:val="20"/>
+      </w:rPr>
+      <mc:AlternateContent>
+        <mc:Choice Requires="wps">
+          <w:drawing>
+            <wp:anchor distT="0" distB="0" distL="0" distR="0" simplePos="0" relativeHeight="11" behindDoc="1" locked="0" layoutInCell="0" allowOverlap="1">
+              <wp:simplePos x="0" y="0"/>
+              <wp:positionH relativeFrom="margin">
+                <wp:align>center</wp:align>
+              </wp:positionH>
+              <wp:positionV relativeFrom="paragraph">
+                <wp:posOffset>635</wp:posOffset>
+              </wp:positionV>
+              <wp:extent cx="78105" cy="145415"/>
+              <wp:effectExtent l="0" t="0" r="0" b="0"/>
+              <wp:wrapSquare wrapText="bothSides"/>
+              <wp:docPr id="6" name="Frame4"/>
+              <a:graphic xmlns:a="http://schemas.openxmlformats.org/drawingml/2006/main">
+                <a:graphicData uri="http://schemas.microsoft.com/office/word/2010/wordprocessingShape">
+                  <wps:wsp>
+                    <wps:cNvSpPr/>
+                    <wps:spPr>
+                      <a:xfrm>
+                        <a:off x="0" y="0"/>
+                        <a:ext cx="78120" cy="145440"/>
+                      </a:xfrm>
+                      <a:prstGeom prst="rect">
+                        <a:avLst/>
+                      </a:prstGeom>
+                      <a:noFill/>
+                      <a:ln w="0">
+                        <a:noFill/>
+                      </a:ln>
+                    </wps:spPr>
+                    <wps:style>
+                      <a:lnRef idx="0"/>
+                      <a:fillRef idx="0"/>
+                      <a:effectRef idx="0"/>
+                      <a:fontRef idx="minor"/>
+                    </wps:style>
+                    <wps:txbx>
+                      <w:txbxContent>
+                        <w:p>
+                          <w:pPr>
+                            <w:pStyle w:val="Footer"/>
+                            <w:rPr>
+                              <w:rStyle w:val="PageNumber"/>
+                              <w:sz w:val="20"/>
+                              <w:szCs w:val="20"/>
+                            </w:rPr>
+                          </w:pPr>
+                          <w:r>
+                            <w:rPr>
+                              <w:rStyle w:val="PageNumber"/>
+                              <w:sz w:val="20"/>
+                              <w:szCs w:val="20"/>
+                            </w:rPr>
+                            <w:fldChar w:fldCharType="begin"/>
+                          </w:r>
+                          <w:r>
+                            <w:rPr>
+                              <w:rStyle w:val="PageNumber"/>
+                              <w:sz w:val="20"/>
+                              <w:szCs w:val="20"/>
+                            </w:rPr>
+                            <w:instrText xml:space="preserve"> PAGE </w:instrText>
+                          </w:r>
+                          <w:r>
+                            <w:rPr>
+                              <w:rStyle w:val="PageNumber"/>
+                              <w:sz w:val="20"/>
+                              <w:szCs w:val="20"/>
+                            </w:rPr>
+                            <w:fldChar w:fldCharType="separate"/>
+                          </w:r>
+                          <w:r>
+                            <w:rPr>
+                              <w:rStyle w:val="PageNumber"/>
+                              <w:sz w:val="20"/>
+                              <w:szCs w:val="20"/>
+                            </w:rPr>
+                            <w:t>E</w:t>
+                          </w:r>
+                          <w:r>
+                            <w:rPr>
+                              <w:rStyle w:val="PageNumber"/>
+                              <w:sz w:val="20"/>
+                              <w:szCs w:val="20"/>
+                            </w:rPr>
+                            <w:fldChar w:fldCharType="end"/>
+                          </w:r>
+                        </w:p>
+                      </w:txbxContent>
+                    </wps:txbx>
+                    <wps:bodyPr lIns="0" rIns="0" tIns="0" bIns="0" anchor="t">
+                      <a:spAutoFit/>
+                    </wps:bodyPr>
+                  </wps:wsp>
+                </a:graphicData>
+              </a:graphic>
+            </wp:anchor>
+          </w:drawing>
+        </mc:Choice>
+        <mc:Fallback>
+          <w:pict>
+            <v:rect id="shape_0" fillcolor="white" stroked="f" o:allowincell="f" style="position:absolute;margin-left:213.75pt;margin-top:0.05pt;width:6.1pt;height:11.4pt;mso-wrap-style:square;v-text-anchor:top;mso-position-horizontal:center;mso-position-horizontal-relative:margin">
+              <v:fill o:detectmouseclick="t" type="solid" color2="black" opacity="0"/>
+              <v:stroke color="#3465a4" joinstyle="round" endcap="flat"/>
+              <v:textbox>
+                <w:txbxContent>
+                  <w:p>
+                    <w:pPr>
+                      <w:pStyle w:val="Footer"/>
+                      <w:rPr>
+                        <w:rStyle w:val="PageNumber"/>
+                        <w:sz w:val="20"/>
+                        <w:szCs w:val="20"/>
+                      </w:rPr>
+                    </w:pPr>
+                    <w:r>
+                      <w:rPr>
+                        <w:rStyle w:val="PageNumber"/>
+                        <w:sz w:val="20"/>
+                        <w:szCs w:val="20"/>
+                      </w:rPr>
+                      <w:fldChar w:fldCharType="begin"/>
+                    </w:r>
+                    <w:r>
+                      <w:rPr>
+                        <w:rStyle w:val="PageNumber"/>
+                        <w:sz w:val="20"/>
+                        <w:szCs w:val="20"/>
+                      </w:rPr>
+                      <w:instrText xml:space="preserve"> PAGE </w:instrText>
+                    </w:r>
+                    <w:r>
+                      <w:rPr>
+                        <w:rStyle w:val="PageNumber"/>
+                        <w:sz w:val="20"/>
+                        <w:szCs w:val="20"/>
+                      </w:rPr>
+                      <w:fldChar w:fldCharType="separate"/>
+                    </w:r>
+                    <w:r>
+                      <w:rPr>
+                        <w:rStyle w:val="PageNumber"/>
+                        <w:sz w:val="20"/>
+                        <w:szCs w:val="20"/>
+                      </w:rPr>
+                      <w:t>E</w:t>
+                    </w:r>
+                    <w:r>
+                      <w:rPr>
+                        <w:rStyle w:val="PageNumber"/>
+                        <w:sz w:val="20"/>
+                        <w:szCs w:val="20"/>
+                      </w:rPr>
+                      <w:fldChar w:fldCharType="end"/>
+                    </w:r>
+                  </w:p>
+                </w:txbxContent>
+              </v:textbox>
+              <w10:wrap type="square"/>
+            </v:rect>
+          </w:pict>
+        </mc:Fallback>
+      </mc:AlternateContent>
+    </w:r>
+  </w:p>
 </w:ftr>
 </file>
 
@@ -5622,12 +6033,10 @@
       <w:rPr>
         <w:sz w:val="20"/>
       </w:rPr>
-    </w:r>
-    <w:r>
       <mc:AlternateContent>
         <mc:Choice Requires="wps">
           <w:drawing>
-            <wp:anchor distT="0" distB="0" distL="0" distR="0" simplePos="0" relativeHeight="3" behindDoc="0" locked="0" layoutInCell="0" allowOverlap="1">
+            <wp:anchor distT="0" distB="0" distL="0" distR="0" simplePos="0" relativeHeight="2" behindDoc="1" locked="0" layoutInCell="0" allowOverlap="1">
               <wp:simplePos x="0" y="0"/>
               <wp:positionH relativeFrom="margin">
                 <wp:align>center</wp:align>
@@ -5635,32 +6044,38 @@
               <wp:positionV relativeFrom="paragraph">
                 <wp:posOffset>635</wp:posOffset>
               </wp:positionV>
-              <wp:extent cx="101600" cy="175260"/>
+              <wp:extent cx="101600" cy="173990"/>
               <wp:effectExtent l="0" t="0" r="0" b="0"/>
               <wp:wrapSquare wrapText="bothSides"/>
               <wp:docPr id="2" name="Frame2"/>
               <a:graphic xmlns:a="http://schemas.openxmlformats.org/drawingml/2006/main">
                 <a:graphicData uri="http://schemas.microsoft.com/office/word/2010/wordprocessingShape">
                   <wps:wsp>
-                    <wps:cNvSpPr txBox="1"/>
+                    <wps:cNvSpPr/>
                     <wps:spPr>
                       <a:xfrm>
                         <a:off x="0" y="0"/>
-                        <a:ext cx="101600" cy="175260"/>
+                        <a:ext cx="101520" cy="173880"/>
                       </a:xfrm>
-                      <a:prstGeom prst="rect"/>
-                      <a:solidFill>
-                        <a:srgbClr val="FFFFFF">
-                          <a:alpha val="0"/>
-                        </a:srgbClr>
-                      </a:solidFill>
+                      <a:prstGeom prst="rect">
+                        <a:avLst/>
+                      </a:prstGeom>
+                      <a:noFill/>
+                      <a:ln w="0">
+                        <a:noFill/>
+                      </a:ln>
                     </wps:spPr>
+                    <wps:style>
+                      <a:lnRef idx="0"/>
+                      <a:fillRef idx="0"/>
+                      <a:effectRef idx="0"/>
+                      <a:fontRef idx="minor"/>
+                    </wps:style>
                     <wps:txbx>
                       <w:txbxContent>
                         <w:p>
                           <w:pPr>
                             <w:pStyle w:val="Footer"/>
-                            <w:pBdr/>
                             <w:rPr>
                               <w:rStyle w:val="PageNumber"/>
                             </w:rPr>
@@ -5698,7 +6113,7 @@
                         </w:p>
                       </w:txbxContent>
                     </wps:txbx>
-                    <wps:bodyPr anchor="t" lIns="0" tIns="0" rIns="0" bIns="0">
+                    <wps:bodyPr lIns="0" rIns="0" tIns="0" bIns="0" anchor="t">
                       <a:spAutoFit/>
                     </wps:bodyPr>
                   </wps:wsp>
@@ -5709,14 +6124,14 @@
         </mc:Choice>
         <mc:Fallback>
           <w:pict>
-            <v:rect fillcolor="#FFFFFF" style="position:absolute;rotation:-0;width:8pt;height:13.8pt;mso-wrap-distance-left:0pt;mso-wrap-distance-right:0pt;mso-wrap-distance-top:0pt;mso-wrap-distance-bottom:0pt;margin-top:0.05pt;mso-position-vertical-relative:text;margin-left:203.65pt;mso-position-horizontal:center;mso-position-horizontal-relative:margin">
-              <v:fill opacity="0f"/>
-              <v:textbox inset="0in,0in,0in,0in">
+            <v:rect id="shape_0" fillcolor="white" stroked="f" o:allowincell="f" style="position:absolute;margin-left:203.65pt;margin-top:0.05pt;width:7.95pt;height:13.65pt;mso-wrap-style:square;v-text-anchor:top;mso-position-horizontal:center;mso-position-horizontal-relative:margin">
+              <v:fill o:detectmouseclick="t" type="solid" color2="black" opacity="0"/>
+              <v:stroke color="#3465a4" joinstyle="round" endcap="flat"/>
+              <v:textbox>
                 <w:txbxContent>
                   <w:p>
                     <w:pPr>
                       <w:pStyle w:val="Footer"/>
-                      <w:pBdr/>
                       <w:rPr>
                         <w:rStyle w:val="PageNumber"/>
                       </w:rPr>
@@ -6072,7 +6487,71 @@
 
 <file path=word/header11.xml><?xml version="1.0" encoding="utf-8"?>
 <w:hdr xmlns:o="urn:schemas-microsoft-com:office:office" xmlns:r="http://schemas.openxmlformats.org/officeDocument/2006/relationships" xmlns:v="urn:schemas-microsoft-com:vml" xmlns:w="http://schemas.openxmlformats.org/wordprocessingml/2006/main" xmlns:w10="urn:schemas-microsoft-com:office:word" xmlns:wp="http://schemas.openxmlformats.org/drawingml/2006/wordprocessingDrawing" xmlns:pic="http://schemas.openxmlformats.org/drawingml/2006/picture" xmlns:wps="http://schemas.microsoft.com/office/word/2010/wordprocessingShape" xmlns:wpg="http://schemas.microsoft.com/office/word/2010/wordprocessingGroup" xmlns:mc="http://schemas.openxmlformats.org/markup-compatibility/2006" xmlns:wp14="http://schemas.microsoft.com/office/word/2010/wordprocessingDrawing" xmlns:w14="http://schemas.microsoft.com/office/word/2010/wordml" xmlns:w15="http://schemas.microsoft.com/office/word/2012/wordml" mc:Ignorable="w14 wp14 w15">
-  <w:p/>
+  <w:p>
+    <w:pPr>
+      <w:pStyle w:val="Header"/>
+      <w:rPr/>
+    </w:pPr>
+    <w:r>
+      <w:rPr/>
+    </w:r>
+  </w:p>
+</w:hdr>
+</file>
+
+<file path=word/header12.xml><?xml version="1.0" encoding="utf-8"?>
+<w:hdr xmlns:o="urn:schemas-microsoft-com:office:office" xmlns:r="http://schemas.openxmlformats.org/officeDocument/2006/relationships" xmlns:v="urn:schemas-microsoft-com:vml" xmlns:w="http://schemas.openxmlformats.org/wordprocessingml/2006/main" xmlns:w10="urn:schemas-microsoft-com:office:word" xmlns:wp="http://schemas.openxmlformats.org/drawingml/2006/wordprocessingDrawing" xmlns:pic="http://schemas.openxmlformats.org/drawingml/2006/picture" xmlns:wps="http://schemas.microsoft.com/office/word/2010/wordprocessingShape" xmlns:wpg="http://schemas.microsoft.com/office/word/2010/wordprocessingGroup" xmlns:mc="http://schemas.openxmlformats.org/markup-compatibility/2006" xmlns:wp14="http://schemas.microsoft.com/office/word/2010/wordprocessingDrawing" xmlns:w14="http://schemas.microsoft.com/office/word/2010/wordml" xmlns:w15="http://schemas.microsoft.com/office/word/2012/wordml" mc:Ignorable="w14 wp14 w15">
+  <w:p>
+    <w:pPr>
+      <w:pStyle w:val="Header"/>
+      <w:rPr/>
+    </w:pPr>
+    <w:r>
+      <w:rPr/>
+    </w:r>
+  </w:p>
+</w:hdr>
+</file>
+
+<file path=word/header13.xml><?xml version="1.0" encoding="utf-8"?>
+<w:hdr xmlns:o="urn:schemas-microsoft-com:office:office" xmlns:r="http://schemas.openxmlformats.org/officeDocument/2006/relationships" xmlns:v="urn:schemas-microsoft-com:vml" xmlns:w="http://schemas.openxmlformats.org/wordprocessingml/2006/main" xmlns:w10="urn:schemas-microsoft-com:office:word" xmlns:wp="http://schemas.openxmlformats.org/drawingml/2006/wordprocessingDrawing" xmlns:pic="http://schemas.openxmlformats.org/drawingml/2006/picture" xmlns:wps="http://schemas.microsoft.com/office/word/2010/wordprocessingShape" xmlns:wpg="http://schemas.microsoft.com/office/word/2010/wordprocessingGroup" xmlns:mc="http://schemas.openxmlformats.org/markup-compatibility/2006" xmlns:wp14="http://schemas.microsoft.com/office/word/2010/wordprocessingDrawing" xmlns:w14="http://schemas.microsoft.com/office/word/2010/wordml" xmlns:w15="http://schemas.microsoft.com/office/word/2012/wordml" mc:Ignorable="w14 wp14 w15">
+  <w:p>
+    <w:pPr>
+      <w:pStyle w:val="Header"/>
+      <w:rPr/>
+    </w:pPr>
+    <w:r>
+      <w:rPr/>
+    </w:r>
+  </w:p>
+</w:hdr>
+</file>
+
+<file path=word/header14.xml><?xml version="1.0" encoding="utf-8"?>
+<w:hdr xmlns:o="urn:schemas-microsoft-com:office:office" xmlns:r="http://schemas.openxmlformats.org/officeDocument/2006/relationships" xmlns:v="urn:schemas-microsoft-com:vml" xmlns:w="http://schemas.openxmlformats.org/wordprocessingml/2006/main" xmlns:w10="urn:schemas-microsoft-com:office:word" xmlns:wp="http://schemas.openxmlformats.org/drawingml/2006/wordprocessingDrawing" xmlns:pic="http://schemas.openxmlformats.org/drawingml/2006/picture" xmlns:wps="http://schemas.microsoft.com/office/word/2010/wordprocessingShape" xmlns:wpg="http://schemas.microsoft.com/office/word/2010/wordprocessingGroup" xmlns:mc="http://schemas.openxmlformats.org/markup-compatibility/2006" xmlns:wp14="http://schemas.microsoft.com/office/word/2010/wordprocessingDrawing" xmlns:w14="http://schemas.microsoft.com/office/word/2010/wordml" xmlns:w15="http://schemas.microsoft.com/office/word/2012/wordml" mc:Ignorable="w14 wp14 w15">
+  <w:p>
+    <w:pPr>
+      <w:pStyle w:val="Header"/>
+      <w:rPr/>
+    </w:pPr>
+    <w:r>
+      <w:rPr/>
+    </w:r>
+  </w:p>
+</w:hdr>
+</file>
+
+<file path=word/header15.xml><?xml version="1.0" encoding="utf-8"?>
+<w:hdr xmlns:o="urn:schemas-microsoft-com:office:office" xmlns:r="http://schemas.openxmlformats.org/officeDocument/2006/relationships" xmlns:v="urn:schemas-microsoft-com:vml" xmlns:w="http://schemas.openxmlformats.org/wordprocessingml/2006/main" xmlns:w10="urn:schemas-microsoft-com:office:word" xmlns:wp="http://schemas.openxmlformats.org/drawingml/2006/wordprocessingDrawing" xmlns:pic="http://schemas.openxmlformats.org/drawingml/2006/picture" xmlns:wps="http://schemas.microsoft.com/office/word/2010/wordprocessingShape" xmlns:wpg="http://schemas.microsoft.com/office/word/2010/wordprocessingGroup" xmlns:mc="http://schemas.openxmlformats.org/markup-compatibility/2006" xmlns:wp14="http://schemas.microsoft.com/office/word/2010/wordprocessingDrawing" xmlns:w14="http://schemas.microsoft.com/office/word/2010/wordml" xmlns:w15="http://schemas.microsoft.com/office/word/2012/wordml" mc:Ignorable="w14 wp14 w15">
+  <w:p>
+    <w:pPr>
+      <w:pStyle w:val="Header"/>
+      <w:rPr/>
+    </w:pPr>
+    <w:r>
+      <w:rPr/>
+    </w:r>
+  </w:p>
 </w:hdr>
 </file>
 
@@ -6120,7 +6599,15 @@
 
 <file path=word/header5.xml><?xml version="1.0" encoding="utf-8"?>
 <w:hdr xmlns:o="urn:schemas-microsoft-com:office:office" xmlns:r="http://schemas.openxmlformats.org/officeDocument/2006/relationships" xmlns:v="urn:schemas-microsoft-com:vml" xmlns:w="http://schemas.openxmlformats.org/wordprocessingml/2006/main" xmlns:w10="urn:schemas-microsoft-com:office:word" xmlns:wp="http://schemas.openxmlformats.org/drawingml/2006/wordprocessingDrawing" xmlns:pic="http://schemas.openxmlformats.org/drawingml/2006/picture" xmlns:wps="http://schemas.microsoft.com/office/word/2010/wordprocessingShape" xmlns:wpg="http://schemas.microsoft.com/office/word/2010/wordprocessingGroup" xmlns:mc="http://schemas.openxmlformats.org/markup-compatibility/2006" xmlns:wp14="http://schemas.microsoft.com/office/word/2010/wordprocessingDrawing" xmlns:w14="http://schemas.microsoft.com/office/word/2010/wordml" xmlns:w15="http://schemas.microsoft.com/office/word/2012/wordml" mc:Ignorable="w14 wp14 w15">
-  <w:p/>
+  <w:p>
+    <w:pPr>
+      <w:pStyle w:val="Header"/>
+      <w:rPr/>
+    </w:pPr>
+    <w:r>
+      <w:rPr/>
+    </w:r>
+  </w:p>
 </w:hdr>
 </file>
 
@@ -6140,7 +6627,15 @@
 
 <file path=word/header7.xml><?xml version="1.0" encoding="utf-8"?>
 <w:hdr xmlns:o="urn:schemas-microsoft-com:office:office" xmlns:r="http://schemas.openxmlformats.org/officeDocument/2006/relationships" xmlns:v="urn:schemas-microsoft-com:vml" xmlns:w="http://schemas.openxmlformats.org/wordprocessingml/2006/main" xmlns:w10="urn:schemas-microsoft-com:office:word" xmlns:wp="http://schemas.openxmlformats.org/drawingml/2006/wordprocessingDrawing" xmlns:pic="http://schemas.openxmlformats.org/drawingml/2006/picture" xmlns:wps="http://schemas.microsoft.com/office/word/2010/wordprocessingShape" xmlns:wpg="http://schemas.microsoft.com/office/word/2010/wordprocessingGroup" xmlns:mc="http://schemas.openxmlformats.org/markup-compatibility/2006" xmlns:wp14="http://schemas.microsoft.com/office/word/2010/wordprocessingDrawing" xmlns:w14="http://schemas.microsoft.com/office/word/2010/wordml" xmlns:w15="http://schemas.microsoft.com/office/word/2012/wordml" mc:Ignorable="w14 wp14 w15">
-  <w:p/>
+  <w:p>
+    <w:pPr>
+      <w:pStyle w:val="Header"/>
+      <w:rPr/>
+    </w:pPr>
+    <w:r>
+      <w:rPr/>
+    </w:r>
+  </w:p>
 </w:hdr>
 </file>
 
@@ -6160,7 +6655,15 @@
 
 <file path=word/header9.xml><?xml version="1.0" encoding="utf-8"?>
 <w:hdr xmlns:o="urn:schemas-microsoft-com:office:office" xmlns:r="http://schemas.openxmlformats.org/officeDocument/2006/relationships" xmlns:v="urn:schemas-microsoft-com:vml" xmlns:w="http://schemas.openxmlformats.org/wordprocessingml/2006/main" xmlns:w10="urn:schemas-microsoft-com:office:word" xmlns:wp="http://schemas.openxmlformats.org/drawingml/2006/wordprocessingDrawing" xmlns:pic="http://schemas.openxmlformats.org/drawingml/2006/picture" xmlns:wps="http://schemas.microsoft.com/office/word/2010/wordprocessingShape" xmlns:wpg="http://schemas.microsoft.com/office/word/2010/wordprocessingGroup" xmlns:mc="http://schemas.openxmlformats.org/markup-compatibility/2006" xmlns:wp14="http://schemas.microsoft.com/office/word/2010/wordprocessingDrawing" xmlns:w14="http://schemas.microsoft.com/office/word/2010/wordml" xmlns:w15="http://schemas.microsoft.com/office/word/2012/wordml" mc:Ignorable="w14 wp14 w15">
-  <w:p/>
+  <w:p>
+    <w:pPr>
+      <w:pStyle w:val="Header"/>
+      <w:rPr/>
+    </w:pPr>
+    <w:r>
+      <w:rPr/>
+    </w:r>
+  </w:p>
 </w:hdr>
 </file>
 
@@ -6542,7 +7045,7 @@
   <w:docDefaults>
     <w:rPrDefault>
       <w:rPr>
-        <w:rFonts w:ascii="Cambria" w:hAnsi="Cambria" w:eastAsia="ＭＳ 明朝" w:cs="" w:asciiTheme="minorHAnsi" w:cstheme="minorBidi" w:eastAsiaTheme="minorEastAsia" w:hAnsiTheme="minorHAnsi"/>
+        <w:rFonts w:ascii="Cambria" w:hAnsi="Cambria" w:eastAsia="" w:cs="" w:asciiTheme="minorHAnsi" w:cstheme="minorBidi" w:eastAsiaTheme="minorEastAsia" w:hAnsiTheme="minorHAnsi"/>
         <w:sz w:val="24"/>
         <w:szCs w:val="24"/>
         <w:lang w:val="en-GB" w:eastAsia="en-US" w:bidi="ar-SA"/>
@@ -6929,6 +7432,7 @@
     <w:rsid w:val="008c4c3a"/>
     <w:pPr>
       <w:widowControl/>
+      <w:suppressAutoHyphens w:val="true"/>
       <w:bidi w:val="0"/>
       <w:spacing w:before="0" w:after="0"/>
       <w:jc w:val="start"/>
@@ -6939,7 +7443,7 @@
       <w:kern w:val="0"/>
       <w:sz w:val="24"/>
       <w:szCs w:val="24"/>
-      <w:lang w:eastAsia="en-GB" w:val="en-GB" w:bidi="ar-SA"/>
+      <w:lang w:val="en-GB" w:eastAsia="en-GB" w:bidi="ar-SA"/>
     </w:rPr>
   </w:style>
   <w:style w:type="paragraph" w:styleId="Heading1">
@@ -6956,7 +7460,7 @@
       <w:outlineLvl w:val="0"/>
     </w:pPr>
     <w:rPr>
-      <w:rFonts w:ascii="Calibri" w:hAnsi="Calibri" w:eastAsia="ＭＳ ゴシック" w:cs="" w:asciiTheme="majorHAnsi" w:cstheme="majorBidi" w:eastAsiaTheme="majorEastAsia" w:hAnsiTheme="majorHAnsi"/>
+      <w:rFonts w:ascii="Calibri" w:hAnsi="Calibri" w:eastAsia="" w:cs="" w:asciiTheme="majorHAnsi" w:cstheme="majorBidi" w:eastAsiaTheme="majorEastAsia" w:hAnsiTheme="majorHAnsi"/>
       <w:b/>
       <w:bCs/>
       <w:color w:themeColor="accent1" w:themeShade="b5" w:val="345A8A"/>
@@ -6980,7 +7484,7 @@
       <w:outlineLvl w:val="1"/>
     </w:pPr>
     <w:rPr>
-      <w:rFonts w:ascii="Calibri" w:hAnsi="Calibri" w:eastAsia="ＭＳ ゴシック" w:cs="" w:asciiTheme="majorHAnsi" w:cstheme="majorBidi" w:eastAsiaTheme="majorEastAsia" w:hAnsiTheme="majorHAnsi"/>
+      <w:rFonts w:ascii="Calibri" w:hAnsi="Calibri" w:eastAsia="" w:cs="" w:asciiTheme="majorHAnsi" w:cstheme="majorBidi" w:eastAsiaTheme="majorEastAsia" w:hAnsiTheme="majorHAnsi"/>
       <w:color w:themeColor="accent1" w:themeShade="bf" w:val="365F91"/>
       <w:sz w:val="26"/>
       <w:szCs w:val="26"/>
@@ -7002,7 +7506,7 @@
       <w:outlineLvl w:val="2"/>
     </w:pPr>
     <w:rPr>
-      <w:rFonts w:ascii="Calibri" w:hAnsi="Calibri" w:eastAsia="ＭＳ ゴシック" w:cs="" w:asciiTheme="majorHAnsi" w:cstheme="majorBidi" w:eastAsiaTheme="majorEastAsia" w:hAnsiTheme="majorHAnsi"/>
+      <w:rFonts w:ascii="Calibri" w:hAnsi="Calibri" w:eastAsia="" w:cs="" w:asciiTheme="majorHAnsi" w:cstheme="majorBidi" w:eastAsiaTheme="majorEastAsia" w:hAnsiTheme="majorHAnsi"/>
       <w:color w:themeColor="accent1" w:themeShade="7f" w:val="243F60"/>
     </w:rPr>
   </w:style>
@@ -7021,7 +7525,7 @@
     <w:qFormat/>
     <w:rsid w:val="008c4c3a"/>
     <w:rPr>
-      <w:rFonts w:ascii="Calibri" w:hAnsi="Calibri" w:eastAsia="ＭＳ ゴシック" w:cs="" w:asciiTheme="majorHAnsi" w:cstheme="majorBidi" w:eastAsiaTheme="majorEastAsia" w:hAnsiTheme="majorHAnsi"/>
+      <w:rFonts w:ascii="Calibri" w:hAnsi="Calibri" w:eastAsia="" w:cs="" w:asciiTheme="majorHAnsi" w:cstheme="majorBidi" w:eastAsiaTheme="majorEastAsia" w:hAnsiTheme="majorHAnsi"/>
       <w:b/>
       <w:bCs/>
       <w:color w:themeColor="accent1" w:themeShade="b5" w:val="345A8A"/>
@@ -7075,7 +7579,7 @@
     <w:qFormat/>
     <w:rsid w:val="008c4c3a"/>
     <w:rPr>
-      <w:rFonts w:ascii="Calibri" w:hAnsi="Calibri" w:eastAsia="ＭＳ ゴシック" w:cs="" w:asciiTheme="majorHAnsi" w:cstheme="majorBidi" w:eastAsiaTheme="majorEastAsia" w:hAnsiTheme="majorHAnsi"/>
+      <w:rFonts w:ascii="Calibri" w:hAnsi="Calibri" w:eastAsia="" w:cs="" w:asciiTheme="majorHAnsi" w:cstheme="majorBidi" w:eastAsiaTheme="majorEastAsia" w:hAnsiTheme="majorHAnsi"/>
       <w:color w:themeColor="text2" w:themeShade="bf" w:val="17365D"/>
       <w:spacing w:val="5"/>
       <w:kern w:val="2"/>
@@ -7107,7 +7611,7 @@
     <w:qFormat/>
     <w:rsid w:val="009779a2"/>
     <w:rPr>
-      <w:rFonts w:ascii="Calibri" w:hAnsi="Calibri" w:eastAsia="ＭＳ ゴシック" w:cs="" w:asciiTheme="majorHAnsi" w:cstheme="majorBidi" w:eastAsiaTheme="majorEastAsia" w:hAnsiTheme="majorHAnsi"/>
+      <w:rFonts w:ascii="Calibri" w:hAnsi="Calibri" w:eastAsia="" w:cs="" w:asciiTheme="majorHAnsi" w:cstheme="majorBidi" w:eastAsiaTheme="majorEastAsia" w:hAnsiTheme="majorHAnsi"/>
       <w:color w:themeColor="accent1" w:themeShade="bf" w:val="365F91"/>
       <w:sz w:val="26"/>
       <w:szCs w:val="26"/>
@@ -7122,7 +7626,7 @@
     <w:qFormat/>
     <w:rsid w:val="009779a2"/>
     <w:rPr>
-      <w:rFonts w:ascii="Calibri" w:hAnsi="Calibri" w:eastAsia="ＭＳ ゴシック" w:cs="" w:asciiTheme="majorHAnsi" w:cstheme="majorBidi" w:eastAsiaTheme="majorEastAsia" w:hAnsiTheme="majorHAnsi"/>
+      <w:rFonts w:ascii="Calibri" w:hAnsi="Calibri" w:eastAsia="" w:cs="" w:asciiTheme="majorHAnsi" w:cstheme="majorBidi" w:eastAsiaTheme="majorEastAsia" w:hAnsiTheme="majorHAnsi"/>
       <w:color w:themeColor="accent1" w:themeShade="7f" w:val="243F60"/>
       <w:lang w:eastAsia="en-GB"/>
     </w:rPr>
@@ -7449,7 +7953,7 @@
       <w:contextualSpacing/>
     </w:pPr>
     <w:rPr>
-      <w:rFonts w:ascii="Calibri" w:hAnsi="Calibri" w:eastAsia="ＭＳ ゴシック" w:cs="" w:asciiTheme="majorHAnsi" w:cstheme="majorBidi" w:eastAsiaTheme="majorEastAsia" w:hAnsiTheme="majorHAnsi"/>
+      <w:rFonts w:ascii="Calibri" w:hAnsi="Calibri" w:eastAsia="" w:cs="" w:asciiTheme="majorHAnsi" w:cstheme="majorBidi" w:eastAsiaTheme="majorEastAsia" w:hAnsiTheme="majorHAnsi"/>
       <w:color w:themeColor="text2" w:themeShade="bf" w:val="17365D"/>
       <w:spacing w:val="5"/>
       <w:kern w:val="2"/>
@@ -7684,6 +8188,13 @@
       <w:szCs w:val="20"/>
     </w:rPr>
   </w:style>
+  <w:style w:type="paragraph" w:styleId="FrameContentsuser">
+    <w:name w:val="Frame Contents (user)"/>
+    <w:basedOn w:val="Normal"/>
+    <w:qFormat/>
+    <w:pPr/>
+    <w:rPr/>
+  </w:style>
   <w:style w:type="paragraph" w:styleId="FrameContents">
     <w:name w:val="Frame Contents"/>
     <w:basedOn w:val="Normal"/>

</xml_diff>

<commit_message>
feat: ScriptEditor Widget Progress
The ScriptEditor widget has formatting rules added.
</commit_message>
<xml_diff>
--- a/Documentation/report_2/COM629_DIS_AE2_Oliver_Myers.docx
+++ b/Documentation/report_2/COM629_DIS_AE2_Oliver_Myers.docx
@@ -570,7 +570,27 @@
           <w:iCs/>
           <w:color w:val="FF0000"/>
         </w:rPr>
-        <w:t>Write a paragraph here acknowledging everyone who has helped you while you have been preparing the content of your dissertation. This may be your supervisor or other academic staff who have provided guidance and support, other students or colleagues you have worked with on any research or project work, interviewees, librarians, or any external bodies that have given you assistance, such as access to data or opportunities for hands-on experience.</w:t>
+        <w:t xml:space="preserve">Write a paragraph here acknowledging everyone who has helped you while you have been preparing the content of your dissertation. This may be your supervisor or other academic staff who have provided guidance and support, other students or colleagues you have worked with on any research or project work, interviewees, librarians, or any external bodies that have given </w:t>
+      </w:r>
+      <w:proofErr w:type="spellStart"/>
+      <w:r>
+        <w:rPr>
+          <w:rFonts w:cs="Arial"/>
+          <w:i w:val="0"/>
+          <w:iCs/>
+          <w:color w:val="FF0000"/>
+        </w:rPr>
+        <w:t>you</w:t>
+      </w:r>
+      <w:proofErr w:type="spellEnd"/>
+      <w:r>
+        <w:rPr>
+          <w:rFonts w:cs="Arial"/>
+          <w:i w:val="0"/>
+          <w:iCs/>
+          <w:color w:val="FF0000"/>
+        </w:rPr>
+        <w:t xml:space="preserve"> assistance, such as access to data or opportunities for hands-on experience.</w:t>
       </w:r>
     </w:p>
     <w:p>
@@ -7496,11 +7516,50 @@
     </w:p>
     <w:p>
       <w:r>
-        <w:t xml:space="preserve">The ScriptViewModel acts as a bridge between the services layer and the view layer . It receives a non-owning ScriptManager pointer through its constructor as a dependency injection to avoid hidden dependencies and keeps each class testable in isolation. A raw pointer is used over a unique pointer as ScriptViewModel does not own ScriptManager. </w:t>
+        <w:t>ScriptViewModel sits at the centre of the applications architecture mediating between the services layer and the view layer. Its design reflects two core principles:</w:t>
+      </w:r>
+    </w:p>
+    <w:p>
+      <w:pPr>
+        <w:pStyle w:val="ListParagraph"/>
+        <w:numPr>
+          <w:ilvl w:val="0"/>
+          <w:numId w:val="4"/>
+        </w:numPr>
+      </w:pPr>
+      <w:r>
+        <w:t>The MVVM boundary must be preserved.</w:t>
+      </w:r>
+    </w:p>
+    <w:p>
+      <w:pPr>
+        <w:pStyle w:val="ListParagraph"/>
+        <w:numPr>
+          <w:ilvl w:val="0"/>
+          <w:numId w:val="4"/>
+        </w:numPr>
+      </w:pPr>
+      <w:r>
+        <w:t>Dependencies should be injected rather than called internally.</w:t>
+      </w:r>
+    </w:p>
+    <w:p>
+      <w:r>
+        <w:t xml:space="preserve">A design challenge arose in determining how ScriptManager’s state changes would reach the view. The straightforward approach </w:t>
+      </w:r>
+      <w:r>
+        <w:t>was connecting ScriptManager’s signals to slots in the view layer, but this would violate the MVVM boundary. Instead ScriptViewModel’s constructor connects to ScriptManager’s signals internally and emits view facing signals in response. This keeps the boundary layer intact regardless of how the service layer evolves.</w:t>
       </w:r>
     </w:p>
     <w:p/>
     <w:p>
+      <w:r>
+        <w:lastRenderedPageBreak/>
+        <w:t xml:space="preserve">Tab key element type cycling is handled here rather than in ScriptEditor because it is a rule about screenplay structure and not a UI concern. </w:t>
+      </w:r>
+    </w:p>
+    <w:p/>
+    <w:p>
       <w:pPr>
         <w:pStyle w:val="Heading2"/>
       </w:pPr>
@@ -7519,28 +7578,92 @@
         <w:t>4.6.1 ScriptEditor</w:t>
       </w:r>
     </w:p>
+    <w:p>
+      <w:r>
+        <w:t xml:space="preserve">ScriptEditor subclasses QTextEdit to gain direct access to the key event system and the document cursor. Formatting is applied in two layers using Qt’s QTextBlockFormat and QTextCharFormat. Block format controls paragraph level indentation and alignment according to the industry standard measurements established in the literature survey. Char format controls capitalisation and font styling per element type. </w:t>
+      </w:r>
+    </w:p>
     <w:p/>
     <w:p>
-      <w:pPr>
-        <w:rPr>
-          <w:color w:val="EE0000"/>
-        </w:rPr>
-      </w:pPr>
-      <w:r>
-        <w:rPr>
-          <w:color w:val="EE0000"/>
-        </w:rPr>
-        <w:t>IMAGE: Screenshot showing formatted screenplay elements.</w:t>
+      <w:r>
+        <w:t xml:space="preserve">The capitalisation of certain elements is applied visually using QFont::AllUppercase rather than modifying the underlying string. This means the OSF serializer always stores the text as it is typed rather than in its display form. </w:t>
       </w:r>
     </w:p>
     <w:p/>
     <w:p>
-      <w:pPr>
-        <w:pStyle w:val="Heading3"/>
-      </w:pPr>
-      <w:r>
-        <w:lastRenderedPageBreak/>
-        <w:t>4.6.2 SceneNavigator</w:t>
+      <w:r>
+        <w:t>Key presses are intercepted by overriding keyPressEvent. When Tab and Enter are pressed they are reported to the ViewModel which applies the logic of element type transitions. All other keys pass through QTextEdit normally.</w:t>
+      </w:r>
+    </w:p>
+    <w:p>
+      <w:r>
+        <w:rPr>
+          <w:noProof/>
+        </w:rPr>
+        <w:drawing>
+          <wp:anchor distT="0" distB="0" distL="114300" distR="114300" simplePos="0" relativeHeight="251659264" behindDoc="0" locked="0" layoutInCell="1" allowOverlap="1" wp14:anchorId="0758CF64" wp14:editId="3673108F">
+            <wp:simplePos x="0" y="0"/>
+            <wp:positionH relativeFrom="page">
+              <wp:align>center</wp:align>
+            </wp:positionH>
+            <wp:positionV relativeFrom="paragraph">
+              <wp:posOffset>259080</wp:posOffset>
+            </wp:positionV>
+            <wp:extent cx="5495925" cy="3371850"/>
+            <wp:effectExtent l="19050" t="19050" r="28575" b="19050"/>
+            <wp:wrapTopAndBottom/>
+            <wp:docPr id="2089189412" name="Picture 8"/>
+            <wp:cNvGraphicFramePr>
+              <a:graphicFrameLocks xmlns:a="http://schemas.openxmlformats.org/drawingml/2006/main" noChangeAspect="1"/>
+            </wp:cNvGraphicFramePr>
+            <a:graphic xmlns:a="http://schemas.openxmlformats.org/drawingml/2006/main">
+              <a:graphicData uri="http://schemas.openxmlformats.org/drawingml/2006/picture">
+                <pic:pic xmlns:pic="http://schemas.openxmlformats.org/drawingml/2006/picture">
+                  <pic:nvPicPr>
+                    <pic:cNvPr id="0" name="Picture 2"/>
+                    <pic:cNvPicPr>
+                      <a:picLocks noChangeAspect="1" noChangeArrowheads="1"/>
+                    </pic:cNvPicPr>
+                  </pic:nvPicPr>
+                  <pic:blipFill>
+                    <a:blip r:embed="rId17">
+                      <a:extLst>
+                        <a:ext uri="{28A0092B-C50C-407E-A947-70E740481C1C}">
+                          <a14:useLocalDpi xmlns:a14="http://schemas.microsoft.com/office/drawing/2010/main" val="0"/>
+                        </a:ext>
+                      </a:extLst>
+                    </a:blip>
+                    <a:srcRect/>
+                    <a:stretch>
+                      <a:fillRect/>
+                    </a:stretch>
+                  </pic:blipFill>
+                  <pic:spPr bwMode="auto">
+                    <a:xfrm>
+                      <a:off x="0" y="0"/>
+                      <a:ext cx="5495925" cy="3371850"/>
+                    </a:xfrm>
+                    <a:prstGeom prst="rect">
+                      <a:avLst/>
+                    </a:prstGeom>
+                    <a:noFill/>
+                    <a:ln>
+                      <a:solidFill>
+                        <a:schemeClr val="tx1"/>
+                      </a:solidFill>
+                    </a:ln>
+                  </pic:spPr>
+                </pic:pic>
+              </a:graphicData>
+            </a:graphic>
+            <wp14:sizeRelH relativeFrom="page">
+              <wp14:pctWidth>0</wp14:pctWidth>
+            </wp14:sizeRelH>
+            <wp14:sizeRelV relativeFrom="page">
+              <wp14:pctHeight>0</wp14:pctHeight>
+            </wp14:sizeRelV>
+          </wp:anchor>
+        </w:drawing>
       </w:r>
     </w:p>
     <w:p/>
@@ -7550,13 +7673,23 @@
         <w:pStyle w:val="Heading3"/>
       </w:pPr>
       <w:r>
-        <w:t>4.6.3 MainWindow</w:t>
+        <w:t>4.6.2 SceneNavigator</w:t>
       </w:r>
     </w:p>
     <w:p/>
     <w:p/>
     <w:p>
       <w:pPr>
+        <w:pStyle w:val="Heading3"/>
+      </w:pPr>
+      <w:r>
+        <w:t>4.6.3 MainWindow</w:t>
+      </w:r>
+    </w:p>
+    <w:p/>
+    <w:p/>
+    <w:p>
+      <w:pPr>
         <w:rPr>
           <w:color w:val="EE0000"/>
         </w:rPr>
@@ -7590,7 +7723,23 @@
     </w:p>
     <w:p>
       <w:r>
-        <w:t xml:space="preserve">Unit Tests were written using Qt Test which is Qt’s built in testing framework. This integrates directly with Qt Creator and CMake. A separate test target “tst_modellayer” was configured in a dedicated tests directory with its own “CMakeLists.txt”. There are additional test targets for different layer testing. The model source files are compiled directly into the test executable using “target_sources”. “CMAKE_AUTOMOC” is enabled in the test CMake configuration to allow Qt’s meta object compiler to process the test class, which is required for the Q_OBJECT macro used by Qt Test’s test runner. </w:t>
+        <w:t>Unit Tests were written using Qt Test which is Qt’s built in testing framework. This integrates directly with Qt Creator and CMake. A separate test target “</w:t>
+      </w:r>
+      <w:proofErr w:type="spellStart"/>
+      <w:r>
+        <w:t>tst_modellayer</w:t>
+      </w:r>
+      <w:proofErr w:type="spellEnd"/>
+      <w:r>
+        <w:t>” was configured in a dedicated tests directory with its own “CMakeLists.txt”. There are additional test targets for different layer testing. The model source files are compiled directly into the test executable using “</w:t>
+      </w:r>
+      <w:proofErr w:type="spellStart"/>
+      <w:r>
+        <w:t>target_sources</w:t>
+      </w:r>
+      <w:proofErr w:type="spellEnd"/>
+      <w:r>
+        <w:t xml:space="preserve">”. “CMAKE_AUTOMOC” is enabled in the test CMake configuration to allow Qt’s meta object compiler to process the test class, which is required for the Q_OBJECT macro used by Qt Test’s test runner. </w:t>
       </w:r>
     </w:p>
     <w:p/>
@@ -7651,7 +7800,7 @@
                     </pic:cNvPicPr>
                   </pic:nvPicPr>
                   <pic:blipFill>
-                    <a:blip r:embed="rId17">
+                    <a:blip r:embed="rId18">
                       <a:extLst>
                         <a:ext uri="{28A0092B-C50C-407E-A947-70E740481C1C}">
                           <a14:useLocalDpi xmlns:a14="http://schemas.microsoft.com/office/drawing/2010/main" val="0"/>
@@ -7751,11 +7900,35 @@
     </w:p>
     <w:p>
       <w:r>
-        <w:t xml:space="preserve">When setting up Qt Test, the generated .moc file was initially included as testModelLayer.cpp.moc following older Qt documentation. Qt 6 with </w:t>
+        <w:t xml:space="preserve">When setting up Qt Test, the generated .moc file was initially included as </w:t>
+      </w:r>
+      <w:proofErr w:type="spellStart"/>
+      <w:r>
+        <w:t>testModelLayer.cpp.moc</w:t>
+      </w:r>
+      <w:proofErr w:type="spellEnd"/>
+      <w:r>
+        <w:t xml:space="preserve"> following older Qt documentation. Qt 6 with </w:t>
       </w:r>
       <w:r>
         <w:lastRenderedPageBreak/>
-        <w:t>CMAKE_AUTOMOC expects testModelLayer.moc without the .cpp component. Correcting this resolved the build error.</w:t>
+        <w:t xml:space="preserve">CMAKE_AUTOMOC expects </w:t>
+      </w:r>
+      <w:proofErr w:type="spellStart"/>
+      <w:r>
+        <w:t>testModelLayer.moc</w:t>
+      </w:r>
+      <w:proofErr w:type="spellEnd"/>
+      <w:r>
+        <w:t xml:space="preserve"> without the .</w:t>
+      </w:r>
+      <w:proofErr w:type="spellStart"/>
+      <w:r>
+        <w:t>cpp</w:t>
+      </w:r>
+      <w:proofErr w:type="spellEnd"/>
+      <w:r>
+        <w:t xml:space="preserve"> component. Correcting this resolved the build error.</w:t>
       </w:r>
     </w:p>
     <w:p/>
@@ -7769,13 +7942,25 @@
     </w:p>
     <w:p>
       <w:r>
-        <w:t>Due to the chosen architecture, a challenge arose in determining how ScriptManager’s state change signals would reach the view layer. It was considered to connect them directly to View components but this would create a direct dependency on ScriptManager which violates the MVVM boundary.</w:t>
+        <w:t xml:space="preserve">Due to the chosen architecture, a challenge arose in determining how ScriptManager’s state change signals would reach the view layer. It was considered to connect them directly to View </w:t>
+      </w:r>
+      <w:r>
+        <w:t>components,</w:t>
+      </w:r>
+      <w:r>
+        <w:t xml:space="preserve"> but this would create a direct dependency on ScriptManager which violates the MVVM boundary.</w:t>
       </w:r>
     </w:p>
     <w:p/>
     <w:p>
       <w:r>
-        <w:t>The solution here was to connect ScriptManager’s signals to lambda function inside the ScriptViewModel’s constructor. This then translated the service layer signals into view facing signals. The outcome is the MVVM boundart is kept intact and means the View layer has the single point of contact (ScriptViewModel) regardless of how many service layer classes exist beneath it.</w:t>
+        <w:t xml:space="preserve">The solution here was to connect ScriptManager’s signals to lambda function inside the ScriptViewModel’s constructor. This then translated the service layer signals into view facing signals. The outcome is the MVVM </w:t>
+      </w:r>
+      <w:r>
+        <w:t>boundary</w:t>
+      </w:r>
+      <w:r>
+        <w:t xml:space="preserve"> is kept intact and means the View layer has the single point of contact (ScriptViewModel) regardless of how many service layer classes exist beneath it.</w:t>
       </w:r>
     </w:p>
     <w:p/>
@@ -7923,7 +8108,27 @@
           <w:spacing w:val="7"/>
           <w:shd w:val="clear" w:color="auto" w:fill="FFFFFF"/>
         </w:rPr>
-        <w:t>This section will evaluate both the process and products of your project based on your previously developed criteria.   Note that the ‘products’ of your project include not just the principal artefact that you have developed, but also design and other documentation associated with the development process.   It is also appropriate to discuss the results of any external validation of your artefacts in this section.  The evaluation of the process should consider all elements of your project methodology as well as project management issues</w:t>
+        <w:t xml:space="preserve">This section will evaluate both the process and products of your project based on your previously developed criteria.   Note that the ‘products’ of your project include not just the principal artefact that you have </w:t>
+      </w:r>
+      <w:proofErr w:type="gramStart"/>
+      <w:r>
+        <w:rPr>
+          <w:rFonts w:ascii="Trebuchet MS" w:hAnsi="Trebuchet MS" w:cs="Open Sans"/>
+          <w:color w:val="FF0000"/>
+          <w:spacing w:val="7"/>
+          <w:shd w:val="clear" w:color="auto" w:fill="FFFFFF"/>
+        </w:rPr>
+        <w:t>developed, but</w:t>
+      </w:r>
+      <w:proofErr w:type="gramEnd"/>
+      <w:r>
+        <w:rPr>
+          <w:rFonts w:ascii="Trebuchet MS" w:hAnsi="Trebuchet MS" w:cs="Open Sans"/>
+          <w:color w:val="FF0000"/>
+          <w:spacing w:val="7"/>
+          <w:shd w:val="clear" w:color="auto" w:fill="FFFFFF"/>
+        </w:rPr>
+        <w:t xml:space="preserve"> also design and other documentation associated with the development process.   It is also appropriate to discuss the results of any external validation of your artefacts in this section.  The evaluation of the process should consider all elements of your project methodology as well as project management issues</w:t>
       </w:r>
     </w:p>
     <w:p>
@@ -8116,7 +8321,7 @@
         </w:rPr>
         <w:br/>
       </w:r>
-      <w:hyperlink r:id="rId18">
+      <w:hyperlink r:id="rId19">
         <w:r>
           <w:rPr>
             <w:rStyle w:val="Hyperlink"/>
@@ -8271,7 +8476,7 @@
         </w:rPr>
         <w:t xml:space="preserve"> </w:t>
       </w:r>
-      <w:hyperlink r:id="rId19">
+      <w:hyperlink r:id="rId20">
         <w:r>
           <w:rPr>
             <w:rStyle w:val="Hyperlink"/>
@@ -8304,12 +8509,12 @@
         <w:pStyle w:val="Heading1"/>
         <w:jc w:val="center"/>
         <w:sectPr>
-          <w:headerReference w:type="even" r:id="rId20"/>
-          <w:headerReference w:type="default" r:id="rId21"/>
-          <w:footerReference w:type="even" r:id="rId22"/>
-          <w:footerReference w:type="default" r:id="rId23"/>
-          <w:headerReference w:type="first" r:id="rId24"/>
-          <w:footerReference w:type="first" r:id="rId25"/>
+          <w:headerReference w:type="even" r:id="rId21"/>
+          <w:headerReference w:type="default" r:id="rId22"/>
+          <w:footerReference w:type="even" r:id="rId23"/>
+          <w:footerReference w:type="default" r:id="rId24"/>
+          <w:headerReference w:type="first" r:id="rId25"/>
+          <w:footerReference w:type="first" r:id="rId26"/>
           <w:pgSz w:w="11906" w:h="16838"/>
           <w:pgMar w:top="2155" w:right="1418" w:bottom="2155" w:left="1814" w:header="709" w:footer="709" w:gutter="0"/>
           <w:pgNumType w:start="1"/>
@@ -8397,12 +8602,12 @@
           <w:szCs w:val="28"/>
         </w:rPr>
         <w:sectPr>
-          <w:headerReference w:type="even" r:id="rId26"/>
-          <w:headerReference w:type="default" r:id="rId27"/>
-          <w:footerReference w:type="even" r:id="rId28"/>
-          <w:footerReference w:type="default" r:id="rId29"/>
-          <w:headerReference w:type="first" r:id="rId30"/>
-          <w:footerReference w:type="first" r:id="rId31"/>
+          <w:headerReference w:type="even" r:id="rId27"/>
+          <w:headerReference w:type="default" r:id="rId28"/>
+          <w:footerReference w:type="even" r:id="rId29"/>
+          <w:footerReference w:type="default" r:id="rId30"/>
+          <w:headerReference w:type="first" r:id="rId31"/>
+          <w:footerReference w:type="first" r:id="rId32"/>
           <w:pgSz w:w="11906" w:h="16838"/>
           <w:pgMar w:top="2155" w:right="1418" w:bottom="2155" w:left="1814" w:header="709" w:footer="709" w:gutter="0"/>
           <w:pgNumType w:fmt="upperLetter" w:start="1"/>
@@ -8650,12 +8855,12 @@
           <w:rFonts w:cs="Arial"/>
         </w:rPr>
         <w:sectPr>
-          <w:headerReference w:type="even" r:id="rId32"/>
-          <w:headerReference w:type="default" r:id="rId33"/>
-          <w:footerReference w:type="even" r:id="rId34"/>
-          <w:footerReference w:type="default" r:id="rId35"/>
-          <w:headerReference w:type="first" r:id="rId36"/>
-          <w:footerReference w:type="first" r:id="rId37"/>
+          <w:headerReference w:type="even" r:id="rId33"/>
+          <w:headerReference w:type="default" r:id="rId34"/>
+          <w:footerReference w:type="even" r:id="rId35"/>
+          <w:footerReference w:type="default" r:id="rId36"/>
+          <w:headerReference w:type="first" r:id="rId37"/>
+          <w:footerReference w:type="first" r:id="rId38"/>
           <w:pgSz w:w="11906" w:h="16838"/>
           <w:pgMar w:top="2155" w:right="1418" w:bottom="2155" w:left="1814" w:header="709" w:footer="709" w:gutter="0"/>
           <w:cols w:space="720"/>
@@ -8686,12 +8891,12 @@
     </w:p>
     <w:p/>
     <w:sectPr>
-      <w:headerReference w:type="even" r:id="rId38"/>
-      <w:headerReference w:type="default" r:id="rId39"/>
-      <w:footerReference w:type="even" r:id="rId40"/>
-      <w:footerReference w:type="default" r:id="rId41"/>
-      <w:headerReference w:type="first" r:id="rId42"/>
-      <w:footerReference w:type="first" r:id="rId43"/>
+      <w:headerReference w:type="even" r:id="rId39"/>
+      <w:headerReference w:type="default" r:id="rId40"/>
+      <w:footerReference w:type="even" r:id="rId41"/>
+      <w:footerReference w:type="default" r:id="rId42"/>
+      <w:headerReference w:type="first" r:id="rId43"/>
+      <w:footerReference w:type="first" r:id="rId44"/>
       <w:pgSz w:w="11906" w:h="16838"/>
       <w:pgMar w:top="2155" w:right="1418" w:bottom="2155" w:left="1814" w:header="709" w:footer="709" w:gutter="0"/>
       <w:pgNumType w:fmt="upperLetter"/>

</xml_diff>

<commit_message>
feat: initial sceneNavigator implementation.
</commit_message>
<xml_diff>
--- a/Documentation/report_2/COM629_DIS_AE2_Oliver_Myers.docx
+++ b/Documentation/report_2/COM629_DIS_AE2_Oliver_Myers.docx
@@ -570,27 +570,7 @@
           <w:iCs/>
           <w:color w:val="FF0000"/>
         </w:rPr>
-        <w:t xml:space="preserve">Write a paragraph here acknowledging everyone who has helped you while you have been preparing the content of your dissertation. This may be your supervisor or other academic staff who have provided guidance and support, other students or colleagues you have worked with on any research or project work, interviewees, librarians, or any external bodies that have given </w:t>
-      </w:r>
-      <w:proofErr w:type="spellStart"/>
-      <w:r>
-        <w:rPr>
-          <w:rFonts w:cs="Arial"/>
-          <w:i w:val="0"/>
-          <w:iCs/>
-          <w:color w:val="FF0000"/>
-        </w:rPr>
-        <w:t>you</w:t>
-      </w:r>
-      <w:proofErr w:type="spellEnd"/>
-      <w:r>
-        <w:rPr>
-          <w:rFonts w:cs="Arial"/>
-          <w:i w:val="0"/>
-          <w:iCs/>
-          <w:color w:val="FF0000"/>
-        </w:rPr>
-        <w:t xml:space="preserve"> assistance, such as access to data or opportunities for hands-on experience.</w:t>
+        <w:t>Write a paragraph here acknowledging everyone who has helped you while you have been preparing the content of your dissertation. This may be your supervisor or other academic staff who have provided guidance and support, other students or colleagues you have worked with on any research or project work, interviewees, librarians, or any external bodies that have given you assistance, such as access to data or opportunities for hands-on experience.</w:t>
       </w:r>
     </w:p>
     <w:p>
@@ -7723,23 +7703,7 @@
     </w:p>
     <w:p>
       <w:r>
-        <w:t>Unit Tests were written using Qt Test which is Qt’s built in testing framework. This integrates directly with Qt Creator and CMake. A separate test target “</w:t>
-      </w:r>
-      <w:proofErr w:type="spellStart"/>
-      <w:r>
-        <w:t>tst_modellayer</w:t>
-      </w:r>
-      <w:proofErr w:type="spellEnd"/>
-      <w:r>
-        <w:t>” was configured in a dedicated tests directory with its own “CMakeLists.txt”. There are additional test targets for different layer testing. The model source files are compiled directly into the test executable using “</w:t>
-      </w:r>
-      <w:proofErr w:type="spellStart"/>
-      <w:r>
-        <w:t>target_sources</w:t>
-      </w:r>
-      <w:proofErr w:type="spellEnd"/>
-      <w:r>
-        <w:t xml:space="preserve">”. “CMAKE_AUTOMOC” is enabled in the test CMake configuration to allow Qt’s meta object compiler to process the test class, which is required for the Q_OBJECT macro used by Qt Test’s test runner. </w:t>
+        <w:t xml:space="preserve">Unit Tests were written using Qt Test which is Qt’s built in testing framework. This integrates directly with Qt Creator and CMake. A separate test target “tst_modellayer” was configured in a dedicated tests directory with its own “CMakeLists.txt”. There are additional test targets for different layer testing. The model source files are compiled directly into the test executable using “target_sources”. “CMAKE_AUTOMOC” is enabled in the test CMake configuration to allow Qt’s meta object compiler to process the test class, which is required for the Q_OBJECT macro used by Qt Test’s test runner. </w:t>
       </w:r>
     </w:p>
     <w:p/>
@@ -7900,35 +7864,11 @@
     </w:p>
     <w:p>
       <w:r>
-        <w:t xml:space="preserve">When setting up Qt Test, the generated .moc file was initially included as </w:t>
-      </w:r>
-      <w:proofErr w:type="spellStart"/>
-      <w:r>
-        <w:t>testModelLayer.cpp.moc</w:t>
-      </w:r>
-      <w:proofErr w:type="spellEnd"/>
-      <w:r>
-        <w:t xml:space="preserve"> following older Qt documentation. Qt 6 with </w:t>
+        <w:t xml:space="preserve">When setting up Qt Test, the generated .moc file was initially included as testModelLayer.cpp.moc following older Qt documentation. Qt 6 with </w:t>
       </w:r>
       <w:r>
         <w:lastRenderedPageBreak/>
-        <w:t xml:space="preserve">CMAKE_AUTOMOC expects </w:t>
-      </w:r>
-      <w:proofErr w:type="spellStart"/>
-      <w:r>
-        <w:t>testModelLayer.moc</w:t>
-      </w:r>
-      <w:proofErr w:type="spellEnd"/>
-      <w:r>
-        <w:t xml:space="preserve"> without the .</w:t>
-      </w:r>
-      <w:proofErr w:type="spellStart"/>
-      <w:r>
-        <w:t>cpp</w:t>
-      </w:r>
-      <w:proofErr w:type="spellEnd"/>
-      <w:r>
-        <w:t xml:space="preserve"> component. Correcting this resolved the build error.</w:t>
+        <w:t>CMAKE_AUTOMOC expects testModelLayer.moc without the .cpp component. Correcting this resolved the build error.</w:t>
       </w:r>
     </w:p>
     <w:p/>
@@ -7961,6 +7901,26 @@
       </w:r>
       <w:r>
         <w:t xml:space="preserve"> is kept intact and means the View layer has the single point of contact (ScriptViewModel) regardless of how many service layer classes exist beneath it.</w:t>
+      </w:r>
+    </w:p>
+    <w:p/>
+    <w:p>
+      <w:pPr>
+        <w:pStyle w:val="Heading3"/>
+      </w:pPr>
+      <w:r>
+        <w:t>4.8.5 MVVM boundary violation in SceneNavigator</w:t>
+      </w:r>
+    </w:p>
+    <w:p>
+      <w:r>
+        <w:t xml:space="preserve">During the implementation of SceneNavigator, an issue was identified where the View was using the ViewModel to access ScriptManager and retrieve scene data. The initial implementation called viewModel_-&gt;getScriptManager()-&gt;getScript-&gt;getScenes(). This gave SceneNavigator a direct dependency on ScriptManager and Script which are two layers the View should not have access to. </w:t>
+      </w:r>
+    </w:p>
+    <w:p/>
+    <w:p>
+      <w:r>
+        <w:t>The fix was to remove getScriptManager() from ScriptViewModel and replace it with the purpose built method: getSceneList() which returns a formatted QStringList. The View now calls only these methods and has no visibility into the services layer. This correction reinforces the MVVM boundary as the ViewModel is the single point of contact for the View.</w:t>
       </w:r>
     </w:p>
     <w:p/>
@@ -8108,27 +8068,7 @@
           <w:spacing w:val="7"/>
           <w:shd w:val="clear" w:color="auto" w:fill="FFFFFF"/>
         </w:rPr>
-        <w:t xml:space="preserve">This section will evaluate both the process and products of your project based on your previously developed criteria.   Note that the ‘products’ of your project include not just the principal artefact that you have </w:t>
-      </w:r>
-      <w:proofErr w:type="gramStart"/>
-      <w:r>
-        <w:rPr>
-          <w:rFonts w:ascii="Trebuchet MS" w:hAnsi="Trebuchet MS" w:cs="Open Sans"/>
-          <w:color w:val="FF0000"/>
-          <w:spacing w:val="7"/>
-          <w:shd w:val="clear" w:color="auto" w:fill="FFFFFF"/>
-        </w:rPr>
-        <w:t>developed, but</w:t>
-      </w:r>
-      <w:proofErr w:type="gramEnd"/>
-      <w:r>
-        <w:rPr>
-          <w:rFonts w:ascii="Trebuchet MS" w:hAnsi="Trebuchet MS" w:cs="Open Sans"/>
-          <w:color w:val="FF0000"/>
-          <w:spacing w:val="7"/>
-          <w:shd w:val="clear" w:color="auto" w:fill="FFFFFF"/>
-        </w:rPr>
-        <w:t xml:space="preserve"> also design and other documentation associated with the development process.   It is also appropriate to discuss the results of any external validation of your artefacts in this section.  The evaluation of the process should consider all elements of your project methodology as well as project management issues</w:t>
+        <w:t>This section will evaluate both the process and products of your project based on your previously developed criteria.   Note that the ‘products’ of your project include not just the principal artefact that you have developed, but also design and other documentation associated with the development process.   It is also appropriate to discuss the results of any external validation of your artefacts in this section.  The evaluation of the process should consider all elements of your project methodology as well as project management issues</w:t>
       </w:r>
     </w:p>
     <w:p>

</xml_diff>

<commit_message>
feat: added the block operations for scene nav.
</commit_message>
<xml_diff>
--- a/Documentation/report_2/COM629_DIS_AE2_Oliver_Myers.docx
+++ b/Documentation/report_2/COM629_DIS_AE2_Oliver_Myers.docx
@@ -570,7 +570,27 @@
           <w:iCs/>
           <w:color w:val="FF0000"/>
         </w:rPr>
-        <w:t>Write a paragraph here acknowledging everyone who has helped you while you have been preparing the content of your dissertation. This may be your supervisor or other academic staff who have provided guidance and support, other students or colleagues you have worked with on any research or project work, interviewees, librarians, or any external bodies that have given you assistance, such as access to data or opportunities for hands-on experience.</w:t>
+        <w:t xml:space="preserve">Write a paragraph here acknowledging everyone who has helped you while you have been preparing the content of your dissertation. This may be your supervisor or other academic staff who have provided guidance and support, other students or colleagues you have worked with on any research or project work, interviewees, librarians, or any external bodies that have given </w:t>
+      </w:r>
+      <w:proofErr w:type="spellStart"/>
+      <w:r>
+        <w:rPr>
+          <w:rFonts w:cs="Arial"/>
+          <w:i w:val="0"/>
+          <w:iCs/>
+          <w:color w:val="FF0000"/>
+        </w:rPr>
+        <w:t>you</w:t>
+      </w:r>
+      <w:proofErr w:type="spellEnd"/>
+      <w:r>
+        <w:rPr>
+          <w:rFonts w:cs="Arial"/>
+          <w:i w:val="0"/>
+          <w:iCs/>
+          <w:color w:val="FF0000"/>
+        </w:rPr>
+        <w:t xml:space="preserve"> assistance, such as access to data or opportunities for hands-on experience.</w:t>
       </w:r>
     </w:p>
     <w:p>
@@ -7658,6 +7678,79 @@
     </w:p>
     <w:p/>
     <w:p/>
+    <w:p/>
+    <w:p>
+      <w:r>
+        <w:rPr>
+          <w:noProof/>
+        </w:rPr>
+        <w:drawing>
+          <wp:anchor distT="0" distB="0" distL="114300" distR="114300" simplePos="0" relativeHeight="251660288" behindDoc="0" locked="0" layoutInCell="1" allowOverlap="1" wp14:anchorId="2EBB5B37" wp14:editId="6DF734C5">
+            <wp:simplePos x="0" y="0"/>
+            <wp:positionH relativeFrom="margin">
+              <wp:align>right</wp:align>
+            </wp:positionH>
+            <wp:positionV relativeFrom="paragraph">
+              <wp:posOffset>246380</wp:posOffset>
+            </wp:positionV>
+            <wp:extent cx="5505450" cy="3448050"/>
+            <wp:effectExtent l="19050" t="19050" r="19050" b="19050"/>
+            <wp:wrapTopAndBottom/>
+            <wp:docPr id="1751866257" name="Picture 9"/>
+            <wp:cNvGraphicFramePr>
+              <a:graphicFrameLocks xmlns:a="http://schemas.openxmlformats.org/drawingml/2006/main" noChangeAspect="1"/>
+            </wp:cNvGraphicFramePr>
+            <a:graphic xmlns:a="http://schemas.openxmlformats.org/drawingml/2006/main">
+              <a:graphicData uri="http://schemas.openxmlformats.org/drawingml/2006/picture">
+                <pic:pic xmlns:pic="http://schemas.openxmlformats.org/drawingml/2006/picture">
+                  <pic:nvPicPr>
+                    <pic:cNvPr id="0" name="Picture 3"/>
+                    <pic:cNvPicPr>
+                      <a:picLocks noChangeAspect="1" noChangeArrowheads="1"/>
+                    </pic:cNvPicPr>
+                  </pic:nvPicPr>
+                  <pic:blipFill>
+                    <a:blip r:embed="rId18">
+                      <a:extLst>
+                        <a:ext uri="{28A0092B-C50C-407E-A947-70E740481C1C}">
+                          <a14:useLocalDpi xmlns:a14="http://schemas.microsoft.com/office/drawing/2010/main" val="0"/>
+                        </a:ext>
+                      </a:extLst>
+                    </a:blip>
+                    <a:srcRect/>
+                    <a:stretch>
+                      <a:fillRect/>
+                    </a:stretch>
+                  </pic:blipFill>
+                  <pic:spPr bwMode="auto">
+                    <a:xfrm>
+                      <a:off x="0" y="0"/>
+                      <a:ext cx="5505450" cy="3448050"/>
+                    </a:xfrm>
+                    <a:prstGeom prst="rect">
+                      <a:avLst/>
+                    </a:prstGeom>
+                    <a:noFill/>
+                    <a:ln>
+                      <a:solidFill>
+                        <a:schemeClr val="tx1"/>
+                      </a:solidFill>
+                    </a:ln>
+                  </pic:spPr>
+                </pic:pic>
+              </a:graphicData>
+            </a:graphic>
+            <wp14:sizeRelH relativeFrom="page">
+              <wp14:pctWidth>0</wp14:pctWidth>
+            </wp14:sizeRelH>
+            <wp14:sizeRelV relativeFrom="page">
+              <wp14:pctHeight>0</wp14:pctHeight>
+            </wp14:sizeRelV>
+          </wp:anchor>
+        </w:drawing>
+      </w:r>
+    </w:p>
+    <w:p/>
     <w:p>
       <w:pPr>
         <w:pStyle w:val="Heading3"/>
@@ -7703,7 +7796,27 @@
     </w:p>
     <w:p>
       <w:r>
-        <w:t xml:space="preserve">Unit Tests were written using Qt Test which is Qt’s built in testing framework. This integrates directly with Qt Creator and CMake. A separate test target “tst_modellayer” was configured in a dedicated tests directory with its own “CMakeLists.txt”. There are additional test targets for different layer testing. The model source files are compiled directly into the test executable using “target_sources”. “CMAKE_AUTOMOC” is enabled in the test CMake configuration to allow Qt’s meta object compiler to process the test class, which is required for the Q_OBJECT macro used by Qt Test’s test runner. </w:t>
+        <w:t>Unit Tests were written using Qt Test which is Qt’s built in testing framework. This integrates directly with Qt Creator and CMake. A separate test target “</w:t>
+      </w:r>
+      <w:proofErr w:type="spellStart"/>
+      <w:r>
+        <w:t>tst_modellayer</w:t>
+      </w:r>
+      <w:proofErr w:type="spellEnd"/>
+      <w:r>
+        <w:t>” was configured in a dedicated tests directory with its own “CMakeLists.txt”. There are additional test targets for different layer testing. The model source files are compiled directly into the test executable using “</w:t>
+      </w:r>
+      <w:proofErr w:type="spellStart"/>
+      <w:r>
+        <w:t>target_sources</w:t>
+      </w:r>
+      <w:proofErr w:type="spellEnd"/>
+      <w:r>
+        <w:t xml:space="preserve">”. “CMAKE_AUTOMOC” is enabled in the test CMake </w:t>
+      </w:r>
+      <w:r>
+        <w:lastRenderedPageBreak/>
+        <w:t xml:space="preserve">configuration to allow Qt’s meta object compiler to process the test class, which is required for the Q_OBJECT macro used by Qt Test’s test runner. </w:t>
       </w:r>
     </w:p>
     <w:p/>
@@ -7737,7 +7850,6 @@
         <w:rPr>
           <w:noProof/>
         </w:rPr>
-        <w:lastRenderedPageBreak/>
         <w:drawing>
           <wp:anchor distT="0" distB="0" distL="114300" distR="114300" simplePos="0" relativeHeight="251658240" behindDoc="0" locked="0" layoutInCell="1" allowOverlap="1" wp14:anchorId="04256252" wp14:editId="5C2ABA4B">
             <wp:simplePos x="0" y="0"/>
@@ -7764,7 +7876,7 @@
                     </pic:cNvPicPr>
                   </pic:nvPicPr>
                   <pic:blipFill>
-                    <a:blip r:embed="rId18">
+                    <a:blip r:embed="rId19">
                       <a:extLst>
                         <a:ext uri="{28A0092B-C50C-407E-A947-70E740481C1C}">
                           <a14:useLocalDpi xmlns:a14="http://schemas.microsoft.com/office/drawing/2010/main" val="0"/>
@@ -7850,7 +7962,11 @@
     </w:p>
     <w:p>
       <w:r>
-        <w:t>A decision was required on whether to store scenes as plain values or as unique pointers. The unique pointer approach was considered for consistency with the element ownership model but was rejected as it introduces heap allocation and pointer indirection with no benefit. Ownership is already enforced by containment in the vector. The decision was documented explicitly to distinguish between unique pointers used to solve a technical problem versus unique pointers used as a style choice.</w:t>
+        <w:t xml:space="preserve">A decision was required on whether to store scenes as plain values or as unique pointers. The unique pointer approach was considered for consistency with the element ownership model but was rejected as it introduces heap allocation and </w:t>
+      </w:r>
+      <w:r>
+        <w:lastRenderedPageBreak/>
+        <w:t>pointer indirection with no benefit. Ownership is already enforced by containment in the vector. The decision was documented explicitly to distinguish between unique pointers used to solve a technical problem versus unique pointers used as a style choice.</w:t>
       </w:r>
     </w:p>
     <w:p/>
@@ -7864,63 +7980,161 @@
     </w:p>
     <w:p>
       <w:r>
-        <w:t xml:space="preserve">When setting up Qt Test, the generated .moc file was initially included as testModelLayer.cpp.moc following older Qt documentation. Qt 6 with </w:t>
-      </w:r>
+        <w:t xml:space="preserve">When setting up Qt Test, the generated .moc file was initially included as </w:t>
+      </w:r>
+      <w:proofErr w:type="spellStart"/>
+      <w:r>
+        <w:t>testModelLayer.cpp.moc</w:t>
+      </w:r>
+      <w:proofErr w:type="spellEnd"/>
+      <w:r>
+        <w:t xml:space="preserve"> following older Qt documentation. Qt 6 with CMAKE_AUTOMOC expects </w:t>
+      </w:r>
+      <w:proofErr w:type="spellStart"/>
+      <w:r>
+        <w:t>testModelLayer.moc</w:t>
+      </w:r>
+      <w:proofErr w:type="spellEnd"/>
+      <w:r>
+        <w:t xml:space="preserve"> without the .</w:t>
+      </w:r>
+      <w:proofErr w:type="spellStart"/>
+      <w:r>
+        <w:t>cpp</w:t>
+      </w:r>
+      <w:proofErr w:type="spellEnd"/>
+      <w:r>
+        <w:t xml:space="preserve"> component. Correcting this resolved the build error.</w:t>
+      </w:r>
+    </w:p>
+    <w:p/>
+    <w:p>
+      <w:pPr>
+        <w:pStyle w:val="Heading3"/>
+      </w:pPr>
+      <w:r>
+        <w:t>4.8.4 Preserving MVVM boundary when connection service layer signals to the View</w:t>
+      </w:r>
+    </w:p>
+    <w:p>
+      <w:r>
+        <w:t xml:space="preserve">Due to the chosen architecture, a challenge arose in determining how ScriptManager’s state change signals would reach the view layer. It was considered to connect them directly to View </w:t>
+      </w:r>
+      <w:r>
+        <w:t>components,</w:t>
+      </w:r>
+      <w:r>
+        <w:t xml:space="preserve"> but this would create a direct dependency on ScriptManager which violates the MVVM boundary.</w:t>
+      </w:r>
+    </w:p>
+    <w:p/>
+    <w:p>
+      <w:r>
+        <w:t xml:space="preserve">The solution here was to connect ScriptManager’s signals to lambda function inside the ScriptViewModel’s constructor. This then translated the service layer signals into view facing signals. The outcome is the MVVM </w:t>
+      </w:r>
+      <w:r>
+        <w:t>boundary</w:t>
+      </w:r>
+      <w:r>
+        <w:t xml:space="preserve"> is kept intact and means the View layer has the single point of contact (ScriptViewModel) regardless of how many service layer classes exist beneath it.</w:t>
+      </w:r>
+    </w:p>
+    <w:p/>
+    <w:p>
+      <w:pPr>
+        <w:pStyle w:val="Heading3"/>
+      </w:pPr>
+      <w:r>
+        <w:t>4.8.5 MVVM boundary violation in SceneNavigator</w:t>
+      </w:r>
+    </w:p>
+    <w:p>
+      <w:r>
+        <w:t xml:space="preserve">During the implementation of SceneNavigator, an issue was identified where the View was using the ViewModel to access ScriptManager and retrieve scene data. The initial implementation called </w:t>
+      </w:r>
+      <w:proofErr w:type="spellStart"/>
+      <w:r>
+        <w:t>viewModel</w:t>
+      </w:r>
+      <w:proofErr w:type="spellEnd"/>
+      <w:r>
+        <w:t>_-&gt;</w:t>
+      </w:r>
+      <w:proofErr w:type="spellStart"/>
+      <w:r>
+        <w:t>getScriptManager</w:t>
+      </w:r>
+      <w:proofErr w:type="spellEnd"/>
+      <w:r>
+        <w:t>()-&gt;getScript-&gt;</w:t>
+      </w:r>
+      <w:proofErr w:type="spellStart"/>
+      <w:r>
+        <w:t>getScenes</w:t>
+      </w:r>
+      <w:proofErr w:type="spellEnd"/>
+      <w:r>
+        <w:t xml:space="preserve">(). This gave SceneNavigator a direct dependency on ScriptManager and Script which are two layers the View should not have access to. </w:t>
+      </w:r>
+    </w:p>
+    <w:p/>
+    <w:p>
+      <w:r>
+        <w:t xml:space="preserve">The fix was to remove </w:t>
+      </w:r>
+      <w:proofErr w:type="spellStart"/>
+      <w:r>
+        <w:t>getScriptManager</w:t>
+      </w:r>
+      <w:proofErr w:type="spellEnd"/>
+      <w:r>
+        <w:t xml:space="preserve">() from ScriptViewModel and replace it with the purpose built method: </w:t>
+      </w:r>
+      <w:proofErr w:type="spellStart"/>
+      <w:r>
+        <w:t>getSceneList</w:t>
+      </w:r>
+      <w:proofErr w:type="spellEnd"/>
+      <w:r>
+        <w:t xml:space="preserve">() which returns a formatted </w:t>
+      </w:r>
+      <w:proofErr w:type="spellStart"/>
+      <w:r>
+        <w:t>QStringList</w:t>
+      </w:r>
+      <w:proofErr w:type="spellEnd"/>
+      <w:r>
+        <w:t>. The View now calls only these methods and has no visibility into the services layer. This correction reinforces the MVVM boundary as the ViewModel is the single point of contact for the View.</w:t>
+      </w:r>
+    </w:p>
+    <w:p/>
+    <w:p>
+      <w:pPr>
+        <w:pStyle w:val="Heading3"/>
+      </w:pPr>
       <w:r>
         <w:lastRenderedPageBreak/>
-        <w:t>CMAKE_AUTOMOC expects testModelLayer.moc without the .cpp component. Correcting this resolved the build error.</w:t>
+        <w:t>4.8.6 Locating Scenes in a Continuous Document</w:t>
+      </w:r>
+    </w:p>
+    <w:p>
+      <w:r>
+        <w:t>A challenge arose when implementing scene jump functionality in SceneNavigator. The application needed to scroll ScriptEditor to the correct position when a user clicked a scene in the navigator list. The difficulty was that ScriptEditor operates as a single continuous QTextDocument with no built in concept of scenes. There was no way of the document knowing where a particular scene started.</w:t>
       </w:r>
     </w:p>
     <w:p/>
     <w:p>
-      <w:pPr>
-        <w:pStyle w:val="Heading3"/>
-      </w:pPr>
-      <w:r>
-        <w:t>4.8.4 Preserving MVVM boundary when connection service layer signals to the View</w:t>
-      </w:r>
-    </w:p>
-    <w:p>
-      <w:r>
-        <w:t xml:space="preserve">Due to the chosen architecture, a challenge arose in determining how ScriptManager’s state change signals would reach the view layer. It was considered to connect them directly to View </w:t>
-      </w:r>
-      <w:r>
-        <w:t>components,</w:t>
-      </w:r>
-      <w:r>
-        <w:t xml:space="preserve"> but this would create a direct dependency on ScriptManager which violates the MVVM boundary.</w:t>
-      </w:r>
-    </w:p>
-    <w:p/>
-    <w:p>
-      <w:r>
-        <w:t xml:space="preserve">The solution here was to connect ScriptManager’s signals to lambda function inside the ScriptViewModel’s constructor. This then translated the service layer signals into view facing signals. The outcome is the MVVM </w:t>
-      </w:r>
-      <w:r>
-        <w:t>boundary</w:t>
-      </w:r>
-      <w:r>
-        <w:t xml:space="preserve"> is kept intact and means the View layer has the single point of contact (ScriptViewModel) regardless of how many service layer classes exist beneath it.</w:t>
-      </w:r>
-    </w:p>
-    <w:p/>
-    <w:p>
-      <w:pPr>
-        <w:pStyle w:val="Heading3"/>
-      </w:pPr>
-      <w:r>
-        <w:t>4.8.5 MVVM boundary violation in SceneNavigator</w:t>
-      </w:r>
-    </w:p>
-    <w:p>
-      <w:r>
-        <w:t xml:space="preserve">During the implementation of SceneNavigator, an issue was identified where the View was using the ViewModel to access ScriptManager and retrieve scene data. The initial implementation called viewModel_-&gt;getScriptManager()-&gt;getScript-&gt;getScenes(). This gave SceneNavigator a direct dependency on ScriptManager and Script which are two layers the View should not have access to. </w:t>
-      </w:r>
-    </w:p>
-    <w:p/>
-    <w:p>
-      <w:r>
-        <w:t>The fix was to remove getScriptManager() from ScriptViewModel and replace it with the purpose built method: getSceneList() which returns a formatted QStringList. The View now calls only these methods and has no visibility into the services layer. This correction reinforces the MVVM boundary as the ViewModel is the single point of contact for the View.</w:t>
+      <w:r>
+        <w:t xml:space="preserve">The solution was to register each scene’s starting block in ScriptViewModel </w:t>
+      </w:r>
+      <w:r>
+        <w:t>now</w:t>
+      </w:r>
+      <w:r>
+        <w:t xml:space="preserve"> the scene is created. When the user </w:t>
+      </w:r>
+      <w:r>
+        <w:t>presses enter and confirm a scene heading, keyPressEvent captures the current block number before the new block is inserted and calls registerSceneBlock with the scene index and block number. These are stored in a QMap&lt;int, int&gt; which maps scene index to block number. When the user clicks a scene in SceneNavigator, ScriptViewModel emits currentSceneChanged, ScriptEditor looks up the block number and uses findBlockByNumber to locate the correct position moving the cursor there and scrolling the viewport with ensureCursorVisible.</w:t>
       </w:r>
     </w:p>
     <w:p/>
@@ -8068,7 +8282,27 @@
           <w:spacing w:val="7"/>
           <w:shd w:val="clear" w:color="auto" w:fill="FFFFFF"/>
         </w:rPr>
-        <w:t>This section will evaluate both the process and products of your project based on your previously developed criteria.   Note that the ‘products’ of your project include not just the principal artefact that you have developed, but also design and other documentation associated with the development process.   It is also appropriate to discuss the results of any external validation of your artefacts in this section.  The evaluation of the process should consider all elements of your project methodology as well as project management issues</w:t>
+        <w:t xml:space="preserve">This section will evaluate both the process and products of your project based on your previously developed criteria.   Note that the ‘products’ of your project include not just the principal artefact that you have </w:t>
+      </w:r>
+      <w:proofErr w:type="gramStart"/>
+      <w:r>
+        <w:rPr>
+          <w:rFonts w:ascii="Trebuchet MS" w:hAnsi="Trebuchet MS" w:cs="Open Sans"/>
+          <w:color w:val="FF0000"/>
+          <w:spacing w:val="7"/>
+          <w:shd w:val="clear" w:color="auto" w:fill="FFFFFF"/>
+        </w:rPr>
+        <w:t>developed, but</w:t>
+      </w:r>
+      <w:proofErr w:type="gramEnd"/>
+      <w:r>
+        <w:rPr>
+          <w:rFonts w:ascii="Trebuchet MS" w:hAnsi="Trebuchet MS" w:cs="Open Sans"/>
+          <w:color w:val="FF0000"/>
+          <w:spacing w:val="7"/>
+          <w:shd w:val="clear" w:color="auto" w:fill="FFFFFF"/>
+        </w:rPr>
+        <w:t xml:space="preserve"> also design and other documentation associated with the development process.   It is also appropriate to discuss the results of any external validation of your artefacts in this section.  The evaluation of the process should consider all elements of your project methodology as well as project management issues</w:t>
       </w:r>
     </w:p>
     <w:p>
@@ -8261,7 +8495,7 @@
         </w:rPr>
         <w:br/>
       </w:r>
-      <w:hyperlink r:id="rId19">
+      <w:hyperlink r:id="rId20">
         <w:r>
           <w:rPr>
             <w:rStyle w:val="Hyperlink"/>
@@ -8416,7 +8650,7 @@
         </w:rPr>
         <w:t xml:space="preserve"> </w:t>
       </w:r>
-      <w:hyperlink r:id="rId20">
+      <w:hyperlink r:id="rId21">
         <w:r>
           <w:rPr>
             <w:rStyle w:val="Hyperlink"/>
@@ -8449,12 +8683,12 @@
         <w:pStyle w:val="Heading1"/>
         <w:jc w:val="center"/>
         <w:sectPr>
-          <w:headerReference w:type="even" r:id="rId21"/>
-          <w:headerReference w:type="default" r:id="rId22"/>
-          <w:footerReference w:type="even" r:id="rId23"/>
-          <w:footerReference w:type="default" r:id="rId24"/>
-          <w:headerReference w:type="first" r:id="rId25"/>
-          <w:footerReference w:type="first" r:id="rId26"/>
+          <w:headerReference w:type="even" r:id="rId22"/>
+          <w:headerReference w:type="default" r:id="rId23"/>
+          <w:footerReference w:type="even" r:id="rId24"/>
+          <w:footerReference w:type="default" r:id="rId25"/>
+          <w:headerReference w:type="first" r:id="rId26"/>
+          <w:footerReference w:type="first" r:id="rId27"/>
           <w:pgSz w:w="11906" w:h="16838"/>
           <w:pgMar w:top="2155" w:right="1418" w:bottom="2155" w:left="1814" w:header="709" w:footer="709" w:gutter="0"/>
           <w:pgNumType w:start="1"/>
@@ -8542,12 +8776,12 @@
           <w:szCs w:val="28"/>
         </w:rPr>
         <w:sectPr>
-          <w:headerReference w:type="even" r:id="rId27"/>
-          <w:headerReference w:type="default" r:id="rId28"/>
-          <w:footerReference w:type="even" r:id="rId29"/>
-          <w:footerReference w:type="default" r:id="rId30"/>
-          <w:headerReference w:type="first" r:id="rId31"/>
-          <w:footerReference w:type="first" r:id="rId32"/>
+          <w:headerReference w:type="even" r:id="rId28"/>
+          <w:headerReference w:type="default" r:id="rId29"/>
+          <w:footerReference w:type="even" r:id="rId30"/>
+          <w:footerReference w:type="default" r:id="rId31"/>
+          <w:headerReference w:type="first" r:id="rId32"/>
+          <w:footerReference w:type="first" r:id="rId33"/>
           <w:pgSz w:w="11906" w:h="16838"/>
           <w:pgMar w:top="2155" w:right="1418" w:bottom="2155" w:left="1814" w:header="709" w:footer="709" w:gutter="0"/>
           <w:pgNumType w:fmt="upperLetter" w:start="1"/>
@@ -8795,12 +9029,12 @@
           <w:rFonts w:cs="Arial"/>
         </w:rPr>
         <w:sectPr>
-          <w:headerReference w:type="even" r:id="rId33"/>
-          <w:headerReference w:type="default" r:id="rId34"/>
-          <w:footerReference w:type="even" r:id="rId35"/>
-          <w:footerReference w:type="default" r:id="rId36"/>
-          <w:headerReference w:type="first" r:id="rId37"/>
-          <w:footerReference w:type="first" r:id="rId38"/>
+          <w:headerReference w:type="even" r:id="rId34"/>
+          <w:headerReference w:type="default" r:id="rId35"/>
+          <w:footerReference w:type="even" r:id="rId36"/>
+          <w:footerReference w:type="default" r:id="rId37"/>
+          <w:headerReference w:type="first" r:id="rId38"/>
+          <w:footerReference w:type="first" r:id="rId39"/>
           <w:pgSz w:w="11906" w:h="16838"/>
           <w:pgMar w:top="2155" w:right="1418" w:bottom="2155" w:left="1814" w:header="709" w:footer="709" w:gutter="0"/>
           <w:cols w:space="720"/>
@@ -8831,12 +9065,12 @@
     </w:p>
     <w:p/>
     <w:sectPr>
-      <w:headerReference w:type="even" r:id="rId39"/>
-      <w:headerReference w:type="default" r:id="rId40"/>
-      <w:footerReference w:type="even" r:id="rId41"/>
-      <w:footerReference w:type="default" r:id="rId42"/>
-      <w:headerReference w:type="first" r:id="rId43"/>
-      <w:footerReference w:type="first" r:id="rId44"/>
+      <w:headerReference w:type="even" r:id="rId40"/>
+      <w:headerReference w:type="default" r:id="rId41"/>
+      <w:footerReference w:type="even" r:id="rId42"/>
+      <w:footerReference w:type="default" r:id="rId43"/>
+      <w:headerReference w:type="first" r:id="rId44"/>
+      <w:footerReference w:type="first" r:id="rId45"/>
       <w:pgSz w:w="11906" w:h="16838"/>
       <w:pgMar w:top="2155" w:right="1418" w:bottom="2155" w:left="1814" w:header="709" w:footer="709" w:gutter="0"/>
       <w:pgNumType w:fmt="upperLetter"/>

</xml_diff>

<commit_message>
fix: New Script and Save As script operation
</commit_message>
<xml_diff>
--- a/Documentation/report_2/COM629_DIS_AE2_Oliver_Myers.docx
+++ b/Documentation/report_2/COM629_DIS_AE2_Oliver_Myers.docx
@@ -7676,14 +7676,35 @@
         <w:t>4.6.2 SceneNavigator</w:t>
       </w:r>
     </w:p>
+    <w:p>
+      <w:r>
+        <w:t xml:space="preserve">SceneNavigator is a panel widget displayed to the left of ScriptEditor in a QSplitter layout. It presents the Scripts Scenes as a scrollable list, showing each scene number and heading. This allows the user to jump directly to any scene by clicking it. </w:t>
+      </w:r>
+    </w:p>
     <w:p/>
+    <w:p>
+      <w:r>
+        <w:t xml:space="preserve">The choice was made to add new scenes through the writing flow itself rather than providing an explicit button to add new scenes. The user cycles to SCENE_HEADING on an empty line and types the heading. Pressing Enter means the ScriptViewModel detects SCENE_HEADING and emits a signal that the SceneNavigator receives and rebuilds the Scenes list. This keeps the interface minimal and consistent with how professional screenwriting tools handle scene creation. The user never has to leave the writing flow. </w:t>
+      </w:r>
+    </w:p>
     <w:p/>
+    <w:p>
+      <w:r>
+        <w:t xml:space="preserve">A feedback loop risk was noted when updating the selected row. When currentSceneChanged fires, the navigator must update its highlighted row, doing so would trigger onItemClicked which would notify the ViewModel which would notify the navigator again. This was resolved using Qt’s blockSignals mechanism. This temporarily suppresses a widgets signals during a programmatic update before restoring normal behaviour. </w:t>
+      </w:r>
+    </w:p>
     <w:p/>
     <w:p>
       <w:r>
+        <w:t xml:space="preserve">Jumping to a scene required solving a separate navigation problem that is described in Section 4.8.6. </w:t>
+      </w:r>
+    </w:p>
+    <w:p>
+      <w:r>
         <w:rPr>
           <w:noProof/>
         </w:rPr>
+        <w:lastRenderedPageBreak/>
         <w:drawing>
           <wp:anchor distT="0" distB="0" distL="114300" distR="114300" simplePos="0" relativeHeight="251660288" behindDoc="0" locked="0" layoutInCell="1" allowOverlap="1" wp14:anchorId="2EBB5B37" wp14:editId="6DF734C5">
             <wp:simplePos x="0" y="0"/>
@@ -7760,22 +7781,214 @@
       </w:r>
     </w:p>
     <w:p/>
+    <w:p>
+      <w:r>
+        <w:t xml:space="preserve">MainWindow is the top level window that owns the applications objects and wires all the components together. </w:t>
+      </w:r>
+      <w:r>
+        <w:t xml:space="preserve">It constructs ScriptManager, ScriptViewModel, ScriptEditor and SceneNavigator in sequence passing each dependency to the next. </w:t>
+      </w:r>
+    </w:p>
     <w:p/>
     <w:p>
-      <w:pPr>
-        <w:rPr>
-          <w:color w:val="EE0000"/>
-        </w:rPr>
-      </w:pPr>
-      <w:r>
-        <w:rPr>
-          <w:color w:val="EE0000"/>
-        </w:rPr>
-        <w:t>IMAGE: Screenshot showing the complete application UI</w:t>
+      <w:r>
+        <w:t xml:space="preserve">A QSplitter divides the window horizontally with SceneNavigator </w:t>
+      </w:r>
+      <w:r>
+        <w:t>occupying</w:t>
+      </w:r>
+      <w:r>
+        <w:t xml:space="preserve"> 20% of the width and ScriptEditor taking the remaining 80%.</w:t>
       </w:r>
     </w:p>
     <w:p/>
     <w:p>
+      <w:r>
+        <w:t xml:space="preserve">A menu bar has been implemented that provides File operations. These actions are connected to a corresponding slot in MainWindow which delegates to ScriptViewModel. </w:t>
+      </w:r>
+    </w:p>
+    <w:p/>
+    <w:p>
+      <w:r>
+        <w:t>A purpose build NewScriptDialog was developed to make sure the user enters the author and title of the script as the script is being created. The filename field auto-populates from the title. A QFileDialog opens after confirmation so the user chooses the save location before the script is created, this ensures the file has a known file path from the start.</w:t>
+      </w:r>
+    </w:p>
+    <w:p/>
+    <w:p>
+      <w:r>
+        <w:t>The status bar is divided into three zones with:</w:t>
+      </w:r>
+    </w:p>
+    <w:p>
+      <w:pPr>
+        <w:pStyle w:val="ListParagraph"/>
+        <w:numPr>
+          <w:ilvl w:val="0"/>
+          <w:numId w:val="4"/>
+        </w:numPr>
+      </w:pPr>
+      <w:r>
+        <w:t>Word count</w:t>
+      </w:r>
+    </w:p>
+    <w:p>
+      <w:pPr>
+        <w:pStyle w:val="ListParagraph"/>
+        <w:numPr>
+          <w:ilvl w:val="0"/>
+          <w:numId w:val="4"/>
+        </w:numPr>
+      </w:pPr>
+      <w:r>
+        <w:t>Current Element Type</w:t>
+      </w:r>
+    </w:p>
+    <w:p>
+      <w:pPr>
+        <w:pStyle w:val="ListParagraph"/>
+        <w:numPr>
+          <w:ilvl w:val="0"/>
+          <w:numId w:val="4"/>
+        </w:numPr>
+      </w:pPr>
+      <w:r>
+        <w:t>Scene Number</w:t>
+      </w:r>
+    </w:p>
+    <w:p>
+      <w:pPr>
+        <w:pStyle w:val="ListParagraph"/>
+        <w:numPr>
+          <w:ilvl w:val="0"/>
+          <w:numId w:val="4"/>
+        </w:numPr>
+      </w:pPr>
+      <w:r>
+        <w:t>Page Count</w:t>
+      </w:r>
+    </w:p>
+    <w:p/>
+    <w:p>
+      <w:r>
+        <w:t xml:space="preserve">The element type label required an event filter to respond to mouse clicks since QLabel has no clicked signal. A MouseButtonPress triggers an element type picker menu to appear. </w:t>
+      </w:r>
+    </w:p>
+    <w:p/>
+    <w:p>
+      <w:r>
+        <w:t>The element type picker menu appears in two places:</w:t>
+      </w:r>
+    </w:p>
+    <w:p>
+      <w:pPr>
+        <w:pStyle w:val="ListParagraph"/>
+        <w:numPr>
+          <w:ilvl w:val="0"/>
+          <w:numId w:val="4"/>
+        </w:numPr>
+      </w:pPr>
+      <w:r>
+        <w:t>Below the status bar label.</w:t>
+      </w:r>
+    </w:p>
+    <w:p>
+      <w:pPr>
+        <w:pStyle w:val="ListParagraph"/>
+        <w:numPr>
+          <w:ilvl w:val="0"/>
+          <w:numId w:val="4"/>
+        </w:numPr>
+      </w:pPr>
+      <w:r>
+        <w:t>Inline at the cursor position.</w:t>
+      </w:r>
+    </w:p>
+    <w:p>
+      <w:r>
+        <w:t>The editor popup only appears when the user presses Enter when the current line is empty. When the user presses Enter on a line with content, the normal context aware element type transition occurs instead.</w:t>
+      </w:r>
+    </w:p>
+    <w:p/>
+    <w:p>
+      <w:r>
+        <w:t>QMenu handles arrow key navigation natively but not Tab. An event filter was installed on the menu object to intercept Tab key presses and manually advance the active action.</w:t>
+      </w:r>
+    </w:p>
+    <w:p/>
+    <w:p>
+      <w:r>
+        <w:rPr>
+          <w:noProof/>
+        </w:rPr>
+        <w:lastRenderedPageBreak/>
+        <w:drawing>
+          <wp:anchor distT="0" distB="0" distL="114300" distR="114300" simplePos="0" relativeHeight="251661312" behindDoc="0" locked="0" layoutInCell="1" allowOverlap="1" wp14:anchorId="51BC6C40" wp14:editId="36CB56F4">
+            <wp:simplePos x="0" y="0"/>
+            <wp:positionH relativeFrom="column">
+              <wp:posOffset>481330</wp:posOffset>
+            </wp:positionH>
+            <wp:positionV relativeFrom="paragraph">
+              <wp:posOffset>3175</wp:posOffset>
+            </wp:positionV>
+            <wp:extent cx="4699635" cy="3543300"/>
+            <wp:effectExtent l="19050" t="19050" r="24765" b="19050"/>
+            <wp:wrapTopAndBottom/>
+            <wp:docPr id="679771439" name="Picture 10"/>
+            <wp:cNvGraphicFramePr>
+              <a:graphicFrameLocks xmlns:a="http://schemas.openxmlformats.org/drawingml/2006/main" noChangeAspect="1"/>
+            </wp:cNvGraphicFramePr>
+            <a:graphic xmlns:a="http://schemas.openxmlformats.org/drawingml/2006/main">
+              <a:graphicData uri="http://schemas.openxmlformats.org/drawingml/2006/picture">
+                <pic:pic xmlns:pic="http://schemas.openxmlformats.org/drawingml/2006/picture">
+                  <pic:nvPicPr>
+                    <pic:cNvPr id="0" name="Picture 4"/>
+                    <pic:cNvPicPr>
+                      <a:picLocks noChangeAspect="1" noChangeArrowheads="1"/>
+                    </pic:cNvPicPr>
+                  </pic:nvPicPr>
+                  <pic:blipFill>
+                    <a:blip r:embed="rId19" cstate="print">
+                      <a:extLst>
+                        <a:ext uri="{28A0092B-C50C-407E-A947-70E740481C1C}">
+                          <a14:useLocalDpi xmlns:a14="http://schemas.microsoft.com/office/drawing/2010/main" val="0"/>
+                        </a:ext>
+                      </a:extLst>
+                    </a:blip>
+                    <a:srcRect/>
+                    <a:stretch>
+                      <a:fillRect/>
+                    </a:stretch>
+                  </pic:blipFill>
+                  <pic:spPr bwMode="auto">
+                    <a:xfrm>
+                      <a:off x="0" y="0"/>
+                      <a:ext cx="4699635" cy="3543300"/>
+                    </a:xfrm>
+                    <a:prstGeom prst="rect">
+                      <a:avLst/>
+                    </a:prstGeom>
+                    <a:noFill/>
+                    <a:ln>
+                      <a:solidFill>
+                        <a:schemeClr val="tx1"/>
+                      </a:solidFill>
+                    </a:ln>
+                  </pic:spPr>
+                </pic:pic>
+              </a:graphicData>
+            </a:graphic>
+            <wp14:sizeRelH relativeFrom="page">
+              <wp14:pctWidth>0</wp14:pctWidth>
+            </wp14:sizeRelH>
+            <wp14:sizeRelV relativeFrom="page">
+              <wp14:pctHeight>0</wp14:pctHeight>
+            </wp14:sizeRelV>
+          </wp:anchor>
+        </w:drawing>
+      </w:r>
+    </w:p>
+    <w:p/>
+    <w:p>
       <w:pPr>
         <w:pStyle w:val="Heading2"/>
       </w:pPr>
@@ -7812,44 +8025,41 @@
       </w:r>
       <w:proofErr w:type="spellEnd"/>
       <w:r>
-        <w:t xml:space="preserve">”. “CMAKE_AUTOMOC” is enabled in the test CMake </w:t>
-      </w:r>
-      <w:r>
+        <w:t xml:space="preserve">”. “CMAKE_AUTOMOC” is enabled in the test CMake configuration to allow Qt’s meta object compiler to process the test class, which is required for the Q_OBJECT macro used by Qt Test’s test runner. </w:t>
+      </w:r>
+    </w:p>
+    <w:p/>
+    <w:p>
+      <w:pPr>
+        <w:pStyle w:val="Heading3"/>
+      </w:pPr>
+      <w:r>
+        <w:t>4.7.2 Model Layer Tests</w:t>
+      </w:r>
+    </w:p>
+    <w:p>
+      <w:r>
+        <w:t>Fourteen</w:t>
+      </w:r>
+      <w:r>
+        <w:t xml:space="preserve"> </w:t>
+      </w:r>
+      <w:r>
+        <w:t xml:space="preserve">unit tests were written covering all three model classes. The tests verify that constructors produce correct default values, that “getters and setters” behave correctly and that edge cases leave the data unchanged. All </w:t>
+      </w:r>
+      <w:r>
+        <w:t>fourteen</w:t>
+      </w:r>
+      <w:r>
+        <w:t xml:space="preserve"> tests pass.</w:t>
+      </w:r>
+    </w:p>
+    <w:p>
+      <w:r>
+        <w:rPr>
+          <w:noProof/>
+        </w:rPr>
         <w:lastRenderedPageBreak/>
-        <w:t xml:space="preserve">configuration to allow Qt’s meta object compiler to process the test class, which is required for the Q_OBJECT macro used by Qt Test’s test runner. </w:t>
-      </w:r>
-    </w:p>
-    <w:p/>
-    <w:p>
-      <w:pPr>
-        <w:pStyle w:val="Heading3"/>
-      </w:pPr>
-      <w:r>
-        <w:t>4.7.2 Model Layer Tests</w:t>
-      </w:r>
-    </w:p>
-    <w:p>
-      <w:r>
-        <w:t>Fourteen</w:t>
-      </w:r>
-      <w:r>
-        <w:t xml:space="preserve"> </w:t>
-      </w:r>
-      <w:r>
-        <w:t xml:space="preserve">unit tests were written covering all three model classes. The tests verify that constructors produce correct default values, that “getters and setters” behave correctly and that edge cases leave the data unchanged. All </w:t>
-      </w:r>
-      <w:r>
-        <w:t>fourteen</w:t>
-      </w:r>
-      <w:r>
-        <w:t xml:space="preserve"> tests pass.</w:t>
-      </w:r>
-    </w:p>
-    <w:p>
-      <w:r>
-        <w:rPr>
-          <w:noProof/>
-        </w:rPr>
         <w:drawing>
           <wp:anchor distT="0" distB="0" distL="114300" distR="114300" simplePos="0" relativeHeight="251658240" behindDoc="0" locked="0" layoutInCell="1" allowOverlap="1" wp14:anchorId="04256252" wp14:editId="5C2ABA4B">
             <wp:simplePos x="0" y="0"/>
@@ -7876,7 +8086,7 @@
                     </pic:cNvPicPr>
                   </pic:nvPicPr>
                   <pic:blipFill>
-                    <a:blip r:embed="rId19">
+                    <a:blip r:embed="rId20">
                       <a:extLst>
                         <a:ext uri="{28A0092B-C50C-407E-A947-70E740481C1C}">
                           <a14:useLocalDpi xmlns:a14="http://schemas.microsoft.com/office/drawing/2010/main" val="0"/>
@@ -7962,11 +8172,49 @@
     </w:p>
     <w:p>
       <w:r>
-        <w:t xml:space="preserve">A decision was required on whether to store scenes as plain values or as unique pointers. The unique pointer approach was considered for consistency with the element ownership model but was rejected as it introduces heap allocation and </w:t>
+        <w:t>A decision was required on whether to store scenes as plain values or as unique pointers. The unique pointer approach was considered for consistency with the element ownership model but was rejected as it introduces heap allocation and pointer indirection with no benefit. Ownership is already enforced by containment in the vector. The decision was documented explicitly to distinguish between unique pointers used to solve a technical problem versus unique pointers used as a style choice.</w:t>
+      </w:r>
+    </w:p>
+    <w:p/>
+    <w:p>
+      <w:pPr>
+        <w:pStyle w:val="Heading3"/>
+      </w:pPr>
+      <w:r>
+        <w:t>4.8.3 Qt Test .moc include</w:t>
+      </w:r>
+    </w:p>
+    <w:p>
+      <w:r>
+        <w:t xml:space="preserve">When setting up Qt Test, the generated .moc file was initially included as </w:t>
+      </w:r>
+      <w:proofErr w:type="spellStart"/>
+      <w:r>
+        <w:t>testModelLayer.cpp.moc</w:t>
+      </w:r>
+      <w:proofErr w:type="spellEnd"/>
+      <w:r>
+        <w:t xml:space="preserve"> following older Qt documentation. Qt 6 with </w:t>
       </w:r>
       <w:r>
         <w:lastRenderedPageBreak/>
-        <w:t>pointer indirection with no benefit. Ownership is already enforced by containment in the vector. The decision was documented explicitly to distinguish between unique pointers used to solve a technical problem versus unique pointers used as a style choice.</w:t>
+        <w:t xml:space="preserve">CMAKE_AUTOMOC expects </w:t>
+      </w:r>
+      <w:proofErr w:type="spellStart"/>
+      <w:r>
+        <w:t>testModelLayer.moc</w:t>
+      </w:r>
+      <w:proofErr w:type="spellEnd"/>
+      <w:r>
+        <w:t xml:space="preserve"> without the .</w:t>
+      </w:r>
+      <w:proofErr w:type="spellStart"/>
+      <w:r>
+        <w:t>cpp</w:t>
+      </w:r>
+      <w:proofErr w:type="spellEnd"/>
+      <w:r>
+        <w:t xml:space="preserve"> component. Correcting this resolved the build error.</w:t>
       </w:r>
     </w:p>
     <w:p/>
@@ -7975,68 +8223,131 @@
         <w:pStyle w:val="Heading3"/>
       </w:pPr>
       <w:r>
-        <w:t>4.8.3 Qt Test .moc include</w:t>
-      </w:r>
-    </w:p>
-    <w:p>
-      <w:r>
-        <w:t xml:space="preserve">When setting up Qt Test, the generated .moc file was initially included as </w:t>
+        <w:t>4.8.4 Preserving MVVM boundary when connection service layer signals to the View</w:t>
+      </w:r>
+    </w:p>
+    <w:p>
+      <w:r>
+        <w:t xml:space="preserve">Due to the chosen architecture, a challenge arose in determining how ScriptManager’s state change signals would reach the view layer. It was considered to connect them directly to View </w:t>
+      </w:r>
+      <w:r>
+        <w:t>components,</w:t>
+      </w:r>
+      <w:r>
+        <w:t xml:space="preserve"> but this would create a direct dependency on ScriptManager which violates the MVVM boundary.</w:t>
+      </w:r>
+    </w:p>
+    <w:p/>
+    <w:p>
+      <w:r>
+        <w:t xml:space="preserve">The solution here was to connect ScriptManager’s signals to lambda function inside the ScriptViewModel’s constructor. This then translated the service layer signals into view facing signals. The outcome is the MVVM </w:t>
+      </w:r>
+      <w:r>
+        <w:t>boundary</w:t>
+      </w:r>
+      <w:r>
+        <w:t xml:space="preserve"> is kept intact and means the View layer has the single point of contact (ScriptViewModel) regardless of how many service layer classes exist beneath it.</w:t>
+      </w:r>
+    </w:p>
+    <w:p/>
+    <w:p>
+      <w:pPr>
+        <w:pStyle w:val="Heading3"/>
+      </w:pPr>
+      <w:r>
+        <w:t>4.8.5 MVVM boundary violation in SceneNavigator</w:t>
+      </w:r>
+    </w:p>
+    <w:p>
+      <w:r>
+        <w:t xml:space="preserve">During the implementation of SceneNavigator, an issue was identified where the View was using the ViewModel to access ScriptManager and retrieve scene data. The initial implementation called </w:t>
       </w:r>
       <w:proofErr w:type="spellStart"/>
       <w:r>
-        <w:t>testModelLayer.cpp.moc</w:t>
+        <w:t>viewModel</w:t>
       </w:r>
       <w:proofErr w:type="spellEnd"/>
       <w:r>
-        <w:t xml:space="preserve"> following older Qt documentation. Qt 6 with CMAKE_AUTOMOC expects </w:t>
+        <w:t>_-&gt;</w:t>
       </w:r>
       <w:proofErr w:type="spellStart"/>
       <w:r>
-        <w:t>testModelLayer.moc</w:t>
+        <w:t>getScriptManager</w:t>
       </w:r>
       <w:proofErr w:type="spellEnd"/>
       <w:r>
-        <w:t xml:space="preserve"> without the .</w:t>
+        <w:t>()-&gt;getScript-&gt;</w:t>
       </w:r>
       <w:proofErr w:type="spellStart"/>
       <w:r>
-        <w:t>cpp</w:t>
+        <w:t>getScenes</w:t>
       </w:r>
       <w:proofErr w:type="spellEnd"/>
       <w:r>
-        <w:t xml:space="preserve"> component. Correcting this resolved the build error.</w:t>
+        <w:t xml:space="preserve">(). This gave SceneNavigator a direct dependency on ScriptManager and Script which are two layers the View should not have access to. </w:t>
       </w:r>
     </w:p>
     <w:p/>
     <w:p>
+      <w:r>
+        <w:t xml:space="preserve">The fix was to remove </w:t>
+      </w:r>
+      <w:proofErr w:type="spellStart"/>
+      <w:r>
+        <w:t>getScriptManager</w:t>
+      </w:r>
+      <w:proofErr w:type="spellEnd"/>
+      <w:r>
+        <w:t xml:space="preserve">() from ScriptViewModel and replace it with the purpose built method: </w:t>
+      </w:r>
+      <w:proofErr w:type="spellStart"/>
+      <w:r>
+        <w:t>getSceneList</w:t>
+      </w:r>
+      <w:proofErr w:type="spellEnd"/>
+      <w:r>
+        <w:t xml:space="preserve">() which returns a formatted </w:t>
+      </w:r>
+      <w:proofErr w:type="spellStart"/>
+      <w:r>
+        <w:t>QStringList</w:t>
+      </w:r>
+      <w:proofErr w:type="spellEnd"/>
+      <w:r>
+        <w:t>. The View now calls only these methods and has no visibility into the services layer. This correction reinforces the MVVM boundary as the ViewModel is the single point of contact for the View.</w:t>
+      </w:r>
+    </w:p>
+    <w:p/>
+    <w:p>
       <w:pPr>
         <w:pStyle w:val="Heading3"/>
       </w:pPr>
       <w:r>
-        <w:t>4.8.4 Preserving MVVM boundary when connection service layer signals to the View</w:t>
-      </w:r>
-    </w:p>
-    <w:p>
-      <w:r>
-        <w:t xml:space="preserve">Due to the chosen architecture, a challenge arose in determining how ScriptManager’s state change signals would reach the view layer. It was considered to connect them directly to View </w:t>
-      </w:r>
-      <w:r>
-        <w:t>components,</w:t>
-      </w:r>
-      <w:r>
-        <w:t xml:space="preserve"> but this would create a direct dependency on ScriptManager which violates the MVVM boundary.</w:t>
+        <w:t>4.8.6 Locating Scenes in a Continuous Document</w:t>
+      </w:r>
+    </w:p>
+    <w:p>
+      <w:r>
+        <w:t>A challenge arose when implementing scene jump functionality in SceneNavigator. The application needed to scroll ScriptEditor to the correct position when a user clicked a scene in the navigator list. The difficulty was that ScriptEditor operates as a single continuous QTextDocument with no built in concept of scenes. There was no way of the document knowing where a particular scene started.</w:t>
       </w:r>
     </w:p>
     <w:p/>
     <w:p>
       <w:r>
-        <w:t xml:space="preserve">The solution here was to connect ScriptManager’s signals to lambda function inside the ScriptViewModel’s constructor. This then translated the service layer signals into view facing signals. The outcome is the MVVM </w:t>
-      </w:r>
-      <w:r>
-        <w:t>boundary</w:t>
-      </w:r>
-      <w:r>
-        <w:t xml:space="preserve"> is kept intact and means the View layer has the single point of contact (ScriptViewModel) regardless of how many service layer classes exist beneath it.</w:t>
+        <w:t xml:space="preserve">The solution was to register each scene’s starting block in ScriptViewModel </w:t>
+      </w:r>
+      <w:r>
+        <w:t>now</w:t>
+      </w:r>
+      <w:r>
+        <w:t xml:space="preserve"> the scene is created. When the user </w:t>
+      </w:r>
+      <w:r>
+        <w:t xml:space="preserve">presses enter and confirm a scene heading, </w:t>
+      </w:r>
+      <w:r>
+        <w:lastRenderedPageBreak/>
+        <w:t>keyPressEvent captures the current block number before the new block is inserted and calls registerSceneBlock with the scene index and block number. These are stored in a QMap&lt;int, int&gt; which maps scene index to block number. When the user clicks a scene in SceneNavigator, ScriptViewModel emits currentSceneChanged, ScriptEditor looks up the block number and uses findBlockByNumber to locate the correct position moving the cursor there and scrolling the viewport with ensureCursorVisible.</w:t>
       </w:r>
     </w:p>
     <w:p/>
@@ -8045,98 +8356,373 @@
         <w:pStyle w:val="Heading3"/>
       </w:pPr>
       <w:r>
-        <w:t>4.8.5 MVVM boundary violation in SceneNavigator</w:t>
-      </w:r>
-    </w:p>
-    <w:p>
-      <w:r>
-        <w:t xml:space="preserve">During the implementation of SceneNavigator, an issue was identified where the View was using the ViewModel to access ScriptManager and retrieve scene data. The initial implementation called </w:t>
+        <w:t>4.8.7 Making QLabel Interactive with an Event Filter Pattern</w:t>
+      </w:r>
+    </w:p>
+    <w:p>
+      <w:r>
+        <w:t>The status bar element type indicator in MainWindow needed to respond to mouse clicks  to show the element type picker menu. QLabel provides no clicked signal as it is a display widget. Two approaches were considered:</w:t>
+      </w:r>
+    </w:p>
+    <w:p>
+      <w:pPr>
+        <w:pStyle w:val="ListParagraph"/>
+        <w:numPr>
+          <w:ilvl w:val="0"/>
+          <w:numId w:val="4"/>
+        </w:numPr>
+      </w:pPr>
+      <w:r>
+        <w:t>Subclassing QLabel to override mousePressEvent</w:t>
+      </w:r>
+    </w:p>
+    <w:p>
+      <w:pPr>
+        <w:pStyle w:val="ListParagraph"/>
+        <w:numPr>
+          <w:ilvl w:val="0"/>
+          <w:numId w:val="4"/>
+        </w:numPr>
+      </w:pPr>
+      <w:r>
+        <w:t>Installing an event filter on the label from MainWindow</w:t>
+      </w:r>
+    </w:p>
+    <w:p>
+      <w:r>
+        <w:t>The event filter approach was chosen because it keeps all MainWindow interaction logic in one class.</w:t>
+      </w:r>
+    </w:p>
+    <w:p/>
+    <w:p>
+      <w:r>
+        <w:t>The same pattern was applied n ScriptEditor to intercept Tab key presses inside the element picker menu, since QMenu handles arrow key navigation natively but provides no built in Tab cycling behaviour.</w:t>
+      </w:r>
+    </w:p>
+    <w:p/>
+    <w:p>
+      <w:pPr>
+        <w:pStyle w:val="Heading3"/>
+      </w:pPr>
+      <w:r>
+        <w:t>4.8.8 NewScriptDialog: Conflicting signal connections and redesign</w:t>
+      </w:r>
+    </w:p>
+    <w:p>
+      <w:r>
+        <w:t xml:space="preserve">The initial implementation of NewScriptDialog contained a bug where the accepted signal of </w:t>
       </w:r>
       <w:proofErr w:type="spellStart"/>
       <w:r>
-        <w:t>viewModel</w:t>
+        <w:t>QDialogButtonBox</w:t>
       </w:r>
       <w:proofErr w:type="spellEnd"/>
       <w:r>
-        <w:t>_-&gt;</w:t>
+        <w:t xml:space="preserve"> was incorrectly connected to </w:t>
       </w:r>
       <w:proofErr w:type="spellStart"/>
       <w:r>
-        <w:t>getScriptManager</w:t>
+        <w:t>QDialog</w:t>
       </w:r>
       <w:proofErr w:type="spellEnd"/>
       <w:r>
-        <w:t>()-&gt;getScript-&gt;</w:t>
+        <w:t xml:space="preserve">::reject rather than </w:t>
       </w:r>
       <w:proofErr w:type="spellStart"/>
       <w:r>
-        <w:t>getScenes</w:t>
+        <w:t>QDialog</w:t>
       </w:r>
       <w:proofErr w:type="spellEnd"/>
       <w:r>
-        <w:t xml:space="preserve">(). This gave SceneNavigator a direct dependency on ScriptManager and Script which are two layers the View should not have access to. </w:t>
+        <w:t>::</w:t>
+      </w:r>
+      <w:proofErr w:type="spellStart"/>
+      <w:r>
+        <w:t>rejejected</w:t>
+      </w:r>
+      <w:proofErr w:type="spellEnd"/>
+      <w:r>
+        <w:t xml:space="preserve">. This meant that clicking OK triggered </w:t>
+      </w:r>
+      <w:proofErr w:type="spellStart"/>
+      <w:r>
+        <w:t>onAccepted</w:t>
+      </w:r>
+      <w:proofErr w:type="spellEnd"/>
+      <w:r>
+        <w:t xml:space="preserve"> and reject. Since reject fired after </w:t>
+      </w:r>
+      <w:proofErr w:type="gramStart"/>
+      <w:r>
+        <w:t>accept</w:t>
+      </w:r>
+      <w:proofErr w:type="gramEnd"/>
+      <w:r>
+        <w:t xml:space="preserve">, the dialog was always Rejected. </w:t>
+      </w:r>
+      <w:proofErr w:type="gramStart"/>
+      <w:r>
+        <w:t>As A consequence</w:t>
+      </w:r>
+      <w:proofErr w:type="gramEnd"/>
+      <w:r>
+        <w:t>, MainWindow::</w:t>
+      </w:r>
+      <w:proofErr w:type="spellStart"/>
+      <w:r>
+        <w:t>onNewScript</w:t>
+      </w:r>
+      <w:proofErr w:type="spellEnd"/>
+      <w:r>
+        <w:t xml:space="preserve"> never saw </w:t>
+      </w:r>
+      <w:proofErr w:type="spellStart"/>
+      <w:r>
+        <w:t>QDialog</w:t>
+      </w:r>
+      <w:proofErr w:type="spellEnd"/>
+      <w:r>
+        <w:t>::Accepted, no script was created and the scene navigator always appeared empty. The bug was identified by tracing the signal chain from the button click to ScriptManager::</w:t>
+      </w:r>
+      <w:proofErr w:type="spellStart"/>
+      <w:r>
+        <w:t>hasScript</w:t>
+      </w:r>
+      <w:proofErr w:type="spellEnd"/>
+      <w:r>
+        <w:t xml:space="preserve">. </w:t>
       </w:r>
     </w:p>
     <w:p/>
     <w:p>
       <w:r>
-        <w:t xml:space="preserve">The fix was to remove </w:t>
-      </w:r>
-      <w:proofErr w:type="spellStart"/>
-      <w:r>
-        <w:t>getScriptManager</w:t>
-      </w:r>
-      <w:proofErr w:type="spellEnd"/>
-      <w:r>
-        <w:t xml:space="preserve">() from ScriptViewModel and replace it with the purpose built method: </w:t>
-      </w:r>
-      <w:proofErr w:type="spellStart"/>
-      <w:r>
-        <w:t>getSceneList</w:t>
-      </w:r>
-      <w:proofErr w:type="spellEnd"/>
-      <w:r>
-        <w:t xml:space="preserve">() which returns a formatted </w:t>
-      </w:r>
-      <w:proofErr w:type="spellStart"/>
-      <w:r>
-        <w:t>QStringList</w:t>
-      </w:r>
-      <w:proofErr w:type="spellEnd"/>
-      <w:r>
-        <w:t>. The View now calls only these methods and has no visibility into the services layer. This correction reinforces the MVVM boundary as the ViewModel is the single point of contact for the View.</w:t>
+        <w:t>Rather than correcting the signal connection, the dialog was redesigned to address a deeper structural problem. The original design had inputs for the title, author and filename. This introduced unnecessary complexity. The redesign flow separates the metadata collection and file location selection into two sequential steps.</w:t>
       </w:r>
     </w:p>
     <w:p/>
     <w:p>
-      <w:pPr>
-        <w:pStyle w:val="Heading3"/>
-      </w:pPr>
-      <w:r>
+      <w:r>
+        <w:t>The following images show the before and after in relation to the scene navigator as well as the updated dialog:</w:t>
+      </w:r>
+    </w:p>
+    <w:p>
+      <w:r>
+        <w:rPr>
+          <w:noProof/>
+        </w:rPr>
         <w:lastRenderedPageBreak/>
-        <w:t>4.8.6 Locating Scenes in a Continuous Document</w:t>
-      </w:r>
-    </w:p>
-    <w:p>
-      <w:r>
-        <w:t>A challenge arose when implementing scene jump functionality in SceneNavigator. The application needed to scroll ScriptEditor to the correct position when a user clicked a scene in the navigator list. The difficulty was that ScriptEditor operates as a single continuous QTextDocument with no built in concept of scenes. There was no way of the document knowing where a particular scene started.</w:t>
+        <w:drawing>
+          <wp:anchor distT="0" distB="0" distL="114300" distR="114300" simplePos="0" relativeHeight="251662336" behindDoc="0" locked="0" layoutInCell="1" allowOverlap="1" wp14:anchorId="7381ECD9" wp14:editId="3E81B091">
+            <wp:simplePos x="0" y="0"/>
+            <wp:positionH relativeFrom="margin">
+              <wp:align>center</wp:align>
+            </wp:positionH>
+            <wp:positionV relativeFrom="paragraph">
+              <wp:posOffset>269875</wp:posOffset>
+            </wp:positionV>
+            <wp:extent cx="4838700" cy="3364865"/>
+            <wp:effectExtent l="19050" t="19050" r="19050" b="26035"/>
+            <wp:wrapTopAndBottom/>
+            <wp:docPr id="1729148777" name="Picture 11"/>
+            <wp:cNvGraphicFramePr>
+              <a:graphicFrameLocks xmlns:a="http://schemas.openxmlformats.org/drawingml/2006/main" noChangeAspect="1"/>
+            </wp:cNvGraphicFramePr>
+            <a:graphic xmlns:a="http://schemas.openxmlformats.org/drawingml/2006/main">
+              <a:graphicData uri="http://schemas.openxmlformats.org/drawingml/2006/picture">
+                <pic:pic xmlns:pic="http://schemas.openxmlformats.org/drawingml/2006/picture">
+                  <pic:nvPicPr>
+                    <pic:cNvPr id="0" name="Picture 5"/>
+                    <pic:cNvPicPr>
+                      <a:picLocks noChangeAspect="1" noChangeArrowheads="1"/>
+                    </pic:cNvPicPr>
+                  </pic:nvPicPr>
+                  <pic:blipFill>
+                    <a:blip r:embed="rId21">
+                      <a:extLst>
+                        <a:ext uri="{28A0092B-C50C-407E-A947-70E740481C1C}">
+                          <a14:useLocalDpi xmlns:a14="http://schemas.microsoft.com/office/drawing/2010/main" val="0"/>
+                        </a:ext>
+                      </a:extLst>
+                    </a:blip>
+                    <a:srcRect/>
+                    <a:stretch>
+                      <a:fillRect/>
+                    </a:stretch>
+                  </pic:blipFill>
+                  <pic:spPr bwMode="auto">
+                    <a:xfrm>
+                      <a:off x="0" y="0"/>
+                      <a:ext cx="4838700" cy="3364865"/>
+                    </a:xfrm>
+                    <a:prstGeom prst="rect">
+                      <a:avLst/>
+                    </a:prstGeom>
+                    <a:noFill/>
+                    <a:ln>
+                      <a:solidFill>
+                        <a:schemeClr val="tx1"/>
+                      </a:solidFill>
+                    </a:ln>
+                  </pic:spPr>
+                </pic:pic>
+              </a:graphicData>
+            </a:graphic>
+            <wp14:sizeRelH relativeFrom="page">
+              <wp14:pctWidth>0</wp14:pctWidth>
+            </wp14:sizeRelH>
+            <wp14:sizeRelV relativeFrom="page">
+              <wp14:pctHeight>0</wp14:pctHeight>
+            </wp14:sizeRelV>
+          </wp:anchor>
+        </w:drawing>
+      </w:r>
+    </w:p>
+    <w:p>
+      <w:r>
+        <w:rPr>
+          <w:noProof/>
+        </w:rPr>
+        <w:drawing>
+          <wp:anchor distT="0" distB="0" distL="114300" distR="114300" simplePos="0" relativeHeight="251663360" behindDoc="0" locked="0" layoutInCell="1" allowOverlap="1" wp14:anchorId="30358E1C" wp14:editId="6CB0A531">
+            <wp:simplePos x="0" y="0"/>
+            <wp:positionH relativeFrom="page">
+              <wp:align>center</wp:align>
+            </wp:positionH>
+            <wp:positionV relativeFrom="paragraph">
+              <wp:posOffset>3754120</wp:posOffset>
+            </wp:positionV>
+            <wp:extent cx="5008880" cy="3171825"/>
+            <wp:effectExtent l="19050" t="19050" r="20320" b="28575"/>
+            <wp:wrapTopAndBottom/>
+            <wp:docPr id="485814513" name="Picture 12"/>
+            <wp:cNvGraphicFramePr>
+              <a:graphicFrameLocks xmlns:a="http://schemas.openxmlformats.org/drawingml/2006/main" noChangeAspect="1"/>
+            </wp:cNvGraphicFramePr>
+            <a:graphic xmlns:a="http://schemas.openxmlformats.org/drawingml/2006/main">
+              <a:graphicData uri="http://schemas.openxmlformats.org/drawingml/2006/picture">
+                <pic:pic xmlns:pic="http://schemas.openxmlformats.org/drawingml/2006/picture">
+                  <pic:nvPicPr>
+                    <pic:cNvPr id="0" name="Picture 6"/>
+                    <pic:cNvPicPr>
+                      <a:picLocks noChangeAspect="1" noChangeArrowheads="1"/>
+                    </pic:cNvPicPr>
+                  </pic:nvPicPr>
+                  <pic:blipFill>
+                    <a:blip r:embed="rId22">
+                      <a:extLst>
+                        <a:ext uri="{28A0092B-C50C-407E-A947-70E740481C1C}">
+                          <a14:useLocalDpi xmlns:a14="http://schemas.microsoft.com/office/drawing/2010/main" val="0"/>
+                        </a:ext>
+                      </a:extLst>
+                    </a:blip>
+                    <a:srcRect/>
+                    <a:stretch>
+                      <a:fillRect/>
+                    </a:stretch>
+                  </pic:blipFill>
+                  <pic:spPr bwMode="auto">
+                    <a:xfrm>
+                      <a:off x="0" y="0"/>
+                      <a:ext cx="5008880" cy="3171825"/>
+                    </a:xfrm>
+                    <a:prstGeom prst="rect">
+                      <a:avLst/>
+                    </a:prstGeom>
+                    <a:noFill/>
+                    <a:ln>
+                      <a:solidFill>
+                        <a:schemeClr val="tx1"/>
+                      </a:solidFill>
+                    </a:ln>
+                  </pic:spPr>
+                </pic:pic>
+              </a:graphicData>
+            </a:graphic>
+            <wp14:sizeRelH relativeFrom="page">
+              <wp14:pctWidth>0</wp14:pctWidth>
+            </wp14:sizeRelH>
+            <wp14:sizeRelV relativeFrom="page">
+              <wp14:pctHeight>0</wp14:pctHeight>
+            </wp14:sizeRelV>
+          </wp:anchor>
+        </w:drawing>
       </w:r>
     </w:p>
     <w:p/>
     <w:p>
       <w:r>
-        <w:t xml:space="preserve">The solution was to register each scene’s starting block in ScriptViewModel </w:t>
-      </w:r>
-      <w:r>
-        <w:t>now</w:t>
-      </w:r>
-      <w:r>
-        <w:t xml:space="preserve"> the scene is created. When the user </w:t>
-      </w:r>
-      <w:r>
-        <w:t>presses enter and confirm a scene heading, keyPressEvent captures the current block number before the new block is inserted and calls registerSceneBlock with the scene index and block number. These are stored in a QMap&lt;int, int&gt; which maps scene index to block number. When the user clicks a scene in SceneNavigator, ScriptViewModel emits currentSceneChanged, ScriptEditor looks up the block number and uses findBlockByNumber to locate the correct position moving the cursor there and scrolling the viewport with ensureCursorVisible.</w:t>
-      </w:r>
-    </w:p>
+        <w:rPr>
+          <w:noProof/>
+        </w:rPr>
+        <w:lastRenderedPageBreak/>
+        <w:drawing>
+          <wp:anchor distT="0" distB="0" distL="114300" distR="114300" simplePos="0" relativeHeight="251664384" behindDoc="0" locked="0" layoutInCell="1" allowOverlap="1" wp14:anchorId="30A0F012" wp14:editId="2D053808">
+            <wp:simplePos x="0" y="0"/>
+            <wp:positionH relativeFrom="page">
+              <wp:align>center</wp:align>
+            </wp:positionH>
+            <wp:positionV relativeFrom="paragraph">
+              <wp:posOffset>250825</wp:posOffset>
+            </wp:positionV>
+            <wp:extent cx="3171825" cy="1162050"/>
+            <wp:effectExtent l="19050" t="19050" r="28575" b="19050"/>
+            <wp:wrapTopAndBottom/>
+            <wp:docPr id="1561204664" name="Picture 13"/>
+            <wp:cNvGraphicFramePr>
+              <a:graphicFrameLocks xmlns:a="http://schemas.openxmlformats.org/drawingml/2006/main" noChangeAspect="1"/>
+            </wp:cNvGraphicFramePr>
+            <a:graphic xmlns:a="http://schemas.openxmlformats.org/drawingml/2006/main">
+              <a:graphicData uri="http://schemas.openxmlformats.org/drawingml/2006/picture">
+                <pic:pic xmlns:pic="http://schemas.openxmlformats.org/drawingml/2006/picture">
+                  <pic:nvPicPr>
+                    <pic:cNvPr id="0" name="Picture 7"/>
+                    <pic:cNvPicPr>
+                      <a:picLocks noChangeAspect="1" noChangeArrowheads="1"/>
+                    </pic:cNvPicPr>
+                  </pic:nvPicPr>
+                  <pic:blipFill>
+                    <a:blip r:embed="rId23">
+                      <a:extLst>
+                        <a:ext uri="{28A0092B-C50C-407E-A947-70E740481C1C}">
+                          <a14:useLocalDpi xmlns:a14="http://schemas.microsoft.com/office/drawing/2010/main" val="0"/>
+                        </a:ext>
+                      </a:extLst>
+                    </a:blip>
+                    <a:srcRect/>
+                    <a:stretch>
+                      <a:fillRect/>
+                    </a:stretch>
+                  </pic:blipFill>
+                  <pic:spPr bwMode="auto">
+                    <a:xfrm>
+                      <a:off x="0" y="0"/>
+                      <a:ext cx="3171825" cy="1162050"/>
+                    </a:xfrm>
+                    <a:prstGeom prst="rect">
+                      <a:avLst/>
+                    </a:prstGeom>
+                    <a:noFill/>
+                    <a:ln>
+                      <a:solidFill>
+                        <a:schemeClr val="tx1"/>
+                      </a:solidFill>
+                    </a:ln>
+                  </pic:spPr>
+                </pic:pic>
+              </a:graphicData>
+            </a:graphic>
+            <wp14:sizeRelH relativeFrom="page">
+              <wp14:pctWidth>0</wp14:pctWidth>
+            </wp14:sizeRelH>
+            <wp14:sizeRelV relativeFrom="page">
+              <wp14:pctHeight>0</wp14:pctHeight>
+            </wp14:sizeRelV>
+          </wp:anchor>
+        </w:drawing>
+      </w:r>
+    </w:p>
+    <w:p/>
+    <w:p/>
     <w:p/>
     <w:p>
       <w:pPr>
@@ -8495,7 +9081,7 @@
         </w:rPr>
         <w:br/>
       </w:r>
-      <w:hyperlink r:id="rId20">
+      <w:hyperlink r:id="rId24">
         <w:r>
           <w:rPr>
             <w:rStyle w:val="Hyperlink"/>
@@ -8650,7 +9236,7 @@
         </w:rPr>
         <w:t xml:space="preserve"> </w:t>
       </w:r>
-      <w:hyperlink r:id="rId21">
+      <w:hyperlink r:id="rId25">
         <w:r>
           <w:rPr>
             <w:rStyle w:val="Hyperlink"/>
@@ -8683,12 +9269,12 @@
         <w:pStyle w:val="Heading1"/>
         <w:jc w:val="center"/>
         <w:sectPr>
-          <w:headerReference w:type="even" r:id="rId22"/>
-          <w:headerReference w:type="default" r:id="rId23"/>
-          <w:footerReference w:type="even" r:id="rId24"/>
-          <w:footerReference w:type="default" r:id="rId25"/>
-          <w:headerReference w:type="first" r:id="rId26"/>
-          <w:footerReference w:type="first" r:id="rId27"/>
+          <w:headerReference w:type="even" r:id="rId26"/>
+          <w:headerReference w:type="default" r:id="rId27"/>
+          <w:footerReference w:type="even" r:id="rId28"/>
+          <w:footerReference w:type="default" r:id="rId29"/>
+          <w:headerReference w:type="first" r:id="rId30"/>
+          <w:footerReference w:type="first" r:id="rId31"/>
           <w:pgSz w:w="11906" w:h="16838"/>
           <w:pgMar w:top="2155" w:right="1418" w:bottom="2155" w:left="1814" w:header="709" w:footer="709" w:gutter="0"/>
           <w:pgNumType w:start="1"/>
@@ -8776,12 +9362,12 @@
           <w:szCs w:val="28"/>
         </w:rPr>
         <w:sectPr>
-          <w:headerReference w:type="even" r:id="rId28"/>
-          <w:headerReference w:type="default" r:id="rId29"/>
-          <w:footerReference w:type="even" r:id="rId30"/>
-          <w:footerReference w:type="default" r:id="rId31"/>
-          <w:headerReference w:type="first" r:id="rId32"/>
-          <w:footerReference w:type="first" r:id="rId33"/>
+          <w:headerReference w:type="even" r:id="rId32"/>
+          <w:headerReference w:type="default" r:id="rId33"/>
+          <w:footerReference w:type="even" r:id="rId34"/>
+          <w:footerReference w:type="default" r:id="rId35"/>
+          <w:headerReference w:type="first" r:id="rId36"/>
+          <w:footerReference w:type="first" r:id="rId37"/>
           <w:pgSz w:w="11906" w:h="16838"/>
           <w:pgMar w:top="2155" w:right="1418" w:bottom="2155" w:left="1814" w:header="709" w:footer="709" w:gutter="0"/>
           <w:pgNumType w:fmt="upperLetter" w:start="1"/>
@@ -9029,12 +9615,12 @@
           <w:rFonts w:cs="Arial"/>
         </w:rPr>
         <w:sectPr>
-          <w:headerReference w:type="even" r:id="rId34"/>
-          <w:headerReference w:type="default" r:id="rId35"/>
-          <w:footerReference w:type="even" r:id="rId36"/>
-          <w:footerReference w:type="default" r:id="rId37"/>
-          <w:headerReference w:type="first" r:id="rId38"/>
-          <w:footerReference w:type="first" r:id="rId39"/>
+          <w:headerReference w:type="even" r:id="rId38"/>
+          <w:headerReference w:type="default" r:id="rId39"/>
+          <w:footerReference w:type="even" r:id="rId40"/>
+          <w:footerReference w:type="default" r:id="rId41"/>
+          <w:headerReference w:type="first" r:id="rId42"/>
+          <w:footerReference w:type="first" r:id="rId43"/>
           <w:pgSz w:w="11906" w:h="16838"/>
           <w:pgMar w:top="2155" w:right="1418" w:bottom="2155" w:left="1814" w:header="709" w:footer="709" w:gutter="0"/>
           <w:cols w:space="720"/>
@@ -9065,12 +9651,12 @@
     </w:p>
     <w:p/>
     <w:sectPr>
-      <w:headerReference w:type="even" r:id="rId40"/>
-      <w:headerReference w:type="default" r:id="rId41"/>
-      <w:footerReference w:type="even" r:id="rId42"/>
-      <w:footerReference w:type="default" r:id="rId43"/>
-      <w:headerReference w:type="first" r:id="rId44"/>
-      <w:footerReference w:type="first" r:id="rId45"/>
+      <w:headerReference w:type="even" r:id="rId44"/>
+      <w:headerReference w:type="default" r:id="rId45"/>
+      <w:footerReference w:type="even" r:id="rId46"/>
+      <w:footerReference w:type="default" r:id="rId47"/>
+      <w:headerReference w:type="first" r:id="rId48"/>
+      <w:footerReference w:type="first" r:id="rId49"/>
       <w:pgSz w:w="11906" w:h="16838"/>
       <w:pgMar w:top="2155" w:right="1418" w:bottom="2155" w:left="1814" w:header="709" w:footer="709" w:gutter="0"/>
       <w:pgNumType w:fmt="upperLetter"/>

</xml_diff>

<commit_message>
fix: element type state conflation
</commit_message>
<xml_diff>
--- a/Documentation/report_2/COM629_DIS_AE2_Oliver_Myers.docx
+++ b/Documentation/report_2/COM629_DIS_AE2_Oliver_Myers.docx
@@ -570,27 +570,7 @@
           <w:iCs/>
           <w:color w:val="FF0000"/>
         </w:rPr>
-        <w:t xml:space="preserve">Write a paragraph here acknowledging everyone who has helped you while you have been preparing the content of your dissertation. This may be your supervisor or other academic staff who have provided guidance and support, other students or colleagues you have worked with on any research or project work, interviewees, librarians, or any external bodies that have given </w:t>
-      </w:r>
-      <w:proofErr w:type="spellStart"/>
-      <w:r>
-        <w:rPr>
-          <w:rFonts w:cs="Arial"/>
-          <w:i w:val="0"/>
-          <w:iCs/>
-          <w:color w:val="FF0000"/>
-        </w:rPr>
-        <w:t>you</w:t>
-      </w:r>
-      <w:proofErr w:type="spellEnd"/>
-      <w:r>
-        <w:rPr>
-          <w:rFonts w:cs="Arial"/>
-          <w:i w:val="0"/>
-          <w:iCs/>
-          <w:color w:val="FF0000"/>
-        </w:rPr>
-        <w:t xml:space="preserve"> assistance, such as access to data or opportunities for hands-on experience.</w:t>
+        <w:t>Write a paragraph here acknowledging everyone who has helped you while you have been preparing the content of your dissertation. This may be your supervisor or other academic staff who have provided guidance and support, other students or colleagues you have worked with on any research or project work, interviewees, librarians, or any external bodies that have given you assistance, such as access to data or opportunities for hands-on experience.</w:t>
       </w:r>
     </w:p>
     <w:p>
@@ -8009,23 +7989,7 @@
     </w:p>
     <w:p>
       <w:r>
-        <w:t>Unit Tests were written using Qt Test which is Qt’s built in testing framework. This integrates directly with Qt Creator and CMake. A separate test target “</w:t>
-      </w:r>
-      <w:proofErr w:type="spellStart"/>
-      <w:r>
-        <w:t>tst_modellayer</w:t>
-      </w:r>
-      <w:proofErr w:type="spellEnd"/>
-      <w:r>
-        <w:t>” was configured in a dedicated tests directory with its own “CMakeLists.txt”. There are additional test targets for different layer testing. The model source files are compiled directly into the test executable using “</w:t>
-      </w:r>
-      <w:proofErr w:type="spellStart"/>
-      <w:r>
-        <w:t>target_sources</w:t>
-      </w:r>
-      <w:proofErr w:type="spellEnd"/>
-      <w:r>
-        <w:t xml:space="preserve">”. “CMAKE_AUTOMOC” is enabled in the test CMake configuration to allow Qt’s meta object compiler to process the test class, which is required for the Q_OBJECT macro used by Qt Test’s test runner. </w:t>
+        <w:t xml:space="preserve">Unit Tests were written using Qt Test which is Qt’s built in testing framework. This integrates directly with Qt Creator and CMake. A separate test target “tst_modellayer” was configured in a dedicated tests directory with its own “CMakeLists.txt”. There are additional test targets for different layer testing. The model source files are compiled directly into the test executable using “target_sources”. “CMAKE_AUTOMOC” is enabled in the test CMake configuration to allow Qt’s meta object compiler to process the test class, which is required for the Q_OBJECT macro used by Qt Test’s test runner. </w:t>
       </w:r>
     </w:p>
     <w:p/>
@@ -8186,35 +8150,11 @@
     </w:p>
     <w:p>
       <w:r>
-        <w:t xml:space="preserve">When setting up Qt Test, the generated .moc file was initially included as </w:t>
-      </w:r>
-      <w:proofErr w:type="spellStart"/>
-      <w:r>
-        <w:t>testModelLayer.cpp.moc</w:t>
-      </w:r>
-      <w:proofErr w:type="spellEnd"/>
-      <w:r>
-        <w:t xml:space="preserve"> following older Qt documentation. Qt 6 with </w:t>
+        <w:t xml:space="preserve">When setting up Qt Test, the generated .moc file was initially included as testModelLayer.cpp.moc following older Qt documentation. Qt 6 with </w:t>
       </w:r>
       <w:r>
         <w:lastRenderedPageBreak/>
-        <w:t xml:space="preserve">CMAKE_AUTOMOC expects </w:t>
-      </w:r>
-      <w:proofErr w:type="spellStart"/>
-      <w:r>
-        <w:t>testModelLayer.moc</w:t>
-      </w:r>
-      <w:proofErr w:type="spellEnd"/>
-      <w:r>
-        <w:t xml:space="preserve"> without the .</w:t>
-      </w:r>
-      <w:proofErr w:type="spellStart"/>
-      <w:r>
-        <w:t>cpp</w:t>
-      </w:r>
-      <w:proofErr w:type="spellEnd"/>
-      <w:r>
-        <w:t xml:space="preserve"> component. Correcting this resolved the build error.</w:t>
+        <w:t>CMAKE_AUTOMOC expects testModelLayer.moc without the .cpp component. Correcting this resolved the build error.</w:t>
       </w:r>
     </w:p>
     <w:p/>
@@ -8260,61 +8200,13 @@
     </w:p>
     <w:p>
       <w:r>
-        <w:t xml:space="preserve">During the implementation of SceneNavigator, an issue was identified where the View was using the ViewModel to access ScriptManager and retrieve scene data. The initial implementation called </w:t>
-      </w:r>
-      <w:proofErr w:type="spellStart"/>
-      <w:r>
-        <w:t>viewModel</w:t>
-      </w:r>
-      <w:proofErr w:type="spellEnd"/>
-      <w:r>
-        <w:t>_-&gt;</w:t>
-      </w:r>
-      <w:proofErr w:type="spellStart"/>
-      <w:r>
-        <w:t>getScriptManager</w:t>
-      </w:r>
-      <w:proofErr w:type="spellEnd"/>
-      <w:r>
-        <w:t>()-&gt;getScript-&gt;</w:t>
-      </w:r>
-      <w:proofErr w:type="spellStart"/>
-      <w:r>
-        <w:t>getScenes</w:t>
-      </w:r>
-      <w:proofErr w:type="spellEnd"/>
-      <w:r>
-        <w:t xml:space="preserve">(). This gave SceneNavigator a direct dependency on ScriptManager and Script which are two layers the View should not have access to. </w:t>
+        <w:t xml:space="preserve">During the implementation of SceneNavigator, an issue was identified where the View was using the ViewModel to access ScriptManager and retrieve scene data. The initial implementation called viewModel_-&gt;getScriptManager()-&gt;getScript-&gt;getScenes(). This gave SceneNavigator a direct dependency on ScriptManager and Script which are two layers the View should not have access to. </w:t>
       </w:r>
     </w:p>
     <w:p/>
     <w:p>
       <w:r>
-        <w:t xml:space="preserve">The fix was to remove </w:t>
-      </w:r>
-      <w:proofErr w:type="spellStart"/>
-      <w:r>
-        <w:t>getScriptManager</w:t>
-      </w:r>
-      <w:proofErr w:type="spellEnd"/>
-      <w:r>
-        <w:t xml:space="preserve">() from ScriptViewModel and replace it with the purpose built method: </w:t>
-      </w:r>
-      <w:proofErr w:type="spellStart"/>
-      <w:r>
-        <w:t>getSceneList</w:t>
-      </w:r>
-      <w:proofErr w:type="spellEnd"/>
-      <w:r>
-        <w:t xml:space="preserve">() which returns a formatted </w:t>
-      </w:r>
-      <w:proofErr w:type="spellStart"/>
-      <w:r>
-        <w:t>QStringList</w:t>
-      </w:r>
-      <w:proofErr w:type="spellEnd"/>
-      <w:r>
-        <w:t>. The View now calls only these methods and has no visibility into the services layer. This correction reinforces the MVVM boundary as the ViewModel is the single point of contact for the View.</w:t>
+        <w:t>The fix was to remove getScriptManager() from ScriptViewModel and replace it with the purpose built method: getSceneList() which returns a formatted QStringList. The View now calls only these methods and has no visibility into the services layer. This correction reinforces the MVVM boundary as the ViewModel is the single point of contact for the View.</w:t>
       </w:r>
     </w:p>
     <w:p/>
@@ -8410,87 +8302,7 @@
     </w:p>
     <w:p>
       <w:r>
-        <w:t xml:space="preserve">The initial implementation of NewScriptDialog contained a bug where the accepted signal of </w:t>
-      </w:r>
-      <w:proofErr w:type="spellStart"/>
-      <w:r>
-        <w:t>QDialogButtonBox</w:t>
-      </w:r>
-      <w:proofErr w:type="spellEnd"/>
-      <w:r>
-        <w:t xml:space="preserve"> was incorrectly connected to </w:t>
-      </w:r>
-      <w:proofErr w:type="spellStart"/>
-      <w:r>
-        <w:t>QDialog</w:t>
-      </w:r>
-      <w:proofErr w:type="spellEnd"/>
-      <w:r>
-        <w:t xml:space="preserve">::reject rather than </w:t>
-      </w:r>
-      <w:proofErr w:type="spellStart"/>
-      <w:r>
-        <w:t>QDialog</w:t>
-      </w:r>
-      <w:proofErr w:type="spellEnd"/>
-      <w:r>
-        <w:t>::</w:t>
-      </w:r>
-      <w:proofErr w:type="spellStart"/>
-      <w:r>
-        <w:t>rejejected</w:t>
-      </w:r>
-      <w:proofErr w:type="spellEnd"/>
-      <w:r>
-        <w:t xml:space="preserve">. This meant that clicking OK triggered </w:t>
-      </w:r>
-      <w:proofErr w:type="spellStart"/>
-      <w:r>
-        <w:t>onAccepted</w:t>
-      </w:r>
-      <w:proofErr w:type="spellEnd"/>
-      <w:r>
-        <w:t xml:space="preserve"> and reject. Since reject fired after </w:t>
-      </w:r>
-      <w:proofErr w:type="gramStart"/>
-      <w:r>
-        <w:t>accept</w:t>
-      </w:r>
-      <w:proofErr w:type="gramEnd"/>
-      <w:r>
-        <w:t xml:space="preserve">, the dialog was always Rejected. </w:t>
-      </w:r>
-      <w:proofErr w:type="gramStart"/>
-      <w:r>
-        <w:t>As A consequence</w:t>
-      </w:r>
-      <w:proofErr w:type="gramEnd"/>
-      <w:r>
-        <w:t>, MainWindow::</w:t>
-      </w:r>
-      <w:proofErr w:type="spellStart"/>
-      <w:r>
-        <w:t>onNewScript</w:t>
-      </w:r>
-      <w:proofErr w:type="spellEnd"/>
-      <w:r>
-        <w:t xml:space="preserve"> never saw </w:t>
-      </w:r>
-      <w:proofErr w:type="spellStart"/>
-      <w:r>
-        <w:t>QDialog</w:t>
-      </w:r>
-      <w:proofErr w:type="spellEnd"/>
-      <w:r>
-        <w:t>::Accepted, no script was created and the scene navigator always appeared empty. The bug was identified by tracing the signal chain from the button click to ScriptManager::</w:t>
-      </w:r>
-      <w:proofErr w:type="spellStart"/>
-      <w:r>
-        <w:t>hasScript</w:t>
-      </w:r>
-      <w:proofErr w:type="spellEnd"/>
-      <w:r>
-        <w:t xml:space="preserve">. </w:t>
+        <w:t xml:space="preserve">The initial implementation of NewScriptDialog contained a bug where the accepted signal of QDialogButtonBox was incorrectly connected to QDialog::reject rather than QDialog::rejejected. This meant that clicking OK triggered onAccepted and reject. Since reject fired after accept, the dialog was always Rejected. As A consequence, MainWindow::onNewScript never saw QDialog::Accepted, no script was created and the scene navigator always appeared empty. The bug was identified by tracing the signal chain from the button click to ScriptManager::hasScript. </w:t>
       </w:r>
     </w:p>
     <w:p/>
@@ -8723,6 +8535,91 @@
     </w:p>
     <w:p/>
     <w:p/>
+    <w:p>
+      <w:pPr>
+        <w:pStyle w:val="Heading3"/>
+      </w:pPr>
+      <w:r>
+        <w:t>4.8.9 ScriptEditor and Script Model Disconnected</w:t>
+      </w:r>
+    </w:p>
+    <w:p>
+      <w:r>
+        <w:t>An architectural gap was identified during testing. The QTextEdit document and the Script data model were completely disconnected. The editor wrote to its own QTextDocument but this content was never transferred into ScriptElement objects. At the same time when loading a file, the Script model was correctly populated from the OSF file but nothing used it to populate the editor. The result was that saving produced an empty or incomplete file and loading showed scenes in the navigator but nothing in the editor.</w:t>
+      </w:r>
+    </w:p>
+    <w:p/>
+    <w:p>
+      <w:r>
+        <w:t xml:space="preserve">The solution was a mechanism for syncing both ways built around QTextBlockUserData. As QTextDocument is organised into blocks Each block previously did not have a concept of ElementType. A BlockData subclass of QTextBlockUserData was introduced. It stores one ElementType value and is attached to each block when applyElementFormatting is called. Qt manages the memory automatically as when a block is deleted, the UserData is deleted with it. </w:t>
+      </w:r>
+    </w:p>
+    <w:p/>
+    <w:p>
+      <w:r>
+        <w:t xml:space="preserve">syncToModel() reads every block in the document, extracts its BlockData element type and text and builds the data model from the blocks in the ScriptViewModel. This is called before every save so the model always reflects the document state before serialisation. </w:t>
+      </w:r>
+    </w:p>
+    <w:p/>
+    <w:p>
+      <w:r>
+        <w:t>loadFromScript() returns all all scene headings and elements as an ordered list of (ElementType, Text) pairs. The editor clears the document and repopulates it block by block, applying the correct formatting for each element type and registering scene heading block positions for the navigator.</w:t>
+      </w:r>
+    </w:p>
+    <w:p/>
+    <w:p>
+      <w:pPr>
+        <w:pStyle w:val="Heading3"/>
+      </w:pPr>
+      <w:r>
+        <w:t>4.8.10 Element Type State Conflation</w:t>
+      </w:r>
+    </w:p>
+    <w:p>
+      <w:r>
+        <w:t xml:space="preserve">A bug was identified where clicking a scene in SceneNavigator caused the last block in the editor to have its formatting changed to ACTION. Tracing the signal chain revealed the cause was onSceneSelected was emitting </w:t>
+      </w:r>
+      <w:r>
+        <w:lastRenderedPageBreak/>
+        <w:t>elementTypeChanged(ACTION) after navigation. ScriptEditor would take this signal and change the formatting to whatever block the cursor happened to be on. The deeper issue was architectural. currentElementType_ in ScriptViewModel was serving two purposes:</w:t>
+      </w:r>
+    </w:p>
+    <w:p>
+      <w:pPr>
+        <w:pStyle w:val="ListParagraph"/>
+        <w:numPr>
+          <w:ilvl w:val="0"/>
+          <w:numId w:val="4"/>
+        </w:numPr>
+      </w:pPr>
+      <w:r>
+        <w:t>Tracking which element type the user had selected for new text.</w:t>
+      </w:r>
+    </w:p>
+    <w:p>
+      <w:pPr>
+        <w:pStyle w:val="ListParagraph"/>
+        <w:numPr>
+          <w:ilvl w:val="0"/>
+          <w:numId w:val="4"/>
+        </w:numPr>
+      </w:pPr>
+      <w:r>
+        <w:t>Informing the Status Bar indicator.</w:t>
+      </w:r>
+    </w:p>
+    <w:p/>
+    <w:p>
+      <w:r>
+        <w:t>The fix was to remove elementTypeChanged from onSceneSelected entirely. Navigation now only  emits the appropriate signals.</w:t>
+      </w:r>
+    </w:p>
+    <w:p/>
+    <w:p>
+      <w:r>
+        <w:t>A related issue was the handling of new scripts versus opened scripts. They are two different situations that needed to be treated separately rather than sharing a single default. Now when there are no blocks loadFromScript explicitly applies SCENE_HEADING to the first block which is correct. The distinction is now explicit in the code rather than approximated by a default value.</w:t>
+      </w:r>
+    </w:p>
     <w:p/>
     <w:p>
       <w:pPr>
@@ -8868,27 +8765,7 @@
           <w:spacing w:val="7"/>
           <w:shd w:val="clear" w:color="auto" w:fill="FFFFFF"/>
         </w:rPr>
-        <w:t xml:space="preserve">This section will evaluate both the process and products of your project based on your previously developed criteria.   Note that the ‘products’ of your project include not just the principal artefact that you have </w:t>
-      </w:r>
-      <w:proofErr w:type="gramStart"/>
-      <w:r>
-        <w:rPr>
-          <w:rFonts w:ascii="Trebuchet MS" w:hAnsi="Trebuchet MS" w:cs="Open Sans"/>
-          <w:color w:val="FF0000"/>
-          <w:spacing w:val="7"/>
-          <w:shd w:val="clear" w:color="auto" w:fill="FFFFFF"/>
-        </w:rPr>
-        <w:t>developed, but</w:t>
-      </w:r>
-      <w:proofErr w:type="gramEnd"/>
-      <w:r>
-        <w:rPr>
-          <w:rFonts w:ascii="Trebuchet MS" w:hAnsi="Trebuchet MS" w:cs="Open Sans"/>
-          <w:color w:val="FF0000"/>
-          <w:spacing w:val="7"/>
-          <w:shd w:val="clear" w:color="auto" w:fill="FFFFFF"/>
-        </w:rPr>
-        <w:t xml:space="preserve"> also design and other documentation associated with the development process.   It is also appropriate to discuss the results of any external validation of your artefacts in this section.  The evaluation of the process should consider all elements of your project methodology as well as project management issues</w:t>
+        <w:t>This section will evaluate both the process and products of your project based on your previously developed criteria.   Note that the ‘products’ of your project include not just the principal artefact that you have developed, but also design and other documentation associated with the development process.   It is also appropriate to discuss the results of any external validation of your artefacts in this section.  The evaluation of the process should consider all elements of your project methodology as well as project management issues</w:t>
       </w:r>
     </w:p>
     <w:p>

</xml_diff>

<commit_message>
fix/docs: ScriptEditor formatting and updated report.
Fixed the script editor saving relevant text lowercase to data model
when it should be uppercase. Updated the report.
</commit_message>
<xml_diff>
--- a/Documentation/report_2/COM629_DIS_AE2_Oliver_Myers.docx
+++ b/Documentation/report_2/COM629_DIS_AE2_Oliver_Myers.docx
@@ -320,23 +320,17 @@
     </w:p>
     <w:p>
       <w:pPr>
-        <w:pStyle w:val="Essaycovertext"/>
-        <w:spacing w:line="240" w:lineRule="auto"/>
+        <w:pStyle w:val="Essaytitle"/>
+        <w:pageBreakBefore w:val="0"/>
+        <w:spacing w:after="0" w:line="240" w:lineRule="auto"/>
         <w:jc w:val="center"/>
         <w:rPr>
           <w:rFonts w:cs="Arial"/>
           <w:b w:val="0"/>
           <w:bCs/>
-        </w:rPr>
-      </w:pPr>
-      <w:r>
-        <w:rPr>
-          <w:rFonts w:cs="Arial"/>
-          <w:b w:val="0"/>
-          <w:bCs/>
-        </w:rPr>
-        <w:t>et the app functional end-to-end</w:t>
-      </w:r>
+          <w:sz w:val="32"/>
+        </w:rPr>
+      </w:pPr>
     </w:p>
     <w:p>
       <w:pPr>
@@ -570,7 +564,27 @@
           <w:iCs/>
           <w:color w:val="FF0000"/>
         </w:rPr>
-        <w:t>Write a paragraph here acknowledging everyone who has helped you while you have been preparing the content of your dissertation. This may be your supervisor or other academic staff who have provided guidance and support, other students or colleagues you have worked with on any research or project work, interviewees, librarians, or any external bodies that have given you assistance, such as access to data or opportunities for hands-on experience.</w:t>
+        <w:t xml:space="preserve">Write a paragraph here acknowledging everyone who has helped you while you have been preparing the content of your dissertation. This may be your supervisor or other academic staff who have provided guidance and support, other students or colleagues you have worked with on any research or project work, interviewees, librarians, or any external bodies that have given </w:t>
+      </w:r>
+      <w:proofErr w:type="spellStart"/>
+      <w:r>
+        <w:rPr>
+          <w:rFonts w:cs="Arial"/>
+          <w:i w:val="0"/>
+          <w:iCs/>
+          <w:color w:val="FF0000"/>
+        </w:rPr>
+        <w:t>you</w:t>
+      </w:r>
+      <w:proofErr w:type="spellEnd"/>
+      <w:r>
+        <w:rPr>
+          <w:rFonts w:cs="Arial"/>
+          <w:i w:val="0"/>
+          <w:iCs/>
+          <w:color w:val="FF0000"/>
+        </w:rPr>
+        <w:t xml:space="preserve"> assistance, such as access to data or opportunities for hands-on experience.</w:t>
       </w:r>
     </w:p>
     <w:p>
@@ -6745,6 +6759,160 @@
       <w:bookmarkEnd w:id="32"/>
     </w:p>
     <w:p/>
+    <w:p>
+      <w:pPr>
+        <w:rPr>
+          <w:b/>
+          <w:bCs/>
+        </w:rPr>
+      </w:pPr>
+      <w:r>
+        <w:rPr>
+          <w:b/>
+          <w:bCs/>
+        </w:rPr>
+        <w:t>Functional Requirements</w:t>
+      </w:r>
+    </w:p>
+    <w:p>
+      <w:pPr>
+        <w:pStyle w:val="ListParagraph"/>
+        <w:numPr>
+          <w:ilvl w:val="0"/>
+          <w:numId w:val="6"/>
+        </w:numPr>
+      </w:pPr>
+      <w:r>
+        <w:t>Industry Standard Formatting: The engine must apply industry standards such as margins, font and script elements.</w:t>
+      </w:r>
+    </w:p>
+    <w:p>
+      <w:pPr>
+        <w:pStyle w:val="ListParagraph"/>
+        <w:numPr>
+          <w:ilvl w:val="0"/>
+          <w:numId w:val="6"/>
+        </w:numPr>
+      </w:pPr>
+      <w:r>
+        <w:t>Tabbing Functionality: The Tab and Enter keys must trigger element transitions.</w:t>
+      </w:r>
+    </w:p>
+    <w:p>
+      <w:pPr>
+        <w:pStyle w:val="ListParagraph"/>
+        <w:numPr>
+          <w:ilvl w:val="0"/>
+          <w:numId w:val="6"/>
+        </w:numPr>
+      </w:pPr>
+      <w:r>
+        <w:t>PDF Export: The application must have the ability to export the script into a submission ready PDF.</w:t>
+      </w:r>
+    </w:p>
+    <w:p>
+      <w:pPr>
+        <w:pStyle w:val="ListParagraph"/>
+        <w:numPr>
+          <w:ilvl w:val="0"/>
+          <w:numId w:val="6"/>
+        </w:numPr>
+      </w:pPr>
+      <w:r>
+        <w:t>File Persistence: The application must save and load scripts in an open format (Open Screenplay Format, XML)</w:t>
+      </w:r>
+    </w:p>
+    <w:p>
+      <w:pPr>
+        <w:pStyle w:val="ListParagraph"/>
+        <w:numPr>
+          <w:ilvl w:val="0"/>
+          <w:numId w:val="6"/>
+        </w:numPr>
+      </w:pPr>
+      <w:r>
+        <w:t>Navigator: Functionality for navigating the script through scenes.</w:t>
+      </w:r>
+    </w:p>
+    <w:p>
+      <w:pPr>
+        <w:pStyle w:val="ListParagraph"/>
+        <w:numPr>
+          <w:ilvl w:val="0"/>
+          <w:numId w:val="6"/>
+        </w:numPr>
+      </w:pPr>
+      <w:r>
+        <w:lastRenderedPageBreak/>
+        <w:t>Character Autocomplete: A SmartType feature that suggests character names based on previous entries.</w:t>
+      </w:r>
+    </w:p>
+    <w:p/>
+    <w:p>
+      <w:r>
+        <w:t>Non-Functional Requirements</w:t>
+      </w:r>
+    </w:p>
+    <w:p>
+      <w:pPr>
+        <w:pStyle w:val="ListParagraph"/>
+        <w:numPr>
+          <w:ilvl w:val="0"/>
+          <w:numId w:val="7"/>
+        </w:numPr>
+      </w:pPr>
+      <w:r>
+        <w:t>Latency: The keystroke to screen latency must remain under 50ms.</w:t>
+      </w:r>
+    </w:p>
+    <w:p>
+      <w:pPr>
+        <w:pStyle w:val="ListParagraph"/>
+        <w:numPr>
+          <w:ilvl w:val="0"/>
+          <w:numId w:val="7"/>
+        </w:numPr>
+      </w:pPr>
+      <w:r>
+        <w:t>Cross Platform: The application must be capable of running on Windows, Mac and Linux desktop environments.</w:t>
+      </w:r>
+    </w:p>
+    <w:p>
+      <w:pPr>
+        <w:pStyle w:val="ListParagraph"/>
+        <w:numPr>
+          <w:ilvl w:val="0"/>
+          <w:numId w:val="7"/>
+        </w:numPr>
+      </w:pPr>
+      <w:r>
+        <w:t>Resource Efficiency: The software should use less than 100MB of RAM during idle operation.</w:t>
+      </w:r>
+    </w:p>
+    <w:p>
+      <w:pPr>
+        <w:pStyle w:val="ListParagraph"/>
+        <w:numPr>
+          <w:ilvl w:val="0"/>
+          <w:numId w:val="7"/>
+        </w:numPr>
+      </w:pPr>
+      <w:r>
+        <w:t>Robustness: The application must be able to handle files exceeding 120 pages without a drop in performance.</w:t>
+      </w:r>
+    </w:p>
+    <w:p>
+      <w:pPr>
+        <w:pStyle w:val="ListParagraph"/>
+        <w:numPr>
+          <w:ilvl w:val="0"/>
+          <w:numId w:val="7"/>
+        </w:numPr>
+      </w:pPr>
+      <w:r>
+        <w:t>Accessibility: The interface must comply with WCAG 2.1 standards.</w:t>
+      </w:r>
+    </w:p>
     <w:p/>
     <w:p>
       <w:r>
@@ -6975,7 +7143,842 @@
     </w:p>
     <w:p>
       <w:r>
-        <w:t>The project is organised into four directories under the “src” folder. Each of these directories corresponds to a MVVM layer:</w:t>
+        <w:t xml:space="preserve">The project is organised into four directories under the </w:t>
+      </w:r>
+      <w:r>
+        <w:rPr>
+          <w:rStyle w:val="codeChar"/>
+        </w:rPr>
+        <w:t>src/</w:t>
+      </w:r>
+      <w:r>
+        <w:t xml:space="preserve"> folder. Each of these directories corresponds to a MVVM layer:</w:t>
+      </w:r>
+    </w:p>
+    <w:p>
+      <w:pPr>
+        <w:pStyle w:val="code"/>
+        <w:numPr>
+          <w:ilvl w:val="0"/>
+          <w:numId w:val="4"/>
+        </w:numPr>
+      </w:pPr>
+      <w:r>
+        <w:t>model/</w:t>
+      </w:r>
+    </w:p>
+    <w:p>
+      <w:pPr>
+        <w:pStyle w:val="code"/>
+        <w:numPr>
+          <w:ilvl w:val="0"/>
+          <w:numId w:val="4"/>
+        </w:numPr>
+      </w:pPr>
+      <w:r>
+        <w:t>view/</w:t>
+      </w:r>
+    </w:p>
+    <w:p>
+      <w:pPr>
+        <w:pStyle w:val="code"/>
+        <w:numPr>
+          <w:ilvl w:val="0"/>
+          <w:numId w:val="4"/>
+        </w:numPr>
+      </w:pPr>
+      <w:r>
+        <w:t>viewmodel/</w:t>
+      </w:r>
+    </w:p>
+    <w:p>
+      <w:pPr>
+        <w:pStyle w:val="code"/>
+        <w:numPr>
+          <w:ilvl w:val="0"/>
+          <w:numId w:val="4"/>
+        </w:numPr>
+      </w:pPr>
+      <w:r>
+        <w:t>services/</w:t>
+      </w:r>
+    </w:p>
+    <w:p>
+      <w:r>
+        <w:t xml:space="preserve">The decision was made to limit </w:t>
+      </w:r>
+      <w:r>
+        <w:rPr>
+          <w:rStyle w:val="codeChar"/>
+        </w:rPr>
+        <w:t>QObject</w:t>
+      </w:r>
+      <w:r>
+        <w:t xml:space="preserve"> inheritance to the view and viewmodel layers only. </w:t>
+      </w:r>
+      <w:r>
+        <w:rPr>
+          <w:rStyle w:val="codeChar"/>
+        </w:rPr>
+        <w:t>QObject</w:t>
+      </w:r>
+      <w:r>
+        <w:t xml:space="preserve"> provides the signal and slot functionality from Qt along with memory management and meta-object features which are not needed in the model or services layers. Inheriting </w:t>
+      </w:r>
+      <w:r>
+        <w:rPr>
+          <w:rStyle w:val="codeChar"/>
+        </w:rPr>
+        <w:t>QObject</w:t>
+      </w:r>
+      <w:r>
+        <w:t xml:space="preserve"> unnecessarily adds overhead and creates a dependency on Qt where it is not needed. Plain C++ classes in the model layer are lighter and more portable. They can also be unit tested without instantiating a </w:t>
+      </w:r>
+      <w:r>
+        <w:rPr>
+          <w:rStyle w:val="codeChar"/>
+        </w:rPr>
+        <w:t>QApplicaiton</w:t>
+      </w:r>
+      <w:r>
+        <w:t>.</w:t>
+      </w:r>
+    </w:p>
+    <w:p/>
+    <w:p>
+      <w:r>
+        <w:t xml:space="preserve">CMake is used as the build system. </w:t>
+      </w:r>
+      <w:r>
+        <w:rPr>
+          <w:rStyle w:val="codeChar"/>
+        </w:rPr>
+        <w:t>target_include_directories</w:t>
+      </w:r>
+      <w:r>
+        <w:t xml:space="preserve"> is configured to </w:t>
+      </w:r>
+      <w:r>
+        <w:rPr>
+          <w:rStyle w:val="codeChar"/>
+        </w:rPr>
+        <w:t>src/</w:t>
+      </w:r>
+      <w:r>
+        <w:t xml:space="preserve">, meaning that all includes can be written relative to the </w:t>
+      </w:r>
+      <w:r>
+        <w:rPr>
+          <w:rStyle w:val="codeChar"/>
+        </w:rPr>
+        <w:t>src/</w:t>
+      </w:r>
+      <w:r>
+        <w:t xml:space="preserve"> root.</w:t>
+      </w:r>
+    </w:p>
+    <w:p/>
+    <w:p>
+      <w:pPr>
+        <w:pStyle w:val="Heading2"/>
+      </w:pPr>
+      <w:bookmarkStart w:id="38" w:name="_Toc227772877"/>
+      <w:r>
+        <w:t>4.3 Model Layer</w:t>
+      </w:r>
+      <w:bookmarkEnd w:id="38"/>
+    </w:p>
+    <w:p/>
+    <w:p>
+      <w:r>
+        <w:t xml:space="preserve">The model layer consists of three plain C++ classes: </w:t>
+      </w:r>
+      <w:r>
+        <w:rPr>
+          <w:rStyle w:val="codeChar"/>
+        </w:rPr>
+        <w:t>ScriptElement</w:t>
+      </w:r>
+      <w:r>
+        <w:t xml:space="preserve">, </w:t>
+      </w:r>
+      <w:r>
+        <w:rPr>
+          <w:rStyle w:val="codeChar"/>
+        </w:rPr>
+        <w:t>Scene</w:t>
+      </w:r>
+      <w:r>
+        <w:t xml:space="preserve">, and </w:t>
+      </w:r>
+      <w:r>
+        <w:rPr>
+          <w:rStyle w:val="codeChar"/>
+        </w:rPr>
+        <w:t>Script</w:t>
+      </w:r>
+      <w:r>
+        <w:t xml:space="preserve">. Together these represent the complete data structure of a screenplay. None of these inherit from </w:t>
+      </w:r>
+      <w:r>
+        <w:rPr>
+          <w:rStyle w:val="codeChar"/>
+        </w:rPr>
+        <w:t>QObject</w:t>
+      </w:r>
+      <w:r>
+        <w:t xml:space="preserve">. </w:t>
+      </w:r>
+      <w:r>
+        <w:rPr>
+          <w:rStyle w:val="codeChar"/>
+        </w:rPr>
+        <w:t>QString</w:t>
+      </w:r>
+      <w:r>
+        <w:t xml:space="preserve"> is retained as the string type throughout despite the plain C++ principle. This is because the serialization and view layers operate natively with </w:t>
+      </w:r>
+      <w:r>
+        <w:rPr>
+          <w:rStyle w:val="codeChar"/>
+        </w:rPr>
+        <w:t>QString</w:t>
+      </w:r>
+      <w:r>
+        <w:t xml:space="preserve">. Converting from </w:t>
+      </w:r>
+      <w:r>
+        <w:rPr>
+          <w:rStyle w:val="codeChar"/>
+        </w:rPr>
+        <w:t>std::string</w:t>
+      </w:r>
+      <w:r>
+        <w:t xml:space="preserve"> at every layer boundary would introduce unnecessary friction with no architectural benefit.</w:t>
+      </w:r>
+    </w:p>
+    <w:p>
+      <w:pPr>
+        <w:rPr>
+          <w:color w:val="EE0000"/>
+        </w:rPr>
+      </w:pPr>
+      <w:r>
+        <w:rPr>
+          <w:color w:val="EE0000"/>
+        </w:rPr>
+        <w:t>UML CLASS DIAGRAM OF MODEL LAYER SHOWING OWNERSHIP BETWEEN SCRIPT, SCENE AND SCRIPTELEMENT.</w:t>
+      </w:r>
+    </w:p>
+    <w:p/>
+    <w:p>
+      <w:pPr>
+        <w:pStyle w:val="Heading3"/>
+      </w:pPr>
+      <w:bookmarkStart w:id="39" w:name="_Toc227772878"/>
+      <w:r>
+        <w:t>4.3.1 ScriptElement</w:t>
+      </w:r>
+      <w:bookmarkEnd w:id="39"/>
+    </w:p>
+    <w:p>
+      <w:r>
+        <w:rPr>
+          <w:rStyle w:val="codeChar"/>
+        </w:rPr>
+        <w:t>ScriptElement</w:t>
+      </w:r>
+      <w:r>
+        <w:t xml:space="preserve"> represents a single block of screenplay content e.g. one action line, one line of dialogue, one scene heading, etc. </w:t>
+      </w:r>
+      <w:r>
+        <w:t xml:space="preserve">A </w:t>
+      </w:r>
+      <w:r>
+        <w:rPr>
+          <w:rStyle w:val="codeChar"/>
+        </w:rPr>
+        <w:t>QString</w:t>
+      </w:r>
+      <w:r>
+        <w:t xml:space="preserve"> of text content is paired with an </w:t>
+      </w:r>
+      <w:r>
+        <w:rPr>
+          <w:rStyle w:val="codeChar"/>
+        </w:rPr>
+        <w:t>ElementType</w:t>
+      </w:r>
+      <w:r>
+        <w:t xml:space="preserve"> enum value which supports the following screenplay element types:</w:t>
+      </w:r>
+    </w:p>
+    <w:p>
+      <w:pPr>
+        <w:pStyle w:val="code"/>
+        <w:numPr>
+          <w:ilvl w:val="0"/>
+          <w:numId w:val="4"/>
+        </w:numPr>
+      </w:pPr>
+      <w:r>
+        <w:t>SCENE_HEADING</w:t>
+      </w:r>
+    </w:p>
+    <w:p>
+      <w:pPr>
+        <w:pStyle w:val="code"/>
+        <w:numPr>
+          <w:ilvl w:val="0"/>
+          <w:numId w:val="4"/>
+        </w:numPr>
+      </w:pPr>
+      <w:r>
+        <w:lastRenderedPageBreak/>
+        <w:t>ACTION</w:t>
+      </w:r>
+    </w:p>
+    <w:p>
+      <w:pPr>
+        <w:pStyle w:val="code"/>
+        <w:numPr>
+          <w:ilvl w:val="0"/>
+          <w:numId w:val="4"/>
+        </w:numPr>
+      </w:pPr>
+      <w:r>
+        <w:t>CHARACTER</w:t>
+      </w:r>
+    </w:p>
+    <w:p>
+      <w:pPr>
+        <w:pStyle w:val="code"/>
+        <w:numPr>
+          <w:ilvl w:val="0"/>
+          <w:numId w:val="4"/>
+        </w:numPr>
+      </w:pPr>
+      <w:r>
+        <w:t>DIALOGUE</w:t>
+      </w:r>
+    </w:p>
+    <w:p>
+      <w:pPr>
+        <w:pStyle w:val="code"/>
+        <w:numPr>
+          <w:ilvl w:val="0"/>
+          <w:numId w:val="4"/>
+        </w:numPr>
+      </w:pPr>
+      <w:r>
+        <w:t>PARENTHETICAL</w:t>
+      </w:r>
+    </w:p>
+    <w:p>
+      <w:pPr>
+        <w:pStyle w:val="code"/>
+        <w:numPr>
+          <w:ilvl w:val="0"/>
+          <w:numId w:val="4"/>
+        </w:numPr>
+      </w:pPr>
+      <w:r>
+        <w:t>TRANSITION</w:t>
+      </w:r>
+    </w:p>
+    <w:p>
+      <w:pPr>
+        <w:pStyle w:val="code"/>
+        <w:numPr>
+          <w:ilvl w:val="0"/>
+          <w:numId w:val="4"/>
+        </w:numPr>
+      </w:pPr>
+      <w:r>
+        <w:t>SHOT</w:t>
+      </w:r>
+    </w:p>
+    <w:p>
+      <w:r>
+        <w:t>Each of these carries distinct formatting rules. The rules are applied by the view layer based on the type which keeps the formatting logic out of the model layer.</w:t>
+      </w:r>
+    </w:p>
+    <w:p/>
+    <w:p>
+      <w:pPr>
+        <w:pStyle w:val="Heading3"/>
+      </w:pPr>
+      <w:bookmarkStart w:id="40" w:name="_Toc227772879"/>
+      <w:r>
+        <w:t>4.3.2 Scene</w:t>
+      </w:r>
+      <w:bookmarkEnd w:id="40"/>
+    </w:p>
+    <w:p>
+      <w:r>
+        <w:t xml:space="preserve">A </w:t>
+      </w:r>
+      <w:r>
+        <w:rPr>
+          <w:rStyle w:val="codeChar"/>
+        </w:rPr>
+        <w:t>Scene</w:t>
+      </w:r>
+      <w:r>
+        <w:t xml:space="preserve"> object is a collection of </w:t>
+      </w:r>
+      <w:r>
+        <w:rPr>
+          <w:rStyle w:val="codeChar"/>
+        </w:rPr>
+        <w:t>ScriptElement</w:t>
+      </w:r>
+      <w:r>
+        <w:t xml:space="preserve"> objects alongside a scene number and heading. The design decision that had to be made here was how to manage element ownership. Elements are stored as</w:t>
+      </w:r>
+      <w:r>
+        <w:t>:</w:t>
+      </w:r>
+    </w:p>
+    <w:p/>
+    <w:p>
+      <w:pPr>
+        <w:pStyle w:val="code"/>
+      </w:pPr>
+      <w:r>
+        <w:t>std::vector&lt;</w:t>
+      </w:r>
+      <w:r>
+        <w:t>std::unique_ptr&lt;ScriptElement&gt;&gt;</w:t>
+      </w:r>
+    </w:p>
+    <w:p/>
+    <w:p>
+      <w:r>
+        <w:t xml:space="preserve">A unique pointer was chosen because a </w:t>
+      </w:r>
+      <w:r>
+        <w:rPr>
+          <w:rStyle w:val="codeChar"/>
+        </w:rPr>
+        <w:t>ScriptElement</w:t>
+      </w:r>
+      <w:r>
+        <w:t xml:space="preserve"> only belongs to one </w:t>
+      </w:r>
+      <w:r>
+        <w:rPr>
+          <w:rStyle w:val="codeChar"/>
+        </w:rPr>
+        <w:t>S</w:t>
+      </w:r>
+      <w:r>
+        <w:rPr>
+          <w:rStyle w:val="codeChar"/>
+        </w:rPr>
+        <w:t>cene</w:t>
+      </w:r>
+      <w:r>
+        <w:t>. A unique pointer enforces single ownership at a language level. When a Scene is destroyed its elements are automatically destroyed with it eliminating the need for manual memory management.</w:t>
+      </w:r>
+    </w:p>
+    <w:p/>
+    <w:p>
+      <w:r>
+        <w:t xml:space="preserve">Initially </w:t>
+      </w:r>
+      <w:r>
+        <w:rPr>
+          <w:rStyle w:val="codeChar"/>
+        </w:rPr>
+        <w:t>QList</w:t>
+      </w:r>
+      <w:r>
+        <w:t xml:space="preserve"> was used rather than </w:t>
+      </w:r>
+      <w:r>
+        <w:rPr>
+          <w:rStyle w:val="codeChar"/>
+        </w:rPr>
+        <w:t>std::vector</w:t>
+      </w:r>
+      <w:r>
+        <w:t xml:space="preserve"> for the element container but this produced a compilation error. </w:t>
+      </w:r>
+      <w:r>
+        <w:rPr>
+          <w:rStyle w:val="codeChar"/>
+        </w:rPr>
+        <w:t>QList</w:t>
+      </w:r>
+      <w:r>
+        <w:t xml:space="preserve"> uses copy on write and requires all contained types to be copyable. Unique pointers are not copyable by design which made the combination impossible. Switching to </w:t>
+      </w:r>
+      <w:r>
+        <w:rPr>
+          <w:rStyle w:val="codeChar"/>
+        </w:rPr>
+        <w:t>std::vector</w:t>
+      </w:r>
+      <w:r>
+        <w:t xml:space="preserve"> resolved this and had the additional benefit of keeping the model layer free of Qt container dependencies.</w:t>
+      </w:r>
+    </w:p>
+    <w:p/>
+    <w:p>
+      <w:r>
+        <w:t xml:space="preserve">Because unique pointers are </w:t>
+      </w:r>
+      <w:r>
+        <w:t>non-copyable</w:t>
+      </w:r>
+      <w:r>
+        <w:t xml:space="preserve">, </w:t>
+      </w:r>
+      <w:r>
+        <w:rPr>
+          <w:rStyle w:val="codeChar"/>
+        </w:rPr>
+        <w:t>Scene</w:t>
+      </w:r>
+      <w:r>
+        <w:t xml:space="preserve"> itself is made non copyable. The Rule of Five was applied explicitly where the copy constructor and copy assignment were marked</w:t>
+      </w:r>
+      <w:r>
+        <w:t xml:space="preserve"> </w:t>
+      </w:r>
+      <w:r>
+        <w:rPr>
+          <w:rStyle w:val="codeChar"/>
+        </w:rPr>
+        <w:t>= delete</w:t>
+      </w:r>
+      <w:r>
+        <w:t xml:space="preserve"> as well as the move constructor and move assignment were marked </w:t>
+      </w:r>
+      <w:r>
+        <w:rPr>
+          <w:rStyle w:val="codeChar"/>
+        </w:rPr>
+        <w:t>= default</w:t>
+      </w:r>
+      <w:r>
+        <w:t xml:space="preserve">. </w:t>
+      </w:r>
+      <w:r>
+        <w:t xml:space="preserve">This makes scene move-only, meaning it can be transferred between owners but never duplicated. A </w:t>
+      </w:r>
+      <w:r>
+        <w:rPr>
+          <w:rStyle w:val="codeChar"/>
+        </w:rPr>
+        <w:t>setSceneNumber</w:t>
+      </w:r>
+      <w:r>
+        <w:t xml:space="preserve"> method was deliberately not implemented as scene numbers are applied due to their position in the script. Allowing scenes to set their own number risks inconsistent states such as duplicates of gaps.</w:t>
+      </w:r>
+    </w:p>
+    <w:p/>
+    <w:p>
+      <w:pPr>
+        <w:pStyle w:val="Heading3"/>
+      </w:pPr>
+      <w:bookmarkStart w:id="41" w:name="_Toc227772880"/>
+      <w:r>
+        <w:lastRenderedPageBreak/>
+        <w:t>4.3.3 Script</w:t>
+      </w:r>
+      <w:bookmarkEnd w:id="41"/>
+    </w:p>
+    <w:p>
+      <w:r>
+        <w:t xml:space="preserve">This is the </w:t>
+      </w:r>
+      <w:r>
+        <w:t>top-level</w:t>
+      </w:r>
+      <w:r>
+        <w:t xml:space="preserve"> data object which owns all the scenes along with holding the title and author metadata. Scenes are stored using plain value semantics rather than using a unique pointer. This decision was made after considering both options. Using unique pointers would allocate each scene individually on the heap which would scatter the objects in memory and require pointer indirection to access them. A plain value vector stores all scenes contiguously which is better for cache locality. While the performance difference is negligible at the scale of this project, it was determined that there was no need to introduce heap allocation and pointer indirection when there was no provided benefit. Ownership of each scene is already enforced by containment as a </w:t>
+      </w:r>
+      <w:r>
+        <w:rPr>
+          <w:rStyle w:val="codeChar"/>
+        </w:rPr>
+        <w:t>Scene</w:t>
+      </w:r>
+      <w:r>
+        <w:t xml:space="preserve"> cannot exist in two </w:t>
+      </w:r>
+      <w:r>
+        <w:rPr>
+          <w:rStyle w:val="codeChar"/>
+        </w:rPr>
+        <w:t>Script</w:t>
+      </w:r>
+      <w:r>
+        <w:t xml:space="preserve"> objects simultaneously. It was determined that unique pointers solved a technical problem for </w:t>
+      </w:r>
+      <w:r>
+        <w:rPr>
+          <w:rStyle w:val="codeChar"/>
+        </w:rPr>
+        <w:t>ScriptElement</w:t>
+      </w:r>
+      <w:r>
+        <w:t>,</w:t>
+      </w:r>
+      <w:r>
+        <w:t xml:space="preserve"> but plain value semantics were sufficient in this case. </w:t>
+      </w:r>
+    </w:p>
+    <w:p/>
+    <w:p>
+      <w:pPr>
+        <w:pStyle w:val="Heading2"/>
+      </w:pPr>
+      <w:bookmarkStart w:id="42" w:name="_Toc227772881"/>
+      <w:r>
+        <w:t>4.4 Services Layer</w:t>
+      </w:r>
+      <w:bookmarkEnd w:id="42"/>
+    </w:p>
+    <w:p/>
+    <w:p>
+      <w:pPr>
+        <w:pStyle w:val="Heading3"/>
+      </w:pPr>
+      <w:r>
+        <w:t>4.4.1 ScriptManager</w:t>
+      </w:r>
+    </w:p>
+    <w:p>
+      <w:r>
+        <w:rPr>
+          <w:rStyle w:val="codeChar"/>
+        </w:rPr>
+        <w:t>ScriptManager</w:t>
+      </w:r>
+      <w:r>
+        <w:t xml:space="preserve"> was implemented as the central point of control for the script lifecycle. It owns the active </w:t>
+      </w:r>
+      <w:r>
+        <w:rPr>
+          <w:rStyle w:val="codeChar"/>
+        </w:rPr>
+        <w:t>Script</w:t>
+      </w:r>
+      <w:r>
+        <w:t xml:space="preserve"> instance as a </w:t>
+      </w:r>
+      <w:r>
+        <w:rPr>
+          <w:rStyle w:val="codeChar"/>
+        </w:rPr>
+        <w:t>std::unique_ptr</w:t>
+      </w:r>
+      <w:r>
+        <w:t xml:space="preserve">. This means the script object is destroyed when </w:t>
+      </w:r>
+      <w:r>
+        <w:rPr>
+          <w:rStyle w:val="codeChar"/>
+        </w:rPr>
+        <w:t>ScriptManager</w:t>
+      </w:r>
+      <w:r>
+        <w:t xml:space="preserve"> closes it or is itself destroyed.</w:t>
+      </w:r>
+    </w:p>
+    <w:p/>
+    <w:p>
+      <w:r>
+        <w:rPr>
+          <w:rStyle w:val="codeChar"/>
+        </w:rPr>
+        <w:t>ScriptManager</w:t>
+      </w:r>
+      <w:r>
+        <w:t xml:space="preserve"> also owns the instances of </w:t>
+      </w:r>
+      <w:r>
+        <w:rPr>
+          <w:rStyle w:val="codeChar"/>
+        </w:rPr>
+        <w:t>OsfSeriali</w:t>
+      </w:r>
+      <w:r>
+        <w:rPr>
+          <w:rStyle w:val="codeChar"/>
+        </w:rPr>
+        <w:t>z</w:t>
+      </w:r>
+      <w:r>
+        <w:rPr>
+          <w:rStyle w:val="codeChar"/>
+        </w:rPr>
+        <w:t>er</w:t>
+      </w:r>
+      <w:r>
+        <w:t xml:space="preserve"> and </w:t>
+      </w:r>
+      <w:r>
+        <w:rPr>
+          <w:rStyle w:val="codeChar"/>
+        </w:rPr>
+        <w:t>PdfExporter</w:t>
+      </w:r>
+      <w:r>
+        <w:t xml:space="preserve">. This ensures the ViewModel layer has no direct dependency on file format implementations. A singleton pattern was considered and rejected in favour of constructing a single instance at the application level and passing it where needed. This </w:t>
+      </w:r>
+      <w:r>
+        <w:t>avoids</w:t>
+      </w:r>
+      <w:r>
+        <w:t xml:space="preserve"> the hidden dependencies and potential testing difficulties that global state introduces.</w:t>
+      </w:r>
+    </w:p>
+    <w:p/>
+    <w:p>
+      <w:r>
+        <w:rPr>
+          <w:rStyle w:val="codeChar"/>
+        </w:rPr>
+        <w:t>ScriptManager</w:t>
+      </w:r>
+      <w:r>
+        <w:t xml:space="preserve"> inherits from </w:t>
+      </w:r>
+      <w:r>
+        <w:rPr>
+          <w:rStyle w:val="codeChar"/>
+        </w:rPr>
+        <w:t>QObject</w:t>
+      </w:r>
+      <w:r>
+        <w:t xml:space="preserve"> as it needs to emit signals when script state changes. Four signals were defined:</w:t>
+      </w:r>
+    </w:p>
+    <w:p>
+      <w:pPr>
+        <w:pStyle w:val="code"/>
+        <w:numPr>
+          <w:ilvl w:val="0"/>
+          <w:numId w:val="4"/>
+        </w:numPr>
+      </w:pPr>
+      <w:r>
+        <w:t>scriptLoaded</w:t>
+      </w:r>
+    </w:p>
+    <w:p>
+      <w:pPr>
+        <w:pStyle w:val="code"/>
+        <w:numPr>
+          <w:ilvl w:val="0"/>
+          <w:numId w:val="4"/>
+        </w:numPr>
+      </w:pPr>
+      <w:r>
+        <w:t>scriptClosed</w:t>
+      </w:r>
+    </w:p>
+    <w:p>
+      <w:pPr>
+        <w:pStyle w:val="code"/>
+        <w:numPr>
+          <w:ilvl w:val="0"/>
+          <w:numId w:val="4"/>
+        </w:numPr>
+      </w:pPr>
+      <w:r>
+        <w:t>scriptSaved</w:t>
+      </w:r>
+    </w:p>
+    <w:p>
+      <w:pPr>
+        <w:pStyle w:val="code"/>
+        <w:numPr>
+          <w:ilvl w:val="0"/>
+          <w:numId w:val="4"/>
+        </w:numPr>
+      </w:pPr>
+      <w:r>
+        <w:t>errorOccurred</w:t>
+      </w:r>
+    </w:p>
+    <w:p/>
+    <w:p>
+      <w:r>
+        <w:rPr>
+          <w:rStyle w:val="codeChar"/>
+        </w:rPr>
+        <w:lastRenderedPageBreak/>
+        <w:t>getScript()</w:t>
+      </w:r>
+      <w:r>
+        <w:t xml:space="preserve"> also returns a raw pointer rather than a reference or </w:t>
+      </w:r>
+      <w:r>
+        <w:rPr>
+          <w:rStyle w:val="codeChar"/>
+        </w:rPr>
+        <w:t>unique_ptr</w:t>
+      </w:r>
+      <w:r>
+        <w:t xml:space="preserve">. This is because a reference implies the script always exists and returning a unique pointer would transfer ownership outside of </w:t>
+      </w:r>
+      <w:r>
+        <w:rPr>
+          <w:rStyle w:val="codeChar"/>
+        </w:rPr>
+        <w:t>ScriptManager</w:t>
+      </w:r>
+      <w:r>
+        <w:t>.</w:t>
+      </w:r>
+    </w:p>
+    <w:p/>
+    <w:p>
+      <w:pPr>
+        <w:pStyle w:val="Heading3"/>
+      </w:pPr>
+      <w:r>
+        <w:t>4.4.2 OsfSeriali</w:t>
+      </w:r>
+      <w:r>
+        <w:t>z</w:t>
+      </w:r>
+      <w:r>
+        <w:t>er</w:t>
+      </w:r>
+    </w:p>
+    <w:p>
+      <w:r>
+        <w:rPr>
+          <w:rStyle w:val="codeChar"/>
+        </w:rPr>
+        <w:t>OsfSerializer</w:t>
+      </w:r>
+      <w:r>
+        <w:t xml:space="preserve"> implements Qt’s </w:t>
+      </w:r>
+      <w:r>
+        <w:rPr>
+          <w:rStyle w:val="codeChar"/>
+        </w:rPr>
+        <w:t>QXmlStreamWriter</w:t>
+      </w:r>
+      <w:r>
+        <w:t xml:space="preserve"> and </w:t>
+      </w:r>
+      <w:r>
+        <w:rPr>
+          <w:rStyle w:val="codeChar"/>
+        </w:rPr>
+        <w:t>QXmlStreamReader</w:t>
+      </w:r>
+      <w:r>
+        <w:t>. The XML structure maps directly onto the applications model layer:</w:t>
       </w:r>
     </w:p>
     <w:p>
@@ -6987,7 +7990,13 @@
         </w:numPr>
       </w:pPr>
       <w:r>
-        <w:t>model/</w:t>
+        <w:rPr>
+          <w:rStyle w:val="codeChar"/>
+        </w:rPr>
+        <w:t>&lt;screenplay&gt;</w:t>
+      </w:r>
+      <w:r>
+        <w:t xml:space="preserve"> holds title and author attributes.</w:t>
       </w:r>
     </w:p>
     <w:p>
@@ -6999,7 +8008,13 @@
         </w:numPr>
       </w:pPr>
       <w:r>
-        <w:t>view/</w:t>
+        <w:rPr>
+          <w:rStyle w:val="codeChar"/>
+        </w:rPr>
+        <w:t>&lt;scene&gt;</w:t>
+      </w:r>
+      <w:r>
+        <w:t xml:space="preserve"> holds its number and heading.</w:t>
       </w:r>
     </w:p>
     <w:p>
@@ -7011,7 +8026,191 @@
         </w:numPr>
       </w:pPr>
       <w:r>
-        <w:t>viewmodel/</w:t>
+        <w:rPr>
+          <w:rStyle w:val="codeChar"/>
+        </w:rPr>
+        <w:t>&lt;element&gt;</w:t>
+      </w:r>
+      <w:r>
+        <w:t xml:space="preserve"> contains its type as an attribute and the text content as the element body.</w:t>
+      </w:r>
+    </w:p>
+    <w:p/>
+    <w:p>
+      <w:r>
+        <w:rPr>
+          <w:rStyle w:val="codeChar"/>
+        </w:rPr>
+        <w:t>QXmlStreamWriter</w:t>
+      </w:r>
+      <w:r>
+        <w:t xml:space="preserve"> was chosen over Qt’s DOM based </w:t>
+      </w:r>
+      <w:r>
+        <w:rPr>
+          <w:rStyle w:val="codeChar"/>
+        </w:rPr>
+        <w:t>QDomDocument</w:t>
+      </w:r>
+      <w:r>
+        <w:t xml:space="preserve"> as it writes the document incrementally as a forward only stream. This is more memory efficient for large documents and maps naturally onto iterating through the </w:t>
+      </w:r>
+      <w:r>
+        <w:t>script</w:t>
+      </w:r>
+      <w:r>
+        <w:t xml:space="preserve"> scenes and elements. </w:t>
+      </w:r>
+      <w:r>
+        <w:rPr>
+          <w:rStyle w:val="codeChar"/>
+        </w:rPr>
+        <w:t>QXmlStreamReader</w:t>
+      </w:r>
+      <w:r>
+        <w:t xml:space="preserve"> reads the document as a token stream</w:t>
+      </w:r>
+      <w:r>
+        <w:t xml:space="preserve"> where each call to </w:t>
+      </w:r>
+      <w:r>
+        <w:rPr>
+          <w:rStyle w:val="codeChar"/>
+        </w:rPr>
+        <w:t>readNext()</w:t>
+      </w:r>
+      <w:r>
+        <w:t xml:space="preserve"> advances to the next token. State is maintained across tokens using local variables and local pointers. This is done since the element type attribute and text content arrive in separate consecutive tokens. </w:t>
+      </w:r>
+    </w:p>
+    <w:p/>
+    <w:p>
+      <w:r>
+        <w:t xml:space="preserve">Whitespace characters are produced by the auto formatted XML. These </w:t>
+      </w:r>
+      <w:r>
+        <w:t>must</w:t>
+      </w:r>
+      <w:r>
+        <w:t xml:space="preserve"> be filtered by trimming and skipping empty strings.</w:t>
+      </w:r>
+    </w:p>
+    <w:p/>
+    <w:p>
+      <w:r>
+        <w:t>Both save and load operations return early on file open failure and the load function returns an appropriate nullptr rather than a partially populated script if the XML reader reports an error.</w:t>
+      </w:r>
+    </w:p>
+    <w:p/>
+    <w:p>
+      <w:r>
+        <w:rPr>
+          <w:noProof/>
+        </w:rPr>
+        <w:lastRenderedPageBreak/>
+        <w:drawing>
+          <wp:anchor distT="0" distB="0" distL="114300" distR="114300" simplePos="0" relativeHeight="251665408" behindDoc="0" locked="0" layoutInCell="1" allowOverlap="1" wp14:anchorId="30581DD2" wp14:editId="68848DE4">
+            <wp:simplePos x="0" y="0"/>
+            <wp:positionH relativeFrom="margin">
+              <wp:align>right</wp:align>
+            </wp:positionH>
+            <wp:positionV relativeFrom="paragraph">
+              <wp:posOffset>98425</wp:posOffset>
+            </wp:positionV>
+            <wp:extent cx="5505450" cy="3324225"/>
+            <wp:effectExtent l="0" t="0" r="0" b="9525"/>
+            <wp:wrapTopAndBottom/>
+            <wp:docPr id="1141418232" name="Picture 14"/>
+            <wp:cNvGraphicFramePr>
+              <a:graphicFrameLocks xmlns:a="http://schemas.openxmlformats.org/drawingml/2006/main" noChangeAspect="1"/>
+            </wp:cNvGraphicFramePr>
+            <a:graphic xmlns:a="http://schemas.openxmlformats.org/drawingml/2006/main">
+              <a:graphicData uri="http://schemas.openxmlformats.org/drawingml/2006/picture">
+                <pic:pic xmlns:pic="http://schemas.openxmlformats.org/drawingml/2006/picture">
+                  <pic:nvPicPr>
+                    <pic:cNvPr id="0" name="Picture 8"/>
+                    <pic:cNvPicPr>
+                      <a:picLocks noChangeAspect="1" noChangeArrowheads="1"/>
+                    </pic:cNvPicPr>
+                  </pic:nvPicPr>
+                  <pic:blipFill>
+                    <a:blip r:embed="rId17" cstate="print">
+                      <a:extLst>
+                        <a:ext uri="{28A0092B-C50C-407E-A947-70E740481C1C}">
+                          <a14:useLocalDpi xmlns:a14="http://schemas.microsoft.com/office/drawing/2010/main" val="0"/>
+                        </a:ext>
+                      </a:extLst>
+                    </a:blip>
+                    <a:srcRect/>
+                    <a:stretch>
+                      <a:fillRect/>
+                    </a:stretch>
+                  </pic:blipFill>
+                  <pic:spPr bwMode="auto">
+                    <a:xfrm>
+                      <a:off x="0" y="0"/>
+                      <a:ext cx="5505450" cy="3324225"/>
+                    </a:xfrm>
+                    <a:prstGeom prst="rect">
+                      <a:avLst/>
+                    </a:prstGeom>
+                    <a:noFill/>
+                    <a:ln>
+                      <a:noFill/>
+                    </a:ln>
+                  </pic:spPr>
+                </pic:pic>
+              </a:graphicData>
+            </a:graphic>
+            <wp14:sizeRelH relativeFrom="page">
+              <wp14:pctWidth>0</wp14:pctWidth>
+            </wp14:sizeRelH>
+            <wp14:sizeRelV relativeFrom="page">
+              <wp14:pctHeight>0</wp14:pctHeight>
+            </wp14:sizeRelV>
+          </wp:anchor>
+        </w:drawing>
+      </w:r>
+    </w:p>
+    <w:p/>
+    <w:p>
+      <w:pPr>
+        <w:pStyle w:val="Heading3"/>
+      </w:pPr>
+      <w:r>
+        <w:t>4.4.3 PdfExporter</w:t>
+      </w:r>
+    </w:p>
+    <w:p/>
+    <w:p/>
+    <w:p>
+      <w:pPr>
+        <w:pStyle w:val="Heading2"/>
+      </w:pPr>
+      <w:bookmarkStart w:id="43" w:name="_Toc227772882"/>
+      <w:r>
+        <w:t>4.5 ViewModel Layer</w:t>
+      </w:r>
+      <w:bookmarkEnd w:id="43"/>
+    </w:p>
+    <w:p/>
+    <w:p>
+      <w:pPr>
+        <w:pStyle w:val="Heading3"/>
+      </w:pPr>
+      <w:r>
+        <w:t>4.5.1 ScriptViewModel</w:t>
+      </w:r>
+    </w:p>
+    <w:p>
+      <w:r>
+        <w:rPr>
+          <w:rStyle w:val="codeChar"/>
+        </w:rPr>
+        <w:t>ScriptViewModel</w:t>
+      </w:r>
+      <w:r>
+        <w:t xml:space="preserve"> sits at the centre of the applications architecture mediating between the services layer and the view layer. Its design reflects two core principles:</w:t>
       </w:r>
     </w:p>
     <w:p>
@@ -7023,67 +8222,7 @@
         </w:numPr>
       </w:pPr>
       <w:r>
-        <w:t>services/</w:t>
-      </w:r>
-    </w:p>
-    <w:p>
-      <w:r>
-        <w:t>The decision was made to limit QObject inheritance to the view and viewmodel layers only. QObject provides the signal and slot functionality from Qt along with memory management and meta-object features which are not needed in the model or services layers. Inheriting QObject unnecessarily adds overhead and creates a dependency on Qt where it is not needed. Plain C++ classes in the model layer are lighter and more portable. They can also be unit tested without instantiating a QApplicaiton.</w:t>
-      </w:r>
-    </w:p>
-    <w:p/>
-    <w:p>
-      <w:r>
-        <w:t>CMake is used as the build system. “target_include_directories” is configured to src/, meaning that all includes can be written relative to the src/ root.</w:t>
-      </w:r>
-    </w:p>
-    <w:p/>
-    <w:p>
-      <w:pPr>
-        <w:pStyle w:val="Heading2"/>
-      </w:pPr>
-      <w:bookmarkStart w:id="38" w:name="_Toc227772877"/>
-      <w:r>
-        <w:t>4.3 Model Layer</w:t>
-      </w:r>
-      <w:bookmarkEnd w:id="38"/>
-    </w:p>
-    <w:p/>
-    <w:p>
-      <w:r>
-        <w:t>The model layer consists of three plain C++ classes: ScriptElement, Scene, and Script. Together these represent the complete data structure of a screenplay. None of these inherit from QObject. QString is retained as the string type throughout despite the plain C++ principle. This is because the serialization and view layers operate natively with QString. Converting from std::string at every layer boundary would introduce unnecessary friction with no architectural benefit.</w:t>
-      </w:r>
-    </w:p>
-    <w:p>
-      <w:pPr>
-        <w:rPr>
-          <w:color w:val="EE0000"/>
-        </w:rPr>
-      </w:pPr>
-      <w:r>
-        <w:rPr>
-          <w:color w:val="EE0000"/>
-        </w:rPr>
-        <w:t>UML CLASS DIAGRAM OF MODEL LAYER SHOWING OWNERSHIP BETWEEN SCRIPT, SCENE AND SCRIPTELEMENT.</w:t>
-      </w:r>
-    </w:p>
-    <w:p/>
-    <w:p>
-      <w:pPr>
-        <w:pStyle w:val="Heading3"/>
-      </w:pPr>
-      <w:bookmarkStart w:id="39" w:name="_Toc227772878"/>
-      <w:r>
-        <w:t>4.3.1 ScriptElement</w:t>
-      </w:r>
-      <w:bookmarkEnd w:id="39"/>
-    </w:p>
-    <w:p>
-      <w:r>
-        <w:t xml:space="preserve">ScriptElement represents a single block of screenplay content e.g. one action line, one line of dialogue, one scene heading, etc. </w:t>
-      </w:r>
-      <w:r>
-        <w:t>A QString of text content is paired with an ElementType enum value which supports the following screenplay element types:</w:t>
+        <w:t>The MVVM boundary must be preserved.</w:t>
       </w:r>
     </w:p>
     <w:p>
@@ -7095,7 +8234,181 @@
         </w:numPr>
       </w:pPr>
       <w:r>
-        <w:t>SCENE_HEADING</w:t>
+        <w:t>Dependencies should be injected rather than called internally.</w:t>
+      </w:r>
+    </w:p>
+    <w:p>
+      <w:r>
+        <w:t xml:space="preserve">A design challenge arose in determining how </w:t>
+      </w:r>
+      <w:r>
+        <w:rPr>
+          <w:rStyle w:val="codeChar"/>
+        </w:rPr>
+        <w:t>ScriptManager</w:t>
+      </w:r>
+      <w:r>
+        <w:t xml:space="preserve">’s state changes would reach the view. The straightforward approach </w:t>
+      </w:r>
+      <w:r>
+        <w:t xml:space="preserve">was connecting </w:t>
+      </w:r>
+      <w:r>
+        <w:rPr>
+          <w:rStyle w:val="codeChar"/>
+        </w:rPr>
+        <w:t>ScriptManager</w:t>
+      </w:r>
+      <w:r>
+        <w:t xml:space="preserve">’s signals to slots in the view layer, but this would violate the MVVM boundary. Instead </w:t>
+      </w:r>
+      <w:r>
+        <w:rPr>
+          <w:rStyle w:val="codeChar"/>
+        </w:rPr>
+        <w:t>ScriptViewModel</w:t>
+      </w:r>
+      <w:r>
+        <w:t xml:space="preserve">’s constructor connects to </w:t>
+      </w:r>
+      <w:r>
+        <w:rPr>
+          <w:rStyle w:val="codeChar"/>
+        </w:rPr>
+        <w:t>ScriptManager</w:t>
+      </w:r>
+      <w:r>
+        <w:t>’s signals internally and emits view facing signals in response. This keeps the boundary layer intact regardless of how the service layer evolves.</w:t>
+      </w:r>
+    </w:p>
+    <w:p/>
+    <w:p>
+      <w:r>
+        <w:lastRenderedPageBreak/>
+        <w:t xml:space="preserve">Tab key element type cycling is handled here rather than in </w:t>
+      </w:r>
+      <w:r>
+        <w:rPr>
+          <w:rStyle w:val="codeChar"/>
+        </w:rPr>
+        <w:t>ScriptEditor</w:t>
+      </w:r>
+      <w:r>
+        <w:t xml:space="preserve"> because it is a rule about screenplay structure and not a UI concern.</w:t>
+      </w:r>
+      <w:r>
+        <w:t xml:space="preserve"> A dedicated </w:t>
+      </w:r>
+      <w:r>
+        <w:rPr>
+          <w:rStyle w:val="codeChar"/>
+        </w:rPr>
+        <w:t>onElementTypeSelected</w:t>
+      </w:r>
+      <w:r>
+        <w:t xml:space="preserve"> method</w:t>
+      </w:r>
+      <w:r>
+        <w:t xml:space="preserve"> </w:t>
+      </w:r>
+      <w:r>
+        <w:t xml:space="preserve">serves as the single entry point for direct element type changes. This is called by both the status bar picker and the editor inline </w:t>
+      </w:r>
+      <w:proofErr w:type="gramStart"/>
+      <w:r>
+        <w:t>popup</w:t>
+      </w:r>
+      <w:proofErr w:type="gramEnd"/>
+      <w:r>
+        <w:t xml:space="preserve"> so the logic is not duplicated in the view.</w:t>
+      </w:r>
+    </w:p>
+    <w:p/>
+    <w:p>
+      <w:r>
+        <w:t xml:space="preserve">Navigation between scenes emits only </w:t>
+      </w:r>
+      <w:r>
+        <w:rPr>
+          <w:rStyle w:val="codeChar"/>
+        </w:rPr>
+        <w:t>currentSceneChanged</w:t>
+      </w:r>
+      <w:r>
+        <w:t xml:space="preserve"> and not </w:t>
+      </w:r>
+      <w:r>
+        <w:rPr>
+          <w:rStyle w:val="codeChar"/>
+        </w:rPr>
+        <w:t>elementTypeChanged</w:t>
+      </w:r>
+      <w:r>
+        <w:t xml:space="preserve"> to ensure the status bar is updated by the cursor position mechanism in the </w:t>
+      </w:r>
+      <w:r>
+        <w:rPr>
+          <w:rStyle w:val="codeChar"/>
+        </w:rPr>
+        <w:t>ScriptEditor</w:t>
+      </w:r>
+      <w:r>
+        <w:t xml:space="preserve"> rather than by the ViewModel, and that navigating to a scene never corrupts block formatting.</w:t>
+      </w:r>
+    </w:p>
+    <w:p/>
+    <w:p>
+      <w:pPr>
+        <w:pStyle w:val="Heading2"/>
+      </w:pPr>
+      <w:bookmarkStart w:id="44" w:name="_Toc227772883"/>
+      <w:r>
+        <w:t>4.6 View Layer</w:t>
+      </w:r>
+      <w:bookmarkEnd w:id="44"/>
+    </w:p>
+    <w:p/>
+    <w:p>
+      <w:pPr>
+        <w:pStyle w:val="Heading3"/>
+      </w:pPr>
+      <w:r>
+        <w:t>4.6.1 ScriptEditor</w:t>
+      </w:r>
+    </w:p>
+    <w:p>
+      <w:r>
+        <w:rPr>
+          <w:rStyle w:val="codeChar"/>
+        </w:rPr>
+        <w:t>ScriptEditor</w:t>
+      </w:r>
+      <w:r>
+        <w:t xml:space="preserve"> is the core writing widget, subclassing </w:t>
+      </w:r>
+      <w:r>
+        <w:rPr>
+          <w:rStyle w:val="codeChar"/>
+        </w:rPr>
+        <w:t>QTextEdit</w:t>
+      </w:r>
+      <w:r>
+        <w:t xml:space="preserve"> to gain direct access to the document model, cursor and key event system. It holds a non-owning pointer to </w:t>
+      </w:r>
+      <w:r>
+        <w:rPr>
+          <w:rStyle w:val="codeChar"/>
+        </w:rPr>
+        <w:t>ScriptViewModel</w:t>
+      </w:r>
+      <w:r>
+        <w:t xml:space="preserve"> and communicates exclusively through it.</w:t>
+      </w:r>
+    </w:p>
+    <w:p/>
+    <w:p>
+      <w:r>
+        <w:t>Its responsibilities include:</w:t>
       </w:r>
     </w:p>
     <w:p>
@@ -7107,7 +8420,7 @@
         </w:numPr>
       </w:pPr>
       <w:r>
-        <w:t>ACTION</w:t>
+        <w:t>Formatting</w:t>
       </w:r>
     </w:p>
     <w:p>
@@ -7119,7 +8432,7 @@
         </w:numPr>
       </w:pPr>
       <w:r>
-        <w:t>CHARACTER</w:t>
+        <w:t>Key Event Handling</w:t>
       </w:r>
     </w:p>
     <w:p>
@@ -7131,8 +8444,7 @@
         </w:numPr>
       </w:pPr>
       <w:r>
-        <w:lastRenderedPageBreak/>
-        <w:t>DIALOGUE</w:t>
+        <w:t>Document Synchronisation</w:t>
       </w:r>
     </w:p>
     <w:p>
@@ -7144,435 +8456,160 @@
         </w:numPr>
       </w:pPr>
       <w:r>
-        <w:t>PARENTHETICAL</w:t>
-      </w:r>
-    </w:p>
-    <w:p>
-      <w:pPr>
-        <w:pStyle w:val="ListParagraph"/>
-        <w:numPr>
-          <w:ilvl w:val="0"/>
-          <w:numId w:val="4"/>
-        </w:numPr>
-      </w:pPr>
-      <w:r>
-        <w:t>TRANSITION</w:t>
-      </w:r>
-    </w:p>
-    <w:p>
-      <w:pPr>
-        <w:pStyle w:val="ListParagraph"/>
-        <w:numPr>
-          <w:ilvl w:val="0"/>
-          <w:numId w:val="4"/>
-        </w:numPr>
-      </w:pPr>
-      <w:r>
-        <w:t>SHOT</w:t>
-      </w:r>
-    </w:p>
-    <w:p>
-      <w:r>
-        <w:t>Each of these carries distinct formatting rules. The rules are applied by the view layer based on the type which keeps the formatting logic out of the model layer.</w:t>
+        <w:t>Element Type Tracking</w:t>
+      </w:r>
+    </w:p>
+    <w:p>
+      <w:r>
+        <w:t xml:space="preserve">Formatting is applied in two layers with </w:t>
+      </w:r>
+      <w:r>
+        <w:rPr>
+          <w:rStyle w:val="codeChar"/>
+        </w:rPr>
+        <w:t>QTextBlockFormat</w:t>
+      </w:r>
+      <w:r>
+        <w:t xml:space="preserve"> controlling the paragraph level indentation and alignment using the measurements established in the literature survey. </w:t>
+      </w:r>
+      <w:r>
+        <w:rPr>
+          <w:rStyle w:val="codeChar"/>
+        </w:rPr>
+        <w:t>QTextCharFormat</w:t>
+      </w:r>
+      <w:r>
+        <w:t xml:space="preserve"> controls font, capitalisation and weight per element type. Capitalisation for relevant elements is applied using </w:t>
+      </w:r>
+      <w:r>
+        <w:rPr>
+          <w:rStyle w:val="codeChar"/>
+        </w:rPr>
+        <w:t>QFont::AllUppercase</w:t>
+      </w:r>
+      <w:r>
+        <w:t xml:space="preserve"> to not transform the underlying string.</w:t>
       </w:r>
     </w:p>
     <w:p/>
     <w:p>
-      <w:pPr>
-        <w:pStyle w:val="Heading3"/>
-      </w:pPr>
-      <w:bookmarkStart w:id="40" w:name="_Toc227772879"/>
-      <w:r>
-        <w:t>4.3.2 Scene</w:t>
-      </w:r>
-      <w:bookmarkEnd w:id="40"/>
-    </w:p>
-    <w:p>
-      <w:r>
-        <w:t>A Scene object is a collection of ScriptElement objects alongside a scene number and heading. The design decision that had to be made here was how to manage element ownership. Elements are stored as</w:t>
-      </w:r>
-      <w:r>
-        <w:t>:</w:t>
+      <w:r>
+        <w:t xml:space="preserve">The </w:t>
+      </w:r>
+      <w:r>
+        <w:rPr>
+          <w:rStyle w:val="codeChar"/>
+        </w:rPr>
+        <w:t>QTextDocument</w:t>
+      </w:r>
+      <w:r>
+        <w:t xml:space="preserve"> has no native concept of element types. Qt’s </w:t>
+      </w:r>
+      <w:r>
+        <w:rPr>
+          <w:rStyle w:val="codeChar"/>
+        </w:rPr>
+        <w:t>QTextBlockUserData</w:t>
+      </w:r>
+      <w:r>
+        <w:t xml:space="preserve"> was used to attach a </w:t>
+      </w:r>
+      <w:r>
+        <w:rPr>
+          <w:rStyle w:val="codeChar"/>
+        </w:rPr>
+        <w:t>BlockData</w:t>
+      </w:r>
+      <w:r>
+        <w:t xml:space="preserve"> object to each block that records its </w:t>
+      </w:r>
+      <w:r>
+        <w:rPr>
+          <w:rStyle w:val="codeChar"/>
+        </w:rPr>
+        <w:t>ElementType</w:t>
+      </w:r>
+      <w:r>
+        <w:t xml:space="preserve">. This </w:t>
+      </w:r>
+      <w:r>
+        <w:t>bridges the gap between the visual document and the data model.</w:t>
       </w:r>
     </w:p>
     <w:p/>
     <w:p>
       <w:r>
-        <w:t>std::vector&lt;</w:t>
-      </w:r>
-      <w:r>
-        <w:t>std::unique_ptr&lt;ScriptElement&gt;&gt;</w:t>
+        <w:rPr>
+          <w:rStyle w:val="codeChar"/>
+        </w:rPr>
+        <w:t>syncToModel</w:t>
+      </w:r>
+      <w:r>
+        <w:t xml:space="preserve"> reads every block’s </w:t>
+      </w:r>
+      <w:r>
+        <w:rPr>
+          <w:rStyle w:val="codeChar"/>
+        </w:rPr>
+        <w:t>BlockData</w:t>
+      </w:r>
+      <w:r>
+        <w:t xml:space="preserve"> and rebuilds the script before saving. </w:t>
+      </w:r>
+      <w:r>
+        <w:rPr>
+          <w:rStyle w:val="codeChar"/>
+        </w:rPr>
+        <w:t>loadFromScript</w:t>
+      </w:r>
+      <w:r>
+        <w:t xml:space="preserve"> repopulates the document block by block from the model after loading, applying the correct formatting and registering scene </w:t>
+      </w:r>
+      <w:r>
+        <w:lastRenderedPageBreak/>
+        <w:t xml:space="preserve">heading positions for the navigator. The cursor position is monitored via </w:t>
+      </w:r>
+      <w:r>
+        <w:rPr>
+          <w:rStyle w:val="codeChar"/>
+        </w:rPr>
+        <w:t>cursorPositionChanged</w:t>
+      </w:r>
+      <w:r>
+        <w:t xml:space="preserve"> which reads block data from the current block to keep the status bar indicator accurate. This only fires when </w:t>
+      </w:r>
+      <w:r>
+        <w:rPr>
+          <w:rStyle w:val="codeChar"/>
+        </w:rPr>
+        <w:t>BlockData</w:t>
+      </w:r>
+      <w:r>
+        <w:t xml:space="preserve"> is present meaning newly inserted empty blocks are skipped preventing the element type from being incorrectly reset before the ViewModel sets the correct type for the new line.</w:t>
       </w:r>
     </w:p>
     <w:p/>
     <w:p>
       <w:r>
-        <w:t>A unique pointer was chosen because a ScriptElement only belongs to one scene. A unique pointer enforces single ownership at a language level. When a Scene is destroyed its elements are automatically destroyed with it eliminating the need for manual memory management.</w:t>
-      </w:r>
-    </w:p>
-    <w:p/>
-    <w:p>
-      <w:r>
-        <w:t>Initially QList was used rather than std::vector for the element container but this produced a compilation error. QList uses copy on write and requires all contained types to be copyable. Unique pointers are not copyable by design which made the combination impossible. Switching to std::vector resolved this and had the additional benefit of keeping the model layer free of Qt container dependencies.</w:t>
-      </w:r>
-    </w:p>
-    <w:p/>
-    <w:p>
-      <w:r>
-        <w:t xml:space="preserve">Because unique pointers are </w:t>
-      </w:r>
-      <w:r>
-        <w:t>non-copyable</w:t>
-      </w:r>
-      <w:r>
-        <w:t xml:space="preserve">, Scene itself is made non copyable. The Rule of Five was applied explicitly where the copy constructor and copy assignment were marked “= delete” as well as the move constructor and move assignment were marked “= default”. </w:t>
-      </w:r>
-      <w:r>
-        <w:t>This makes scene move-only, meaning it can be transferred between owners but never duplicated. A setSceneNumber method was deliberately not implemented as scene numbers are applied due to their position in the script. Allowing scenes to set their own number risks inconsistent states such as duplicates of gaps.</w:t>
-      </w:r>
-    </w:p>
-    <w:p/>
-    <w:p>
-      <w:pPr>
-        <w:pStyle w:val="Heading3"/>
-      </w:pPr>
-      <w:bookmarkStart w:id="41" w:name="_Toc227772880"/>
-      <w:r>
-        <w:t>4.3.3 Script</w:t>
-      </w:r>
-      <w:bookmarkEnd w:id="41"/>
-    </w:p>
-    <w:p>
-      <w:r>
-        <w:t xml:space="preserve">This is the </w:t>
-      </w:r>
-      <w:r>
-        <w:t>top-level</w:t>
-      </w:r>
-      <w:r>
-        <w:t xml:space="preserve"> data object which owns all the scenes along with holding the title and author metadata. Scenes are stored using plain value semantics rather than using a unique pointer. This decision was made after considering both options. Using unique pointers would allocate each scene individually on the heap </w:t>
-      </w:r>
-      <w:r>
-        <w:lastRenderedPageBreak/>
-        <w:t xml:space="preserve">which would scatter the objects in memory and require pointer indirection to access them. A plain value vector stores all scenes contiguously which is better for cache locality. While the performance difference is negligible at the scale of this project, it was determined that there was no need to introduce heap allocation and pointer indirection when there was no provided benefit. Ownership of each scene is already enforced by containment as a Scene cannot exist in two Script objects simultaneously. It was determined that unique pointers solved a technical problem for </w:t>
-      </w:r>
-      <w:r>
-        <w:t>ScriptElement,</w:t>
-      </w:r>
-      <w:r>
-        <w:t xml:space="preserve"> but plain value semantics were sufficient in this case. </w:t>
-      </w:r>
-    </w:p>
-    <w:p/>
-    <w:p>
-      <w:pPr>
-        <w:pStyle w:val="Heading2"/>
-      </w:pPr>
-      <w:bookmarkStart w:id="42" w:name="_Toc227772881"/>
-      <w:r>
-        <w:t>4.4 Services Layer</w:t>
-      </w:r>
-      <w:bookmarkEnd w:id="42"/>
-    </w:p>
-    <w:p/>
-    <w:p>
-      <w:pPr>
-        <w:pStyle w:val="Heading3"/>
-      </w:pPr>
-      <w:r>
-        <w:t>4.4.1 ScriptManager</w:t>
-      </w:r>
-    </w:p>
-    <w:p>
-      <w:r>
-        <w:t>ScriptManager was implemented as the central point of control for the script lifecycle. It owns the active Script instance as a std::unique_ptr. This means the script object is destroyed when ScriptManager closes it or is itself destroyed.</w:t>
-      </w:r>
-    </w:p>
-    <w:p/>
-    <w:p>
-      <w:r>
-        <w:t xml:space="preserve">ScriptManager also owns the instances of OsfSerialiser and PdfExporter. This ensures the ViewModel layer has no direct dependency on file format implementations. A singleton pattern was considered and rejected in favour of constructing a single instance at the application level and passing it where needed. This </w:t>
-      </w:r>
-      <w:r>
-        <w:t>avoids</w:t>
-      </w:r>
-      <w:r>
-        <w:t xml:space="preserve"> the hidden dependencies and potential testing difficulties that global state introduces.</w:t>
-      </w:r>
-    </w:p>
-    <w:p/>
-    <w:p>
-      <w:r>
-        <w:t>ScriptManager inherits from QObject as it needs to emit signals when script state changes. Four signals were defined:</w:t>
-      </w:r>
-    </w:p>
-    <w:p>
-      <w:pPr>
-        <w:pStyle w:val="ListParagraph"/>
-        <w:numPr>
-          <w:ilvl w:val="0"/>
-          <w:numId w:val="4"/>
-        </w:numPr>
-      </w:pPr>
-      <w:r>
-        <w:t>scriptLoaded</w:t>
-      </w:r>
-    </w:p>
-    <w:p>
-      <w:pPr>
-        <w:pStyle w:val="ListParagraph"/>
-        <w:numPr>
-          <w:ilvl w:val="0"/>
-          <w:numId w:val="4"/>
-        </w:numPr>
-      </w:pPr>
-      <w:r>
-        <w:t>scriptClosed</w:t>
-      </w:r>
-    </w:p>
-    <w:p>
-      <w:pPr>
-        <w:pStyle w:val="ListParagraph"/>
-        <w:numPr>
-          <w:ilvl w:val="0"/>
-          <w:numId w:val="4"/>
-        </w:numPr>
-      </w:pPr>
-      <w:r>
-        <w:t>scriptSaved</w:t>
-      </w:r>
-    </w:p>
-    <w:p>
-      <w:pPr>
-        <w:pStyle w:val="ListParagraph"/>
-        <w:numPr>
-          <w:ilvl w:val="0"/>
-          <w:numId w:val="4"/>
-        </w:numPr>
-      </w:pPr>
-      <w:r>
-        <w:t>errorOccurred</w:t>
-      </w:r>
-    </w:p>
-    <w:p/>
-    <w:p>
-      <w:r>
-        <w:t>getScript() also returns a raw pointer rather than a reference or unique_ptr. This is because a reference implies the script always exists and returning a unique pointer would transfer ownership outside of ScriptManager.</w:t>
-      </w:r>
-    </w:p>
-    <w:p/>
-    <w:p>
-      <w:pPr>
-        <w:pStyle w:val="Heading3"/>
-      </w:pPr>
-      <w:r>
-        <w:t>4.4.2 OsfSeriali</w:t>
-      </w:r>
-      <w:r>
-        <w:t>z</w:t>
-      </w:r>
-      <w:r>
-        <w:t>er</w:t>
-      </w:r>
-    </w:p>
-    <w:p>
-      <w:r>
-        <w:t>OsfSerializer implements Qt’s QXmlStreamWriter and QXmlStreamReader. The XML structure maps directly onto the applications model layer:</w:t>
-      </w:r>
-    </w:p>
-    <w:p>
-      <w:pPr>
-        <w:pStyle w:val="ListParagraph"/>
-        <w:numPr>
-          <w:ilvl w:val="0"/>
-          <w:numId w:val="4"/>
-        </w:numPr>
-      </w:pPr>
-      <w:r>
-        <w:t>&lt;screenplay&gt; holds title and author attributes.</w:t>
-      </w:r>
-    </w:p>
-    <w:p>
-      <w:pPr>
-        <w:pStyle w:val="ListParagraph"/>
-        <w:numPr>
-          <w:ilvl w:val="0"/>
-          <w:numId w:val="4"/>
-        </w:numPr>
-      </w:pPr>
-      <w:r>
-        <w:t>&lt;scene&gt; holds its number and heading.</w:t>
-      </w:r>
-    </w:p>
-    <w:p>
-      <w:pPr>
-        <w:pStyle w:val="ListParagraph"/>
-        <w:numPr>
-          <w:ilvl w:val="0"/>
-          <w:numId w:val="4"/>
-        </w:numPr>
-      </w:pPr>
-      <w:r>
-        <w:lastRenderedPageBreak/>
-        <w:t>&lt;element&gt; contains its type as an attribute and the text content as the element body.</w:t>
-      </w:r>
-    </w:p>
-    <w:p/>
-    <w:p>
-      <w:r>
-        <w:t xml:space="preserve">QXmlStreamWriter was chosen over Qt’s DOM based QDomDocument as it writes the document incrementally as a forward only stream. This is more memory efficient for large documents and maps naturally onto iterating through the </w:t>
-      </w:r>
-      <w:r>
-        <w:t>script</w:t>
-      </w:r>
-      <w:r>
-        <w:t xml:space="preserve"> scenes and elements. QXmlStreamReader reads the document as a token stream</w:t>
-      </w:r>
-      <w:r>
-        <w:t xml:space="preserve"> where each call to readNext() advances to the next token. State is maintained across tokens using local variables and local pointers. This is done since the element type attribute and text content arrive in separate consecutive tokens. </w:t>
-      </w:r>
-    </w:p>
-    <w:p/>
-    <w:p>
-      <w:r>
-        <w:t xml:space="preserve">Whitespace characters are produced by the auto formatted XML. These </w:t>
-      </w:r>
-      <w:r>
-        <w:t>must</w:t>
-      </w:r>
-      <w:r>
-        <w:t xml:space="preserve"> be filtered by trimming and skipping empty strings.</w:t>
-      </w:r>
-    </w:p>
-    <w:p/>
-    <w:p>
-      <w:r>
-        <w:t>Both save and load operations return early on file open failure and the load function returns an appropriate nullptr rather than a partially populated script if the XML reader reports an error.</w:t>
-      </w:r>
-    </w:p>
-    <w:p/>
-    <w:p>
-      <w:pPr>
-        <w:rPr>
-          <w:color w:val="EE0000"/>
-        </w:rPr>
-      </w:pPr>
-      <w:r>
-        <w:rPr>
-          <w:color w:val="EE0000"/>
-        </w:rPr>
-        <w:t>IMAGE: example of OSF XML output for a simple two scene script.</w:t>
-      </w:r>
-    </w:p>
-    <w:p/>
-    <w:p>
-      <w:pPr>
-        <w:pStyle w:val="Heading3"/>
-      </w:pPr>
-      <w:r>
-        <w:t>4.4.3 PdfExporter</w:t>
-      </w:r>
-    </w:p>
-    <w:p/>
-    <w:p/>
-    <w:p>
-      <w:pPr>
-        <w:pStyle w:val="Heading2"/>
-      </w:pPr>
-      <w:bookmarkStart w:id="43" w:name="_Toc227772882"/>
-      <w:r>
-        <w:t>4.5 ViewModel Layer</w:t>
-      </w:r>
-      <w:bookmarkEnd w:id="43"/>
-    </w:p>
-    <w:p/>
-    <w:p>
-      <w:pPr>
-        <w:pStyle w:val="Heading3"/>
-      </w:pPr>
-      <w:r>
-        <w:t>4.5.1 ScriptViewModel</w:t>
-      </w:r>
-    </w:p>
-    <w:p>
-      <w:r>
-        <w:t>ScriptViewModel sits at the centre of the applications architecture mediating between the services layer and the view layer. Its design reflects two core principles:</w:t>
-      </w:r>
-    </w:p>
-    <w:p>
-      <w:pPr>
-        <w:pStyle w:val="ListParagraph"/>
-        <w:numPr>
-          <w:ilvl w:val="0"/>
-          <w:numId w:val="4"/>
-        </w:numPr>
-      </w:pPr>
-      <w:r>
-        <w:t>The MVVM boundary must be preserved.</w:t>
-      </w:r>
-    </w:p>
-    <w:p>
-      <w:pPr>
-        <w:pStyle w:val="ListParagraph"/>
-        <w:numPr>
-          <w:ilvl w:val="0"/>
-          <w:numId w:val="4"/>
-        </w:numPr>
-      </w:pPr>
-      <w:r>
-        <w:t>Dependencies should be injected rather than called internally.</w:t>
-      </w:r>
-    </w:p>
-    <w:p>
-      <w:r>
-        <w:t xml:space="preserve">A design challenge arose in determining how ScriptManager’s state changes would reach the view. The straightforward approach </w:t>
-      </w:r>
-      <w:r>
-        <w:t>was connecting ScriptManager’s signals to slots in the view layer, but this would violate the MVVM boundary. Instead ScriptViewModel’s constructor connects to ScriptManager’s signals internally and emits view facing signals in response. This keeps the boundary layer intact regardless of how the service layer evolves.</w:t>
-      </w:r>
-    </w:p>
-    <w:p/>
-    <w:p>
-      <w:r>
-        <w:lastRenderedPageBreak/>
-        <w:t xml:space="preserve">Tab key element type cycling is handled here rather than in ScriptEditor because it is a rule about screenplay structure and not a UI concern. </w:t>
-      </w:r>
-    </w:p>
-    <w:p/>
-    <w:p>
-      <w:pPr>
-        <w:pStyle w:val="Heading2"/>
-      </w:pPr>
-      <w:bookmarkStart w:id="44" w:name="_Toc227772883"/>
-      <w:r>
-        <w:t>4.6 View Layer</w:t>
-      </w:r>
-      <w:bookmarkEnd w:id="44"/>
-    </w:p>
-    <w:p/>
-    <w:p>
-      <w:pPr>
-        <w:pStyle w:val="Heading3"/>
-      </w:pPr>
-      <w:r>
-        <w:t>4.6.1 ScriptEditor</w:t>
-      </w:r>
-    </w:p>
-    <w:p>
-      <w:r>
-        <w:t xml:space="preserve">ScriptEditor subclasses QTextEdit to gain direct access to the key event system and the document cursor. Formatting is applied in two layers using Qt’s QTextBlockFormat and QTextCharFormat. Block format controls paragraph level indentation and alignment according to the industry standard measurements established in the literature survey. Char format controls capitalisation and font styling per element type. </w:t>
-      </w:r>
-    </w:p>
-    <w:p/>
-    <w:p>
-      <w:r>
-        <w:t xml:space="preserve">The capitalisation of certain elements is applied visually using QFont::AllUppercase rather than modifying the underlying string. This means the OSF serializer always stores the text as it is typed rather than in its display form. </w:t>
-      </w:r>
-    </w:p>
-    <w:p/>
-    <w:p>
-      <w:r>
-        <w:t>Key presses are intercepted by overriding keyPressEvent. When Tab and Enter are pressed they are reported to the ViewModel which applies the logic of element type transitions. All other keys pass through QTextEdit normally.</w:t>
+        <w:t xml:space="preserve">Over the course of incremental development </w:t>
+      </w:r>
+      <w:r>
+        <w:rPr>
+          <w:rStyle w:val="codeChar"/>
+        </w:rPr>
+        <w:t>ScriptEditor</w:t>
+      </w:r>
+      <w:r>
+        <w:t xml:space="preserve"> accumulated significant responsibility. A future refactor would extract a </w:t>
+      </w:r>
+      <w:r>
+        <w:rPr>
+          <w:rStyle w:val="codeChar"/>
+        </w:rPr>
+        <w:t>DocumentManager</w:t>
+      </w:r>
+      <w:r>
+        <w:t xml:space="preserve"> class to separate the sync and block tracking functionality from the formatting and key element handling functionality as noted in Section 7.</w:t>
       </w:r>
     </w:p>
     <w:p>
@@ -7606,7 +8643,7 @@
                     </pic:cNvPicPr>
                   </pic:nvPicPr>
                   <pic:blipFill>
-                    <a:blip r:embed="rId17">
+                    <a:blip r:embed="rId18">
                       <a:extLst>
                         <a:ext uri="{28A0092B-C50C-407E-A947-70E740481C1C}">
                           <a14:useLocalDpi xmlns:a14="http://schemas.microsoft.com/office/drawing/2010/main" val="0"/>
@@ -7647,6 +8684,19 @@
       </w:r>
     </w:p>
     <w:p/>
+    <w:p>
+      <w:pPr>
+        <w:rPr>
+          <w:color w:val="EE0000"/>
+        </w:rPr>
+      </w:pPr>
+      <w:r>
+        <w:rPr>
+          <w:color w:val="EE0000"/>
+        </w:rPr>
+        <w:t xml:space="preserve">Further Screenshots showing evolution of ScriptEditor Widget </w:t>
+      </w:r>
+    </w:p>
     <w:p/>
     <w:p>
       <w:pPr>
@@ -7658,22 +8708,91 @@
     </w:p>
     <w:p>
       <w:r>
-        <w:t xml:space="preserve">SceneNavigator is a panel widget displayed to the left of ScriptEditor in a QSplitter layout. It presents the Scripts Scenes as a scrollable list, showing each scene number and heading. This allows the user to jump directly to any scene by clicking it. </w:t>
+        <w:rPr>
+          <w:rStyle w:val="codeChar"/>
+        </w:rPr>
+        <w:t>SceneNavigator</w:t>
+      </w:r>
+      <w:r>
+        <w:t xml:space="preserve"> is a panel widget displayed to the left of ScriptEditor in a QSplitter layout. It presents the Scripts Scenes as a scrollable list, showing each scene number and heading. This allows the user to jump directly to any scene by clicking it. </w:t>
       </w:r>
     </w:p>
     <w:p/>
     <w:p>
       <w:r>
-        <w:t xml:space="preserve">The choice was made to add new scenes through the writing flow itself rather than providing an explicit button to add new scenes. The user cycles to SCENE_HEADING on an empty line and types the heading. Pressing Enter means the ScriptViewModel detects SCENE_HEADING and emits a signal that the SceneNavigator receives and rebuilds the Scenes list. This keeps the interface minimal and consistent with how professional screenwriting tools handle scene creation. The user never has to leave the writing flow. </w:t>
+        <w:lastRenderedPageBreak/>
+        <w:t xml:space="preserve">The choice was made to add new scenes through the writing flow itself rather than providing an explicit button to add new scenes. The user cycles to </w:t>
+      </w:r>
+      <w:r>
+        <w:rPr>
+          <w:rStyle w:val="codeChar"/>
+        </w:rPr>
+        <w:t>SCENE_HEADING</w:t>
+      </w:r>
+      <w:r>
+        <w:t xml:space="preserve"> on an empty line and types the heading. Pressing Enter means the </w:t>
+      </w:r>
+      <w:r>
+        <w:rPr>
+          <w:rStyle w:val="codeChar"/>
+        </w:rPr>
+        <w:t>ScriptViewModel</w:t>
+      </w:r>
+      <w:r>
+        <w:t xml:space="preserve"> detects </w:t>
+      </w:r>
+      <w:r>
+        <w:rPr>
+          <w:rStyle w:val="codeChar"/>
+        </w:rPr>
+        <w:t>SCENE_HEADING</w:t>
+      </w:r>
+      <w:r>
+        <w:t xml:space="preserve"> and emits a signal that the </w:t>
+      </w:r>
+      <w:r>
+        <w:rPr>
+          <w:rStyle w:val="codeChar"/>
+        </w:rPr>
+        <w:t>SceneNavigator</w:t>
+      </w:r>
+      <w:r>
+        <w:t xml:space="preserve"> receives and rebuilds the Scenes list. This keeps the interface minimal and consistent with how professional screenwriting tools handle scene creation. The user never has to leave the writing flow. </w:t>
       </w:r>
     </w:p>
     <w:p/>
+    <w:p/>
+    <w:p>
+      <w:pPr>
+        <w:rPr>
+          <w:color w:val="EE0000"/>
+        </w:rPr>
+      </w:pPr>
+      <w:r>
+        <w:rPr>
+          <w:color w:val="EE0000"/>
+        </w:rPr>
+        <w:t>THIS CAN BE REMOVED AS IT IS IN THE PROBLEMS SECTION MAYBE</w:t>
+      </w:r>
+    </w:p>
     <w:p>
       <w:r>
         <w:t xml:space="preserve">A feedback loop risk was noted when updating the selected row. When currentSceneChanged fires, the navigator must update its highlighted row, doing so would trigger onItemClicked which would notify the ViewModel which would notify the navigator again. This was resolved using Qt’s blockSignals mechanism. This temporarily suppresses a widgets signals during a programmatic update before restoring normal behaviour. </w:t>
       </w:r>
     </w:p>
-    <w:p/>
+    <w:p>
+      <w:pPr>
+        <w:rPr>
+          <w:color w:val="EE0000"/>
+        </w:rPr>
+      </w:pPr>
+      <w:r>
+        <w:rPr>
+          <w:color w:val="EE0000"/>
+        </w:rPr>
+        <w:t>And this??</w:t>
+      </w:r>
+    </w:p>
     <w:p>
       <w:r>
         <w:t xml:space="preserve">Jumping to a scene required solving a separate navigation problem that is described in Section 4.8.6. </w:t>
@@ -7684,7 +8803,6 @@
         <w:rPr>
           <w:noProof/>
         </w:rPr>
-        <w:lastRenderedPageBreak/>
         <w:drawing>
           <wp:anchor distT="0" distB="0" distL="114300" distR="114300" simplePos="0" relativeHeight="251660288" behindDoc="0" locked="0" layoutInCell="1" allowOverlap="1" wp14:anchorId="2EBB5B37" wp14:editId="6DF734C5">
             <wp:simplePos x="0" y="0"/>
@@ -7711,7 +8829,7 @@
                     </pic:cNvPicPr>
                   </pic:nvPicPr>
                   <pic:blipFill>
-                    <a:blip r:embed="rId18">
+                    <a:blip r:embed="rId19">
                       <a:extLst>
                         <a:ext uri="{28A0092B-C50C-407E-A947-70E740481C1C}">
                           <a14:useLocalDpi xmlns:a14="http://schemas.microsoft.com/office/drawing/2010/main" val="0"/>
@@ -7757,6 +8875,7 @@
         <w:pStyle w:val="Heading3"/>
       </w:pPr>
       <w:r>
+        <w:lastRenderedPageBreak/>
         <w:t>4.6.3 MainWindow</w:t>
       </w:r>
     </w:p>
@@ -7766,31 +8885,130 @@
         <w:t xml:space="preserve">MainWindow is the top level window that owns the applications objects and wires all the components together. </w:t>
       </w:r>
       <w:r>
-        <w:t xml:space="preserve">It constructs ScriptManager, ScriptViewModel, ScriptEditor and SceneNavigator in sequence passing each dependency to the next. </w:t>
+        <w:t xml:space="preserve">It constructs </w:t>
+      </w:r>
+      <w:r>
+        <w:rPr>
+          <w:rStyle w:val="codeChar"/>
+        </w:rPr>
+        <w:t>ScriptManager</w:t>
+      </w:r>
+      <w:r>
+        <w:t xml:space="preserve">, </w:t>
+      </w:r>
+      <w:r>
+        <w:rPr>
+          <w:rStyle w:val="codeChar"/>
+        </w:rPr>
+        <w:t>ScriptViewModel</w:t>
+      </w:r>
+      <w:r>
+        <w:t xml:space="preserve">, </w:t>
+      </w:r>
+      <w:r>
+        <w:rPr>
+          <w:rStyle w:val="codeChar"/>
+        </w:rPr>
+        <w:t>ScriptEditor</w:t>
+      </w:r>
+      <w:r>
+        <w:t xml:space="preserve"> and </w:t>
+      </w:r>
+      <w:r>
+        <w:rPr>
+          <w:rStyle w:val="codeChar"/>
+        </w:rPr>
+        <w:t>SceneNavigator</w:t>
+      </w:r>
+      <w:r>
+        <w:t xml:space="preserve"> in sequence passing each dependency to the next. </w:t>
       </w:r>
     </w:p>
     <w:p/>
     <w:p>
       <w:r>
-        <w:t xml:space="preserve">A QSplitter divides the window horizontally with SceneNavigator </w:t>
+        <w:t xml:space="preserve">A </w:t>
+      </w:r>
+      <w:r>
+        <w:rPr>
+          <w:rStyle w:val="codeChar"/>
+        </w:rPr>
+        <w:t>QSplitter</w:t>
+      </w:r>
+      <w:r>
+        <w:t xml:space="preserve"> divides the window horizontally with </w:t>
+      </w:r>
+      <w:r>
+        <w:rPr>
+          <w:rStyle w:val="codeChar"/>
+        </w:rPr>
+        <w:t>SceneNavigator</w:t>
+      </w:r>
+      <w:r>
+        <w:t xml:space="preserve"> </w:t>
       </w:r>
       <w:r>
         <w:t>occupying</w:t>
       </w:r>
       <w:r>
-        <w:t xml:space="preserve"> 20% of the width and ScriptEditor taking the remaining 80%.</w:t>
+        <w:t xml:space="preserve"> 20% of the width and </w:t>
+      </w:r>
+      <w:r>
+        <w:rPr>
+          <w:rStyle w:val="codeChar"/>
+        </w:rPr>
+        <w:t>ScriptEditor</w:t>
+      </w:r>
+      <w:r>
+        <w:t xml:space="preserve"> taking the remaining 80%.</w:t>
       </w:r>
     </w:p>
     <w:p/>
     <w:p>
       <w:r>
-        <w:t xml:space="preserve">A menu bar has been implemented that provides File operations. These actions are connected to a corresponding slot in MainWindow which delegates to ScriptViewModel. </w:t>
+        <w:t xml:space="preserve">A menu bar has been implemented that provides File operations. These actions are connected to a corresponding slot in </w:t>
+      </w:r>
+      <w:r>
+        <w:rPr>
+          <w:rStyle w:val="codeChar"/>
+        </w:rPr>
+        <w:t>MainWindow</w:t>
+      </w:r>
+      <w:r>
+        <w:t xml:space="preserve"> which delegates to </w:t>
+      </w:r>
+      <w:r>
+        <w:rPr>
+          <w:rStyle w:val="codeChar"/>
+        </w:rPr>
+        <w:t>ScriptViewModel</w:t>
+      </w:r>
+      <w:r>
+        <w:t xml:space="preserve">. </w:t>
       </w:r>
     </w:p>
     <w:p/>
     <w:p>
       <w:r>
-        <w:t>A purpose build NewScriptDialog was developed to make sure the user enters the author and title of the script as the script is being created. The filename field auto-populates from the title. A QFileDialog opens after confirmation so the user chooses the save location before the script is created, this ensures the file has a known file path from the start.</w:t>
+        <w:t>A view menu provides theme togglin</w:t>
+      </w:r>
+      <w:r>
+        <w:t>g between light mode and dark mode.</w:t>
+      </w:r>
+    </w:p>
+    <w:p/>
+    <w:p>
+      <w:r>
+        <w:t xml:space="preserve">A purpose build </w:t>
+      </w:r>
+      <w:r>
+        <w:rPr>
+          <w:rStyle w:val="codeChar"/>
+        </w:rPr>
+        <w:t>NewScriptDialog</w:t>
+      </w:r>
+      <w:r>
+        <w:t xml:space="preserve"> was developed to make sure the user enters the author and title of the script as the script is being created. A QFileDialog opens after confirmation so the user chooses the save location before the script is created, this ensures the file has a known file path from the start.</w:t>
       </w:r>
     </w:p>
     <w:p/>
@@ -7850,7 +9068,25 @@
     <w:p/>
     <w:p>
       <w:r>
-        <w:t xml:space="preserve">The element type label required an event filter to respond to mouse clicks since QLabel has no clicked signal. A MouseButtonPress triggers an element type picker menu to appear. </w:t>
+        <w:t xml:space="preserve">The element type label required an event filter to respond to mouse clicks since </w:t>
+      </w:r>
+      <w:r>
+        <w:rPr>
+          <w:rStyle w:val="codeChar"/>
+        </w:rPr>
+        <w:t>QLabel</w:t>
+      </w:r>
+      <w:r>
+        <w:t xml:space="preserve"> has no clicked signal. A </w:t>
+      </w:r>
+      <w:r>
+        <w:rPr>
+          <w:rStyle w:val="codeChar"/>
+        </w:rPr>
+        <w:t>MouseButtonPress</w:t>
+      </w:r>
+      <w:r>
+        <w:t xml:space="preserve"> triggers an element type picker menu to appear. </w:t>
       </w:r>
     </w:p>
     <w:p/>
@@ -7889,6 +9125,21 @@
       </w:r>
     </w:p>
     <w:p/>
+    <w:p/>
+    <w:p/>
+    <w:p>
+      <w:pPr>
+        <w:rPr>
+          <w:color w:val="EE0000"/>
+        </w:rPr>
+      </w:pPr>
+      <w:r>
+        <w:rPr>
+          <w:color w:val="EE0000"/>
+        </w:rPr>
+        <w:t>IS THIS IN THE PROBLEMS BECAUSE IF SO THEN CAN PROBABLY BE REMOVED</w:t>
+      </w:r>
+    </w:p>
     <w:p>
       <w:r>
         <w:t>QMenu handles arrow key navigation natively but not Tab. An event filter was installed on the menu object to intercept Tab key presses and manually advance the active action.</w:t>
@@ -7900,7 +9151,6 @@
         <w:rPr>
           <w:noProof/>
         </w:rPr>
-        <w:lastRenderedPageBreak/>
         <w:drawing>
           <wp:anchor distT="0" distB="0" distL="114300" distR="114300" simplePos="0" relativeHeight="251661312" behindDoc="0" locked="0" layoutInCell="1" allowOverlap="1" wp14:anchorId="51BC6C40" wp14:editId="36CB56F4">
             <wp:simplePos x="0" y="0"/>
@@ -7927,7 +9177,7 @@
                     </pic:cNvPicPr>
                   </pic:nvPicPr>
                   <pic:blipFill>
-                    <a:blip r:embed="rId19" cstate="print">
+                    <a:blip r:embed="rId20" cstate="print">
                       <a:extLst>
                         <a:ext uri="{28A0092B-C50C-407E-A947-70E740481C1C}">
                           <a14:useLocalDpi xmlns:a14="http://schemas.microsoft.com/office/drawing/2010/main" val="0"/>
@@ -7966,14 +9216,92 @@
           </wp:anchor>
         </w:drawing>
       </w:r>
+      <w:r>
+        <w:t xml:space="preserve">Theme management is handled inline in </w:t>
+      </w:r>
+      <w:r>
+        <w:rPr>
+          <w:rStyle w:val="codeChar"/>
+        </w:rPr>
+        <w:t>MainWindow</w:t>
+      </w:r>
+      <w:r>
+        <w:t xml:space="preserve"> rather than as a dedicated service class. A </w:t>
+      </w:r>
+      <w:r>
+        <w:rPr>
+          <w:rStyle w:val="codeChar"/>
+        </w:rPr>
+        <w:t>ThemeManager</w:t>
+      </w:r>
+      <w:r>
+        <w:t xml:space="preserve"> service would be appropriate where theme changes needed to spread to independent components via signals. In this application </w:t>
+      </w:r>
+      <w:r>
+        <w:rPr>
+          <w:rStyle w:val="codeChar"/>
+        </w:rPr>
+        <w:t>MainWindow</w:t>
+      </w:r>
+      <w:r>
+        <w:t xml:space="preserve"> directly owns </w:t>
+      </w:r>
+      <w:r>
+        <w:rPr>
+          <w:rStyle w:val="codeChar"/>
+        </w:rPr>
+        <w:t>ScriptEditor</w:t>
+      </w:r>
+      <w:r>
+        <w:t xml:space="preserve"> and </w:t>
+      </w:r>
+      <w:r>
+        <w:rPr>
+          <w:rStyle w:val="codeChar"/>
+        </w:rPr>
+        <w:t>SceneNavigator</w:t>
+      </w:r>
+      <w:r>
+        <w:t>. Therefore, it was deemed that the decoupling benefit of a service class did not justify the additional complexity.</w:t>
+      </w:r>
     </w:p>
     <w:p/>
     <w:p>
+      <w:r>
+        <w:t xml:space="preserve">System theme detection uses </w:t>
+      </w:r>
+      <w:r>
+        <w:rPr>
+          <w:rStyle w:val="codeChar"/>
+        </w:rPr>
+        <w:t>QPalette::Window</w:t>
+      </w:r>
+      <w:r>
+        <w:t xml:space="preserve"> where a lightness value below 128 is treated as dark. This is evaluated one time in the constructor, so the application opens matching the system setting, with a toggle option in the view menu available as user override.</w:t>
+      </w:r>
+    </w:p>
+    <w:p/>
+    <w:p>
+      <w:pPr>
+        <w:rPr>
+          <w:color w:val="EE0000"/>
+        </w:rPr>
+      </w:pPr>
+      <w:r>
+        <w:rPr>
+          <w:color w:val="EE0000"/>
+        </w:rPr>
+        <w:t>IMAGES LIGHT THEME AND DARK THEME</w:t>
+      </w:r>
+    </w:p>
+    <w:p/>
+    <w:p>
       <w:pPr>
         <w:pStyle w:val="Heading2"/>
       </w:pPr>
       <w:bookmarkStart w:id="45" w:name="_Toc227772884"/>
       <w:r>
+        <w:lastRenderedPageBreak/>
         <w:t>4.7 Unit Testing</w:t>
       </w:r>
       <w:bookmarkEnd w:id="45"/>
@@ -7989,7 +9317,23 @@
     </w:p>
     <w:p>
       <w:r>
-        <w:t xml:space="preserve">Unit Tests were written using Qt Test which is Qt’s built in testing framework. This integrates directly with Qt Creator and CMake. A separate test target “tst_modellayer” was configured in a dedicated tests directory with its own “CMakeLists.txt”. There are additional test targets for different layer testing. The model source files are compiled directly into the test executable using “target_sources”. “CMAKE_AUTOMOC” is enabled in the test CMake configuration to allow Qt’s meta object compiler to process the test class, which is required for the Q_OBJECT macro used by Qt Test’s test runner. </w:t>
+        <w:t>Unit Tests were written using Qt Test which is Qt’s built in testing framework. This integrates directly with Qt Creator and CMake. A separate test target “</w:t>
+      </w:r>
+      <w:proofErr w:type="spellStart"/>
+      <w:r>
+        <w:t>tst_modellayer</w:t>
+      </w:r>
+      <w:proofErr w:type="spellEnd"/>
+      <w:r>
+        <w:t>” was configured in a dedicated tests directory with its own “CMakeLists.txt”. There are additional test targets for different layer testing. The model source files are compiled directly into the test executable using “</w:t>
+      </w:r>
+      <w:proofErr w:type="spellStart"/>
+      <w:r>
+        <w:t>target_sources</w:t>
+      </w:r>
+      <w:proofErr w:type="spellEnd"/>
+      <w:r>
+        <w:t xml:space="preserve">”. “CMAKE_AUTOMOC” is enabled in the test CMake configuration to allow Qt’s meta object compiler to process the test class, which is required for the Q_OBJECT macro used by Qt Test’s test runner. </w:t>
       </w:r>
     </w:p>
     <w:p/>
@@ -8023,7 +9367,6 @@
         <w:rPr>
           <w:noProof/>
         </w:rPr>
-        <w:lastRenderedPageBreak/>
         <w:drawing>
           <wp:anchor distT="0" distB="0" distL="114300" distR="114300" simplePos="0" relativeHeight="251658240" behindDoc="0" locked="0" layoutInCell="1" allowOverlap="1" wp14:anchorId="04256252" wp14:editId="5C2ABA4B">
             <wp:simplePos x="0" y="0"/>
@@ -8050,7 +9393,7 @@
                     </pic:cNvPicPr>
                   </pic:nvPicPr>
                   <pic:blipFill>
-                    <a:blip r:embed="rId20">
+                    <a:blip r:embed="rId21">
                       <a:extLst>
                         <a:ext uri="{28A0092B-C50C-407E-A947-70E740481C1C}">
                           <a14:useLocalDpi xmlns:a14="http://schemas.microsoft.com/office/drawing/2010/main" val="0"/>
@@ -8096,20 +9439,48 @@
         <w:pStyle w:val="Heading3"/>
       </w:pPr>
       <w:r>
-        <w:t>4.7.3 Service Layer Tests</w:t>
+        <w:t>4..7.3 Services Layer Tests</w:t>
+      </w:r>
+    </w:p>
+    <w:p>
+      <w:r>
+        <w:t xml:space="preserve">Services layer tests were not completed within the project timeline. Testing </w:t>
+      </w:r>
+      <w:r>
+        <w:rPr>
+          <w:rStyle w:val="codeChar"/>
+        </w:rPr>
+        <w:t>OsfSerializer</w:t>
+      </w:r>
+      <w:r>
+        <w:t xml:space="preserve"> with complete save and load test verifying on a multi scene script where the script survives serialization intact is identified as a priority for further development in Section 7.</w:t>
       </w:r>
     </w:p>
     <w:p/>
+    <w:p>
+      <w:pPr>
+        <w:pStyle w:val="Heading2"/>
+      </w:pPr>
+      <w:bookmarkStart w:id="46" w:name="_Toc227772885"/>
+      <w:r>
+        <w:lastRenderedPageBreak/>
+        <w:t>4.8 Challenges and Solutions</w:t>
+      </w:r>
+      <w:bookmarkEnd w:id="46"/>
+    </w:p>
     <w:p/>
     <w:p>
       <w:pPr>
-        <w:pStyle w:val="Heading2"/>
-      </w:pPr>
-      <w:bookmarkStart w:id="46" w:name="_Toc227772885"/>
-      <w:r>
-        <w:t>4.8 Challenges and Solutions</w:t>
-      </w:r>
-      <w:bookmarkEnd w:id="46"/>
+        <w:pStyle w:val="Heading3"/>
+      </w:pPr>
+      <w:r>
+        <w:t>4.8.1 QList incompatibility with unique pointers</w:t>
+      </w:r>
+    </w:p>
+    <w:p>
+      <w:r>
+        <w:t>The initial implementation of Scene::elements_ used unique pointers which produced a compilation error. QList requires copyable element types due to its copy-on-write implementation, unique pointers are non-copyable. The fix was to switch to std::vector which supports move only types correctly.</w:t>
+      </w:r>
     </w:p>
     <w:p/>
     <w:p>
@@ -8117,12 +9488,12 @@
         <w:pStyle w:val="Heading3"/>
       </w:pPr>
       <w:r>
-        <w:t>4.8.1 QList incompatibility with unique pointers</w:t>
-      </w:r>
-    </w:p>
-    <w:p>
-      <w:r>
-        <w:t>The initial implementation of Scene::elements_ used unique pointers which produced a compilation error. QList requires copyable element types due to its copy-on-write implementation, unique pointers are non-copyable. The fix was to switch to std::vector which supports move only types correctly.</w:t>
+        <w:t>4.8.2 Ownership model for Script::scenes_</w:t>
+      </w:r>
+    </w:p>
+    <w:p>
+      <w:r>
+        <w:t>A decision was required on whether to store scenes as plain values or as unique pointers. The unique pointer approach was considered for consistency with the element ownership model but was rejected as it introduces heap allocation and pointer indirection with no benefit. Ownership is already enforced by containment in the vector. The decision was documented explicitly to distinguish between unique pointers used to solve a technical problem versus unique pointers used as a style choice.</w:t>
       </w:r>
     </w:p>
     <w:p/>
@@ -8131,12 +9502,36 @@
         <w:pStyle w:val="Heading3"/>
       </w:pPr>
       <w:r>
-        <w:t>4.8.2 Ownership model for Script::scenes_</w:t>
-      </w:r>
-    </w:p>
-    <w:p>
-      <w:r>
-        <w:t>A decision was required on whether to store scenes as plain values or as unique pointers. The unique pointer approach was considered for consistency with the element ownership model but was rejected as it introduces heap allocation and pointer indirection with no benefit. Ownership is already enforced by containment in the vector. The decision was documented explicitly to distinguish between unique pointers used to solve a technical problem versus unique pointers used as a style choice.</w:t>
+        <w:t>4.8.3 Qt Test .moc include</w:t>
+      </w:r>
+    </w:p>
+    <w:p>
+      <w:r>
+        <w:t xml:space="preserve">When setting up Qt Test, the generated .moc file was initially included as </w:t>
+      </w:r>
+      <w:proofErr w:type="spellStart"/>
+      <w:r>
+        <w:t>testModelLayer.cpp.moc</w:t>
+      </w:r>
+      <w:proofErr w:type="spellEnd"/>
+      <w:r>
+        <w:t xml:space="preserve"> following older Qt documentation. Qt 6 with CMAKE_AUTOMOC expects </w:t>
+      </w:r>
+      <w:proofErr w:type="spellStart"/>
+      <w:r>
+        <w:t>testModelLayer.moc</w:t>
+      </w:r>
+      <w:proofErr w:type="spellEnd"/>
+      <w:r>
+        <w:t xml:space="preserve"> without the .</w:t>
+      </w:r>
+      <w:proofErr w:type="spellStart"/>
+      <w:r>
+        <w:t>cpp</w:t>
+      </w:r>
+      <w:proofErr w:type="spellEnd"/>
+      <w:r>
+        <w:t xml:space="preserve"> component. Correcting this resolved the build error.</w:t>
       </w:r>
     </w:p>
     <w:p/>
@@ -8145,87 +9540,118 @@
         <w:pStyle w:val="Heading3"/>
       </w:pPr>
       <w:r>
-        <w:t>4.8.3 Qt Test .moc include</w:t>
-      </w:r>
-    </w:p>
-    <w:p>
-      <w:r>
-        <w:t xml:space="preserve">When setting up Qt Test, the generated .moc file was initially included as testModelLayer.cpp.moc following older Qt documentation. Qt 6 with </w:t>
-      </w:r>
+        <w:t>4.8.4 Preserving MVVM boundary when connection service layer signals to the View</w:t>
+      </w:r>
+    </w:p>
+    <w:p>
+      <w:r>
+        <w:t xml:space="preserve">Due to the chosen architecture, a challenge arose in determining how ScriptManager’s state change signals would reach the view layer. It was considered to connect them directly to View </w:t>
+      </w:r>
+      <w:r>
+        <w:t>components,</w:t>
+      </w:r>
+      <w:r>
+        <w:t xml:space="preserve"> but this would create a direct dependency on ScriptManager which violates the MVVM boundary.</w:t>
+      </w:r>
+    </w:p>
+    <w:p/>
+    <w:p>
+      <w:r>
+        <w:t xml:space="preserve">The solution here was to connect ScriptManager’s signals to lambda function inside the ScriptViewModel’s constructor. This then translated the service layer signals into view facing signals. The outcome is the MVVM </w:t>
+      </w:r>
+      <w:r>
+        <w:t>boundary</w:t>
+      </w:r>
+      <w:r>
+        <w:t xml:space="preserve"> is kept intact and means the View layer has the single point of contact (ScriptViewModel) regardless of how many service layer classes exist beneath it.</w:t>
+      </w:r>
+    </w:p>
+    <w:p/>
+    <w:p>
+      <w:pPr>
+        <w:pStyle w:val="Heading3"/>
+      </w:pPr>
       <w:r>
         <w:lastRenderedPageBreak/>
-        <w:t>CMAKE_AUTOMOC expects testModelLayer.moc without the .cpp component. Correcting this resolved the build error.</w:t>
+        <w:t>4.8.5 MVVM boundary violation in SceneNavigator</w:t>
+      </w:r>
+    </w:p>
+    <w:p>
+      <w:r>
+        <w:t xml:space="preserve">During the implementation of SceneNavigator, an issue was identified where the View was using the ViewModel to access ScriptManager and retrieve scene data. The initial implementation called </w:t>
+      </w:r>
+      <w:proofErr w:type="spellStart"/>
+      <w:r>
+        <w:t>viewModel</w:t>
+      </w:r>
+      <w:proofErr w:type="spellEnd"/>
+      <w:r>
+        <w:t>_-&gt;</w:t>
+      </w:r>
+      <w:proofErr w:type="spellStart"/>
+      <w:r>
+        <w:t>getScriptManager</w:t>
+      </w:r>
+      <w:proofErr w:type="spellEnd"/>
+      <w:r>
+        <w:t>()-&gt;getScript-&gt;</w:t>
+      </w:r>
+      <w:proofErr w:type="spellStart"/>
+      <w:r>
+        <w:t>getScenes</w:t>
+      </w:r>
+      <w:proofErr w:type="spellEnd"/>
+      <w:r>
+        <w:t xml:space="preserve">(). This gave SceneNavigator a direct dependency on ScriptManager and Script which are two layers the View should not have access to. </w:t>
       </w:r>
     </w:p>
     <w:p/>
     <w:p>
+      <w:r>
+        <w:t xml:space="preserve">The fix was to remove </w:t>
+      </w:r>
+      <w:proofErr w:type="spellStart"/>
+      <w:r>
+        <w:t>getScriptManager</w:t>
+      </w:r>
+      <w:proofErr w:type="spellEnd"/>
+      <w:r>
+        <w:t xml:space="preserve">() from ScriptViewModel and replace it with the purpose built method: </w:t>
+      </w:r>
+      <w:proofErr w:type="spellStart"/>
+      <w:r>
+        <w:t>getSceneList</w:t>
+      </w:r>
+      <w:proofErr w:type="spellEnd"/>
+      <w:r>
+        <w:t xml:space="preserve">() which returns a formatted </w:t>
+      </w:r>
+      <w:proofErr w:type="spellStart"/>
+      <w:r>
+        <w:t>QStringList</w:t>
+      </w:r>
+      <w:proofErr w:type="spellEnd"/>
+      <w:r>
+        <w:t>. The View now calls only these methods and has no visibility into the services layer. This correction reinforces the MVVM boundary as the ViewModel is the single point of contact for the View.</w:t>
+      </w:r>
+    </w:p>
+    <w:p/>
+    <w:p>
       <w:pPr>
         <w:pStyle w:val="Heading3"/>
       </w:pPr>
       <w:r>
-        <w:t>4.8.4 Preserving MVVM boundary when connection service layer signals to the View</w:t>
-      </w:r>
-    </w:p>
-    <w:p>
-      <w:r>
-        <w:t xml:space="preserve">Due to the chosen architecture, a challenge arose in determining how ScriptManager’s state change signals would reach the view layer. It was considered to connect them directly to View </w:t>
-      </w:r>
-      <w:r>
-        <w:t>components,</w:t>
-      </w:r>
-      <w:r>
-        <w:t xml:space="preserve"> but this would create a direct dependency on ScriptManager which violates the MVVM boundary.</w:t>
+        <w:t>4.8.6 Locating Scenes in a Continuous Document</w:t>
+      </w:r>
+    </w:p>
+    <w:p>
+      <w:r>
+        <w:t>A challenge arose when implementing scene jump functionality in SceneNavigator. The application needed to scroll ScriptEditor to the correct position when a user clicked a scene in the navigator list. The difficulty was that ScriptEditor operates as a single continuous QTextDocument with no built in concept of scenes. There was no way of the document knowing where a particular scene started.</w:t>
       </w:r>
     </w:p>
     <w:p/>
     <w:p>
       <w:r>
-        <w:t xml:space="preserve">The solution here was to connect ScriptManager’s signals to lambda function inside the ScriptViewModel’s constructor. This then translated the service layer signals into view facing signals. The outcome is the MVVM </w:t>
-      </w:r>
-      <w:r>
-        <w:t>boundary</w:t>
-      </w:r>
-      <w:r>
-        <w:t xml:space="preserve"> is kept intact and means the View layer has the single point of contact (ScriptViewModel) regardless of how many service layer classes exist beneath it.</w:t>
-      </w:r>
-    </w:p>
-    <w:p/>
-    <w:p>
-      <w:pPr>
-        <w:pStyle w:val="Heading3"/>
-      </w:pPr>
-      <w:r>
-        <w:t>4.8.5 MVVM boundary violation in SceneNavigator</w:t>
-      </w:r>
-    </w:p>
-    <w:p>
-      <w:r>
-        <w:t xml:space="preserve">During the implementation of SceneNavigator, an issue was identified where the View was using the ViewModel to access ScriptManager and retrieve scene data. The initial implementation called viewModel_-&gt;getScriptManager()-&gt;getScript-&gt;getScenes(). This gave SceneNavigator a direct dependency on ScriptManager and Script which are two layers the View should not have access to. </w:t>
-      </w:r>
-    </w:p>
-    <w:p/>
-    <w:p>
-      <w:r>
-        <w:t>The fix was to remove getScriptManager() from ScriptViewModel and replace it with the purpose built method: getSceneList() which returns a formatted QStringList. The View now calls only these methods and has no visibility into the services layer. This correction reinforces the MVVM boundary as the ViewModel is the single point of contact for the View.</w:t>
-      </w:r>
-    </w:p>
-    <w:p/>
-    <w:p>
-      <w:pPr>
-        <w:pStyle w:val="Heading3"/>
-      </w:pPr>
-      <w:r>
-        <w:t>4.8.6 Locating Scenes in a Continuous Document</w:t>
-      </w:r>
-    </w:p>
-    <w:p>
-      <w:r>
-        <w:t>A challenge arose when implementing scene jump functionality in SceneNavigator. The application needed to scroll ScriptEditor to the correct position when a user clicked a scene in the navigator list. The difficulty was that ScriptEditor operates as a single continuous QTextDocument with no built in concept of scenes. There was no way of the document knowing where a particular scene started.</w:t>
-      </w:r>
-    </w:p>
-    <w:p/>
-    <w:p>
-      <w:r>
         <w:t xml:space="preserve">The solution was to register each scene’s starting block in ScriptViewModel </w:t>
       </w:r>
       <w:r>
@@ -8235,11 +9661,7 @@
         <w:t xml:space="preserve"> the scene is created. When the user </w:t>
       </w:r>
       <w:r>
-        <w:t xml:space="preserve">presses enter and confirm a scene heading, </w:t>
-      </w:r>
-      <w:r>
-        <w:lastRenderedPageBreak/>
-        <w:t>keyPressEvent captures the current block number before the new block is inserted and calls registerSceneBlock with the scene index and block number. These are stored in a QMap&lt;int, int&gt; which maps scene index to block number. When the user clicks a scene in SceneNavigator, ScriptViewModel emits currentSceneChanged, ScriptEditor looks up the block number and uses findBlockByNumber to locate the correct position moving the cursor there and scrolling the viewport with ensureCursorVisible.</w:t>
+        <w:t>presses enter and confirm a scene heading, keyPressEvent captures the current block number before the new block is inserted and calls registerSceneBlock with the scene index and block number. These are stored in a QMap&lt;int, int&gt; which maps scene index to block number. When the user clicks a scene in SceneNavigator, ScriptViewModel emits currentSceneChanged, ScriptEditor looks up the block number and uses findBlockByNumber to locate the correct position moving the cursor there and scrolling the viewport with ensureCursorVisible.</w:t>
       </w:r>
     </w:p>
     <w:p/>
@@ -8302,7 +9724,87 @@
     </w:p>
     <w:p>
       <w:r>
-        <w:t xml:space="preserve">The initial implementation of NewScriptDialog contained a bug where the accepted signal of QDialogButtonBox was incorrectly connected to QDialog::reject rather than QDialog::rejejected. This meant that clicking OK triggered onAccepted and reject. Since reject fired after accept, the dialog was always Rejected. As A consequence, MainWindow::onNewScript never saw QDialog::Accepted, no script was created and the scene navigator always appeared empty. The bug was identified by tracing the signal chain from the button click to ScriptManager::hasScript. </w:t>
+        <w:t xml:space="preserve">The initial implementation of NewScriptDialog contained a bug where the accepted signal of </w:t>
+      </w:r>
+      <w:proofErr w:type="spellStart"/>
+      <w:r>
+        <w:t>QDialogButtonBox</w:t>
+      </w:r>
+      <w:proofErr w:type="spellEnd"/>
+      <w:r>
+        <w:t xml:space="preserve"> was incorrectly connected to </w:t>
+      </w:r>
+      <w:proofErr w:type="spellStart"/>
+      <w:r>
+        <w:t>QDialog</w:t>
+      </w:r>
+      <w:proofErr w:type="spellEnd"/>
+      <w:r>
+        <w:t xml:space="preserve">::reject rather than </w:t>
+      </w:r>
+      <w:proofErr w:type="spellStart"/>
+      <w:r>
+        <w:t>QDialog</w:t>
+      </w:r>
+      <w:proofErr w:type="spellEnd"/>
+      <w:r>
+        <w:t>::</w:t>
+      </w:r>
+      <w:proofErr w:type="spellStart"/>
+      <w:r>
+        <w:t>rejejected</w:t>
+      </w:r>
+      <w:proofErr w:type="spellEnd"/>
+      <w:r>
+        <w:t xml:space="preserve">. This meant that clicking OK triggered </w:t>
+      </w:r>
+      <w:proofErr w:type="spellStart"/>
+      <w:r>
+        <w:t>onAccepted</w:t>
+      </w:r>
+      <w:proofErr w:type="spellEnd"/>
+      <w:r>
+        <w:t xml:space="preserve"> and reject. Since reject fired after </w:t>
+      </w:r>
+      <w:proofErr w:type="gramStart"/>
+      <w:r>
+        <w:t>accept</w:t>
+      </w:r>
+      <w:proofErr w:type="gramEnd"/>
+      <w:r>
+        <w:t xml:space="preserve">, the dialog was always Rejected. </w:t>
+      </w:r>
+      <w:proofErr w:type="gramStart"/>
+      <w:r>
+        <w:t>As A consequence</w:t>
+      </w:r>
+      <w:proofErr w:type="gramEnd"/>
+      <w:r>
+        <w:t>, MainWindow::</w:t>
+      </w:r>
+      <w:proofErr w:type="spellStart"/>
+      <w:r>
+        <w:t>onNewScript</w:t>
+      </w:r>
+      <w:proofErr w:type="spellEnd"/>
+      <w:r>
+        <w:t xml:space="preserve"> never saw </w:t>
+      </w:r>
+      <w:proofErr w:type="spellStart"/>
+      <w:r>
+        <w:t>QDialog</w:t>
+      </w:r>
+      <w:proofErr w:type="spellEnd"/>
+      <w:r>
+        <w:t>::Accepted, no script was created and the scene navigator always appeared empty. The bug was identified by tracing the signal chain from the button click to ScriptManager::</w:t>
+      </w:r>
+      <w:proofErr w:type="spellStart"/>
+      <w:r>
+        <w:t>hasScript</w:t>
+      </w:r>
+      <w:proofErr w:type="spellEnd"/>
+      <w:r>
+        <w:t xml:space="preserve">. </w:t>
       </w:r>
     </w:p>
     <w:p/>
@@ -8349,7 +9851,7 @@
                     </pic:cNvPicPr>
                   </pic:nvPicPr>
                   <pic:blipFill>
-                    <a:blip r:embed="rId21">
+                    <a:blip r:embed="rId22">
                       <a:extLst>
                         <a:ext uri="{28A0092B-C50C-407E-A947-70E740481C1C}">
                           <a14:useLocalDpi xmlns:a14="http://schemas.microsoft.com/office/drawing/2010/main" val="0"/>
@@ -8420,7 +9922,7 @@
                     </pic:cNvPicPr>
                   </pic:nvPicPr>
                   <pic:blipFill>
-                    <a:blip r:embed="rId22">
+                    <a:blip r:embed="rId23">
                       <a:extLst>
                         <a:ext uri="{28A0092B-C50C-407E-A947-70E740481C1C}">
                           <a14:useLocalDpi xmlns:a14="http://schemas.microsoft.com/office/drawing/2010/main" val="0"/>
@@ -8493,7 +9995,7 @@
                     </pic:cNvPicPr>
                   </pic:nvPicPr>
                   <pic:blipFill>
-                    <a:blip r:embed="rId23">
+                    <a:blip r:embed="rId24">
                       <a:extLst>
                         <a:ext uri="{28A0092B-C50C-407E-A947-70E740481C1C}">
                           <a14:useLocalDpi xmlns:a14="http://schemas.microsoft.com/office/drawing/2010/main" val="0"/>
@@ -8545,13 +10047,45 @@
     </w:p>
     <w:p>
       <w:r>
-        <w:t>An architectural gap was identified during testing. The QTextEdit document and the Script data model were completely disconnected. The editor wrote to its own QTextDocument but this content was never transferred into ScriptElement objects. At the same time when loading a file, the Script model was correctly populated from the OSF file but nothing used it to populate the editor. The result was that saving produced an empty or incomplete file and loading showed scenes in the navigator but nothing in the editor.</w:t>
+        <w:t xml:space="preserve">An architectural gap was identified during testing. The QTextEdit document and the Script data model were completely disconnected. The editor wrote to its own </w:t>
+      </w:r>
+      <w:proofErr w:type="gramStart"/>
+      <w:r>
+        <w:t>QTextDocument</w:t>
+      </w:r>
+      <w:proofErr w:type="gramEnd"/>
+      <w:r>
+        <w:t xml:space="preserve"> but this content was never transferred into ScriptElement objects. At the same time when loading a file, the Script model was correctly populated from the OSF </w:t>
+      </w:r>
+      <w:proofErr w:type="gramStart"/>
+      <w:r>
+        <w:t>file</w:t>
+      </w:r>
+      <w:proofErr w:type="gramEnd"/>
+      <w:r>
+        <w:t xml:space="preserve"> but nothing used it to populate the editor. The result was that saving produced an empty or incomplete file and loading showed scenes in the navigator but nothing in the editor.</w:t>
       </w:r>
     </w:p>
     <w:p/>
     <w:p>
       <w:r>
-        <w:t xml:space="preserve">The solution was a mechanism for syncing both ways built around QTextBlockUserData. As QTextDocument is organised into blocks Each block previously did not have a concept of ElementType. A BlockData subclass of QTextBlockUserData was introduced. It stores one ElementType value and is attached to each block when applyElementFormatting is called. Qt manages the memory automatically as when a block is deleted, the UserData is deleted with it. </w:t>
+        <w:t xml:space="preserve">The solution was a mechanism for syncing both ways built around QTextBlockUserData. As QTextDocument is organised into blocks Each block previously did not have a concept of ElementType. A BlockData subclass of QTextBlockUserData was introduced. It stores one ElementType value and is attached to each block when </w:t>
+      </w:r>
+      <w:proofErr w:type="spellStart"/>
+      <w:r>
+        <w:t>applyElementFormatting</w:t>
+      </w:r>
+      <w:proofErr w:type="spellEnd"/>
+      <w:r>
+        <w:t xml:space="preserve"> is called. Qt manages the memory automatically as when a block is deleted, the </w:t>
+      </w:r>
+      <w:proofErr w:type="spellStart"/>
+      <w:r>
+        <w:t>UserData</w:t>
+      </w:r>
+      <w:proofErr w:type="spellEnd"/>
+      <w:r>
+        <w:t xml:space="preserve"> is deleted with it. </w:t>
       </w:r>
     </w:p>
     <w:p/>
@@ -8563,7 +10097,15 @@
     <w:p/>
     <w:p>
       <w:r>
-        <w:t>loadFromScript() returns all all scene headings and elements as an ordered list of (ElementType, Text) pairs. The editor clears the document and repopulates it block by block, applying the correct formatting for each element type and registering scene heading block positions for the navigator.</w:t>
+        <w:t xml:space="preserve">loadFromScript() returns all </w:t>
+      </w:r>
+      <w:proofErr w:type="spellStart"/>
+      <w:r>
+        <w:t>all</w:t>
+      </w:r>
+      <w:proofErr w:type="spellEnd"/>
+      <w:r>
+        <w:t xml:space="preserve"> scene headings and elements as an ordered list of (ElementType, Text) pairs. The editor clears the document and repopulates it block by block, applying the correct formatting for each element type and registering scene heading block positions for the navigator.</w:t>
       </w:r>
     </w:p>
     <w:p/>
@@ -8577,11 +10119,35 @@
     </w:p>
     <w:p>
       <w:r>
-        <w:t xml:space="preserve">A bug was identified where clicking a scene in SceneNavigator caused the last block in the editor to have its formatting changed to ACTION. Tracing the signal chain revealed the cause was onSceneSelected was emitting </w:t>
+        <w:t xml:space="preserve">A bug was identified where clicking a scene in SceneNavigator caused the last block in the editor to have </w:t>
+      </w:r>
+      <w:proofErr w:type="gramStart"/>
+      <w:r>
+        <w:t>its</w:t>
+      </w:r>
+      <w:proofErr w:type="gramEnd"/>
+      <w:r>
+        <w:t xml:space="preserve"> formatting changed to ACTION. Tracing the signal chain revealed the cause was </w:t>
+      </w:r>
+      <w:proofErr w:type="spellStart"/>
+      <w:r>
+        <w:t>onSceneSelected</w:t>
+      </w:r>
+      <w:proofErr w:type="spellEnd"/>
+      <w:r>
+        <w:t xml:space="preserve"> was emitting </w:t>
       </w:r>
       <w:r>
         <w:lastRenderedPageBreak/>
-        <w:t>elementTypeChanged(ACTION) after navigation. ScriptEditor would take this signal and change the formatting to whatever block the cursor happened to be on. The deeper issue was architectural. currentElementType_ in ScriptViewModel was serving two purposes:</w:t>
+        <w:t xml:space="preserve">elementTypeChanged(ACTION) after navigation. ScriptEditor would take this signal and change the formatting to whatever block the cursor happened to be on. The deeper issue was architectural. </w:t>
+      </w:r>
+      <w:proofErr w:type="spellStart"/>
+      <w:r>
+        <w:t>currentElementType</w:t>
+      </w:r>
+      <w:proofErr w:type="spellEnd"/>
+      <w:r>
+        <w:t>_ in ScriptViewModel was serving two purposes:</w:t>
       </w:r>
     </w:p>
     <w:p>
@@ -8611,7 +10177,15 @@
     <w:p/>
     <w:p>
       <w:r>
-        <w:t>The fix was to remove elementTypeChanged from onSceneSelected entirely. Navigation now only  emits the appropriate signals.</w:t>
+        <w:t xml:space="preserve">The fix was to remove elementTypeChanged from </w:t>
+      </w:r>
+      <w:proofErr w:type="spellStart"/>
+      <w:r>
+        <w:t>onSceneSelected</w:t>
+      </w:r>
+      <w:proofErr w:type="spellEnd"/>
+      <w:r>
+        <w:t xml:space="preserve"> entirely. Navigation now only  emits the appropriate signals.</w:t>
       </w:r>
     </w:p>
     <w:p/>
@@ -8765,7 +10339,27 @@
           <w:spacing w:val="7"/>
           <w:shd w:val="clear" w:color="auto" w:fill="FFFFFF"/>
         </w:rPr>
-        <w:t>This section will evaluate both the process and products of your project based on your previously developed criteria.   Note that the ‘products’ of your project include not just the principal artefact that you have developed, but also design and other documentation associated with the development process.   It is also appropriate to discuss the results of any external validation of your artefacts in this section.  The evaluation of the process should consider all elements of your project methodology as well as project management issues</w:t>
+        <w:t xml:space="preserve">This section will evaluate both the process and products of your project based on your previously developed criteria.   Note that the ‘products’ of your project include not just the principal artefact that you have </w:t>
+      </w:r>
+      <w:proofErr w:type="gramStart"/>
+      <w:r>
+        <w:rPr>
+          <w:rFonts w:ascii="Trebuchet MS" w:hAnsi="Trebuchet MS" w:cs="Open Sans"/>
+          <w:color w:val="FF0000"/>
+          <w:spacing w:val="7"/>
+          <w:shd w:val="clear" w:color="auto" w:fill="FFFFFF"/>
+        </w:rPr>
+        <w:t>developed, but</w:t>
+      </w:r>
+      <w:proofErr w:type="gramEnd"/>
+      <w:r>
+        <w:rPr>
+          <w:rFonts w:ascii="Trebuchet MS" w:hAnsi="Trebuchet MS" w:cs="Open Sans"/>
+          <w:color w:val="FF0000"/>
+          <w:spacing w:val="7"/>
+          <w:shd w:val="clear" w:color="auto" w:fill="FFFFFF"/>
+        </w:rPr>
+        <w:t xml:space="preserve"> also design and other documentation associated with the development process.   It is also appropriate to discuss the results of any external validation of your artefacts in this section.  The evaluation of the process should consider all elements of your project methodology as well as project management issues</w:t>
       </w:r>
     </w:p>
     <w:p>
@@ -8799,15 +10393,166 @@
         <w:t xml:space="preserve"> </w:t>
       </w:r>
     </w:p>
-    <w:p>
-      <w:pPr>
-        <w:pStyle w:val="Essayparagraphtext"/>
-        <w:spacing w:after="200"/>
-        <w:rPr>
-          <w:rFonts w:cs="Arial"/>
-        </w:rPr>
-      </w:pPr>
-    </w:p>
+    <w:p/>
+    <w:p>
+      <w:r>
+        <w:t>Several areas of the project are identified as candidates for further development.</w:t>
+      </w:r>
+    </w:p>
+    <w:p/>
+    <w:p>
+      <w:pPr>
+        <w:pStyle w:val="Heading3"/>
+      </w:pPr>
+      <w:r>
+        <w:t>ScriptEditor Refactoring</w:t>
+      </w:r>
+    </w:p>
+    <w:p>
+      <w:r>
+        <w:t>ScriptEditor accumulated a lot of responsibility over the course of incremental development:</w:t>
+      </w:r>
+    </w:p>
+    <w:p>
+      <w:pPr>
+        <w:pStyle w:val="ListParagraph"/>
+        <w:numPr>
+          <w:ilvl w:val="0"/>
+          <w:numId w:val="4"/>
+        </w:numPr>
+      </w:pPr>
+      <w:r>
+        <w:t>Handling Formatting</w:t>
+      </w:r>
+    </w:p>
+    <w:p>
+      <w:pPr>
+        <w:pStyle w:val="ListParagraph"/>
+        <w:numPr>
+          <w:ilvl w:val="0"/>
+          <w:numId w:val="4"/>
+        </w:numPr>
+      </w:pPr>
+      <w:r>
+        <w:t>Key Event interception</w:t>
+      </w:r>
+    </w:p>
+    <w:p>
+      <w:pPr>
+        <w:pStyle w:val="ListParagraph"/>
+        <w:numPr>
+          <w:ilvl w:val="0"/>
+          <w:numId w:val="4"/>
+        </w:numPr>
+      </w:pPr>
+      <w:r>
+        <w:t>Sync to Model</w:t>
+      </w:r>
+    </w:p>
+    <w:p>
+      <w:pPr>
+        <w:pStyle w:val="ListParagraph"/>
+        <w:numPr>
+          <w:ilvl w:val="0"/>
+          <w:numId w:val="4"/>
+        </w:numPr>
+      </w:pPr>
+      <w:r>
+        <w:t>Load from Model</w:t>
+      </w:r>
+    </w:p>
+    <w:p>
+      <w:pPr>
+        <w:pStyle w:val="ListParagraph"/>
+        <w:numPr>
+          <w:ilvl w:val="0"/>
+          <w:numId w:val="4"/>
+        </w:numPr>
+      </w:pPr>
+      <w:r>
+        <w:t>Block Tracking</w:t>
+      </w:r>
+    </w:p>
+    <w:p>
+      <w:pPr>
+        <w:pStyle w:val="ListParagraph"/>
+        <w:numPr>
+          <w:ilvl w:val="0"/>
+          <w:numId w:val="4"/>
+        </w:numPr>
+      </w:pPr>
+      <w:r>
+        <w:t>Cursor Position</w:t>
+      </w:r>
+    </w:p>
+    <w:p>
+      <w:pPr>
+        <w:pStyle w:val="ListParagraph"/>
+        <w:numPr>
+          <w:ilvl w:val="0"/>
+          <w:numId w:val="4"/>
+        </w:numPr>
+      </w:pPr>
+      <w:r>
+        <w:t>Element Type Picking</w:t>
+      </w:r>
+    </w:p>
+    <w:p>
+      <w:pPr>
+        <w:pStyle w:val="ListParagraph"/>
+        <w:numPr>
+          <w:ilvl w:val="0"/>
+          <w:numId w:val="4"/>
+        </w:numPr>
+      </w:pPr>
+      <w:r>
+        <w:t>Document Change Detection</w:t>
+      </w:r>
+    </w:p>
+    <w:p>
+      <w:r>
+        <w:t>A future refactor could extract a DocumentManager class to own the sync, load, and block tracking functionality. This would leave ScriptEditor responsible only for formatting and key handling. This would reduce the class’s responsibility to a more manageable scope and make each concern independently testable.</w:t>
+      </w:r>
+    </w:p>
+    <w:p/>
+    <w:p>
+      <w:pPr>
+        <w:pStyle w:val="Heading3"/>
+      </w:pPr>
+      <w:r>
+        <w:t>User Feedback Evaluation</w:t>
+      </w:r>
+    </w:p>
+    <w:p>
+      <w:r>
+        <w:t>User feedback testing via a questionnaire was considered as an evaluation method but fell outside of the scope of the project given time constraints. A proposed methodology would distribute a mixed methods questionnaire to university students studying media related degrees, personally known screenwriters and online screenwriting communities via university approved Jisc Online Surveys. The questionnaire would contain questions on features, usability alongside qualitative questions identifying specific gaps. This data would provide external validation of the application beyond the requirements comparison and heuristic evaluation conducted here.</w:t>
+      </w:r>
+    </w:p>
+    <w:p/>
+    <w:p>
+      <w:pPr>
+        <w:pStyle w:val="Heading3"/>
+      </w:pPr>
+      <w:r>
+        <w:t>Character Autocomplete</w:t>
+      </w:r>
+    </w:p>
+    <w:p>
+      <w:r>
+        <w:t>Character autocomplete was included as a functional requirement but was not implemented. The CharacterRegister service class is already in place. The implementation would intercept text entry when the current element type is CHARACTER, extract previously used character names from the model and display a completion popup.</w:t>
+      </w:r>
+    </w:p>
+    <w:p/>
+    <w:p>
+      <w:pPr>
+        <w:pStyle w:val="Heading3"/>
+      </w:pPr>
+      <w:r>
+        <w:lastRenderedPageBreak/>
+        <w:t>Additional Unit Tests</w:t>
+      </w:r>
+    </w:p>
+    <w:p/>
     <w:p>
       <w:pPr>
         <w:spacing w:line="360" w:lineRule="auto"/>
@@ -8958,7 +10703,7 @@
         </w:rPr>
         <w:br/>
       </w:r>
-      <w:hyperlink r:id="rId24">
+      <w:hyperlink r:id="rId25">
         <w:r>
           <w:rPr>
             <w:rStyle w:val="Hyperlink"/>
@@ -9113,7 +10858,7 @@
         </w:rPr>
         <w:t xml:space="preserve"> </w:t>
       </w:r>
-      <w:hyperlink r:id="rId25">
+      <w:hyperlink r:id="rId26">
         <w:r>
           <w:rPr>
             <w:rStyle w:val="Hyperlink"/>
@@ -9146,12 +10891,12 @@
         <w:pStyle w:val="Heading1"/>
         <w:jc w:val="center"/>
         <w:sectPr>
-          <w:headerReference w:type="even" r:id="rId26"/>
-          <w:headerReference w:type="default" r:id="rId27"/>
-          <w:footerReference w:type="even" r:id="rId28"/>
-          <w:footerReference w:type="default" r:id="rId29"/>
-          <w:headerReference w:type="first" r:id="rId30"/>
-          <w:footerReference w:type="first" r:id="rId31"/>
+          <w:headerReference w:type="even" r:id="rId27"/>
+          <w:headerReference w:type="default" r:id="rId28"/>
+          <w:footerReference w:type="even" r:id="rId29"/>
+          <w:footerReference w:type="default" r:id="rId30"/>
+          <w:headerReference w:type="first" r:id="rId31"/>
+          <w:footerReference w:type="first" r:id="rId32"/>
           <w:pgSz w:w="11906" w:h="16838"/>
           <w:pgMar w:top="2155" w:right="1418" w:bottom="2155" w:left="1814" w:header="709" w:footer="709" w:gutter="0"/>
           <w:pgNumType w:start="1"/>
@@ -9239,12 +10984,12 @@
           <w:szCs w:val="28"/>
         </w:rPr>
         <w:sectPr>
-          <w:headerReference w:type="even" r:id="rId32"/>
-          <w:headerReference w:type="default" r:id="rId33"/>
-          <w:footerReference w:type="even" r:id="rId34"/>
-          <w:footerReference w:type="default" r:id="rId35"/>
-          <w:headerReference w:type="first" r:id="rId36"/>
-          <w:footerReference w:type="first" r:id="rId37"/>
+          <w:headerReference w:type="even" r:id="rId33"/>
+          <w:headerReference w:type="default" r:id="rId34"/>
+          <w:footerReference w:type="even" r:id="rId35"/>
+          <w:footerReference w:type="default" r:id="rId36"/>
+          <w:headerReference w:type="first" r:id="rId37"/>
+          <w:footerReference w:type="first" r:id="rId38"/>
           <w:pgSz w:w="11906" w:h="16838"/>
           <w:pgMar w:top="2155" w:right="1418" w:bottom="2155" w:left="1814" w:header="709" w:footer="709" w:gutter="0"/>
           <w:pgNumType w:fmt="upperLetter" w:start="1"/>
@@ -9492,12 +11237,12 @@
           <w:rFonts w:cs="Arial"/>
         </w:rPr>
         <w:sectPr>
-          <w:headerReference w:type="even" r:id="rId38"/>
-          <w:headerReference w:type="default" r:id="rId39"/>
-          <w:footerReference w:type="even" r:id="rId40"/>
-          <w:footerReference w:type="default" r:id="rId41"/>
-          <w:headerReference w:type="first" r:id="rId42"/>
-          <w:footerReference w:type="first" r:id="rId43"/>
+          <w:headerReference w:type="even" r:id="rId39"/>
+          <w:headerReference w:type="default" r:id="rId40"/>
+          <w:footerReference w:type="even" r:id="rId41"/>
+          <w:footerReference w:type="default" r:id="rId42"/>
+          <w:headerReference w:type="first" r:id="rId43"/>
+          <w:footerReference w:type="first" r:id="rId44"/>
           <w:pgSz w:w="11906" w:h="16838"/>
           <w:pgMar w:top="2155" w:right="1418" w:bottom="2155" w:left="1814" w:header="709" w:footer="709" w:gutter="0"/>
           <w:cols w:space="720"/>
@@ -9528,12 +11273,12 @@
     </w:p>
     <w:p/>
     <w:sectPr>
-      <w:headerReference w:type="even" r:id="rId44"/>
-      <w:headerReference w:type="default" r:id="rId45"/>
-      <w:footerReference w:type="even" r:id="rId46"/>
-      <w:footerReference w:type="default" r:id="rId47"/>
-      <w:headerReference w:type="first" r:id="rId48"/>
-      <w:footerReference w:type="first" r:id="rId49"/>
+      <w:headerReference w:type="even" r:id="rId45"/>
+      <w:headerReference w:type="default" r:id="rId46"/>
+      <w:footerReference w:type="even" r:id="rId47"/>
+      <w:footerReference w:type="default" r:id="rId48"/>
+      <w:headerReference w:type="first" r:id="rId49"/>
+      <w:footerReference w:type="first" r:id="rId50"/>
       <w:pgSz w:w="11906" w:h="16838"/>
       <w:pgMar w:top="2155" w:right="1418" w:bottom="2155" w:left="1814" w:header="709" w:footer="709" w:gutter="0"/>
       <w:pgNumType w:fmt="upperLetter"/>
@@ -11296,6 +13041,95 @@
     </w:lvl>
   </w:abstractNum>
   <w:abstractNum w:abstractNumId="1" w15:restartNumberingAfterBreak="0">
+    <w:nsid w:val="157613AC"/>
+    <w:multiLevelType w:val="hybridMultilevel"/>
+    <w:tmpl w:val="9A4CC0B6"/>
+    <w:lvl w:ilvl="0" w:tplc="0809000F">
+      <w:start w:val="1"/>
+      <w:numFmt w:val="decimal"/>
+      <w:lvlText w:val="%1."/>
+      <w:lvlJc w:val="left"/>
+      <w:pPr>
+        <w:ind w:left="720" w:hanging="360"/>
+      </w:pPr>
+      <w:rPr>
+        <w:rFonts w:hint="default"/>
+      </w:rPr>
+    </w:lvl>
+    <w:lvl w:ilvl="1" w:tplc="08090019" w:tentative="1">
+      <w:start w:val="1"/>
+      <w:numFmt w:val="lowerLetter"/>
+      <w:lvlText w:val="%2."/>
+      <w:lvlJc w:val="left"/>
+      <w:pPr>
+        <w:ind w:left="1440" w:hanging="360"/>
+      </w:pPr>
+    </w:lvl>
+    <w:lvl w:ilvl="2" w:tplc="0809001B" w:tentative="1">
+      <w:start w:val="1"/>
+      <w:numFmt w:val="lowerRoman"/>
+      <w:lvlText w:val="%3."/>
+      <w:lvlJc w:val="right"/>
+      <w:pPr>
+        <w:ind w:left="2160" w:hanging="180"/>
+      </w:pPr>
+    </w:lvl>
+    <w:lvl w:ilvl="3" w:tplc="0809000F" w:tentative="1">
+      <w:start w:val="1"/>
+      <w:numFmt w:val="decimal"/>
+      <w:lvlText w:val="%4."/>
+      <w:lvlJc w:val="left"/>
+      <w:pPr>
+        <w:ind w:left="2880" w:hanging="360"/>
+      </w:pPr>
+    </w:lvl>
+    <w:lvl w:ilvl="4" w:tplc="08090019" w:tentative="1">
+      <w:start w:val="1"/>
+      <w:numFmt w:val="lowerLetter"/>
+      <w:lvlText w:val="%5."/>
+      <w:lvlJc w:val="left"/>
+      <w:pPr>
+        <w:ind w:left="3600" w:hanging="360"/>
+      </w:pPr>
+    </w:lvl>
+    <w:lvl w:ilvl="5" w:tplc="0809001B" w:tentative="1">
+      <w:start w:val="1"/>
+      <w:numFmt w:val="lowerRoman"/>
+      <w:lvlText w:val="%6."/>
+      <w:lvlJc w:val="right"/>
+      <w:pPr>
+        <w:ind w:left="4320" w:hanging="180"/>
+      </w:pPr>
+    </w:lvl>
+    <w:lvl w:ilvl="6" w:tplc="0809000F" w:tentative="1">
+      <w:start w:val="1"/>
+      <w:numFmt w:val="decimal"/>
+      <w:lvlText w:val="%7."/>
+      <w:lvlJc w:val="left"/>
+      <w:pPr>
+        <w:ind w:left="5040" w:hanging="360"/>
+      </w:pPr>
+    </w:lvl>
+    <w:lvl w:ilvl="7" w:tplc="08090019" w:tentative="1">
+      <w:start w:val="1"/>
+      <w:numFmt w:val="lowerLetter"/>
+      <w:lvlText w:val="%8."/>
+      <w:lvlJc w:val="left"/>
+      <w:pPr>
+        <w:ind w:left="5760" w:hanging="360"/>
+      </w:pPr>
+    </w:lvl>
+    <w:lvl w:ilvl="8" w:tplc="0809001B" w:tentative="1">
+      <w:start w:val="1"/>
+      <w:numFmt w:val="lowerRoman"/>
+      <w:lvlText w:val="%9."/>
+      <w:lvlJc w:val="right"/>
+      <w:pPr>
+        <w:ind w:left="6480" w:hanging="180"/>
+      </w:pPr>
+    </w:lvl>
+  </w:abstractNum>
+  <w:abstractNum w:abstractNumId="2" w15:restartNumberingAfterBreak="0">
     <w:nsid w:val="422B3CFE"/>
     <w:multiLevelType w:val="multilevel"/>
     <w:tmpl w:val="4580A0BA"/>
@@ -11412,7 +13246,7 @@
       </w:pPr>
     </w:lvl>
   </w:abstractNum>
-  <w:abstractNum w:abstractNumId="2" w15:restartNumberingAfterBreak="0">
+  <w:abstractNum w:abstractNumId="3" w15:restartNumberingAfterBreak="0">
     <w:nsid w:val="46125391"/>
     <w:multiLevelType w:val="hybridMultilevel"/>
     <w:tmpl w:val="B7E08CD6"/>
@@ -11501,7 +13335,7 @@
       </w:pPr>
     </w:lvl>
   </w:abstractNum>
-  <w:abstractNum w:abstractNumId="3" w15:restartNumberingAfterBreak="0">
+  <w:abstractNum w:abstractNumId="4" w15:restartNumberingAfterBreak="0">
     <w:nsid w:val="4D9A4B56"/>
     <w:multiLevelType w:val="multilevel"/>
     <w:tmpl w:val="E31EAD02"/>
@@ -11615,7 +13449,7 @@
       </w:pPr>
     </w:lvl>
   </w:abstractNum>
-  <w:abstractNum w:abstractNumId="4" w15:restartNumberingAfterBreak="0">
+  <w:abstractNum w:abstractNumId="5" w15:restartNumberingAfterBreak="0">
     <w:nsid w:val="635B71C9"/>
     <w:multiLevelType w:val="hybridMultilevel"/>
     <w:tmpl w:val="92DA5EB2"/>
@@ -11728,20 +13562,115 @@
       </w:rPr>
     </w:lvl>
   </w:abstractNum>
+  <w:abstractNum w:abstractNumId="6" w15:restartNumberingAfterBreak="0">
+    <w:nsid w:val="636C7687"/>
+    <w:multiLevelType w:val="hybridMultilevel"/>
+    <w:tmpl w:val="AEEE7CFA"/>
+    <w:lvl w:ilvl="0" w:tplc="0809000F">
+      <w:start w:val="1"/>
+      <w:numFmt w:val="decimal"/>
+      <w:lvlText w:val="%1."/>
+      <w:lvlJc w:val="left"/>
+      <w:pPr>
+        <w:ind w:left="720" w:hanging="360"/>
+      </w:pPr>
+      <w:rPr>
+        <w:rFonts w:hint="default"/>
+      </w:rPr>
+    </w:lvl>
+    <w:lvl w:ilvl="1" w:tplc="08090019" w:tentative="1">
+      <w:start w:val="1"/>
+      <w:numFmt w:val="lowerLetter"/>
+      <w:lvlText w:val="%2."/>
+      <w:lvlJc w:val="left"/>
+      <w:pPr>
+        <w:ind w:left="1440" w:hanging="360"/>
+      </w:pPr>
+    </w:lvl>
+    <w:lvl w:ilvl="2" w:tplc="0809001B" w:tentative="1">
+      <w:start w:val="1"/>
+      <w:numFmt w:val="lowerRoman"/>
+      <w:lvlText w:val="%3."/>
+      <w:lvlJc w:val="right"/>
+      <w:pPr>
+        <w:ind w:left="2160" w:hanging="180"/>
+      </w:pPr>
+    </w:lvl>
+    <w:lvl w:ilvl="3" w:tplc="0809000F" w:tentative="1">
+      <w:start w:val="1"/>
+      <w:numFmt w:val="decimal"/>
+      <w:lvlText w:val="%4."/>
+      <w:lvlJc w:val="left"/>
+      <w:pPr>
+        <w:ind w:left="2880" w:hanging="360"/>
+      </w:pPr>
+    </w:lvl>
+    <w:lvl w:ilvl="4" w:tplc="08090019" w:tentative="1">
+      <w:start w:val="1"/>
+      <w:numFmt w:val="lowerLetter"/>
+      <w:lvlText w:val="%5."/>
+      <w:lvlJc w:val="left"/>
+      <w:pPr>
+        <w:ind w:left="3600" w:hanging="360"/>
+      </w:pPr>
+    </w:lvl>
+    <w:lvl w:ilvl="5" w:tplc="0809001B" w:tentative="1">
+      <w:start w:val="1"/>
+      <w:numFmt w:val="lowerRoman"/>
+      <w:lvlText w:val="%6."/>
+      <w:lvlJc w:val="right"/>
+      <w:pPr>
+        <w:ind w:left="4320" w:hanging="180"/>
+      </w:pPr>
+    </w:lvl>
+    <w:lvl w:ilvl="6" w:tplc="0809000F" w:tentative="1">
+      <w:start w:val="1"/>
+      <w:numFmt w:val="decimal"/>
+      <w:lvlText w:val="%7."/>
+      <w:lvlJc w:val="left"/>
+      <w:pPr>
+        <w:ind w:left="5040" w:hanging="360"/>
+      </w:pPr>
+    </w:lvl>
+    <w:lvl w:ilvl="7" w:tplc="08090019" w:tentative="1">
+      <w:start w:val="1"/>
+      <w:numFmt w:val="lowerLetter"/>
+      <w:lvlText w:val="%8."/>
+      <w:lvlJc w:val="left"/>
+      <w:pPr>
+        <w:ind w:left="5760" w:hanging="360"/>
+      </w:pPr>
+    </w:lvl>
+    <w:lvl w:ilvl="8" w:tplc="0809001B" w:tentative="1">
+      <w:start w:val="1"/>
+      <w:numFmt w:val="lowerRoman"/>
+      <w:lvlText w:val="%9."/>
+      <w:lvlJc w:val="right"/>
+      <w:pPr>
+        <w:ind w:left="6480" w:hanging="180"/>
+      </w:pPr>
+    </w:lvl>
+  </w:abstractNum>
   <w:num w:numId="1" w16cid:durableId="1736656778">
-    <w:abstractNumId w:val="1"/>
+    <w:abstractNumId w:val="2"/>
   </w:num>
   <w:num w:numId="2" w16cid:durableId="169108809">
-    <w:abstractNumId w:val="3"/>
+    <w:abstractNumId w:val="4"/>
   </w:num>
   <w:num w:numId="3" w16cid:durableId="1503398820">
     <w:abstractNumId w:val="0"/>
   </w:num>
   <w:num w:numId="4" w16cid:durableId="799230032">
-    <w:abstractNumId w:val="4"/>
+    <w:abstractNumId w:val="5"/>
   </w:num>
   <w:num w:numId="5" w16cid:durableId="1406412410">
-    <w:abstractNumId w:val="2"/>
+    <w:abstractNumId w:val="3"/>
+  </w:num>
+  <w:num w:numId="6" w16cid:durableId="1968899921">
+    <w:abstractNumId w:val="6"/>
+  </w:num>
+  <w:num w:numId="7" w16cid:durableId="1618949545">
+    <w:abstractNumId w:val="1"/>
   </w:num>
 </w:numbering>
 </file>
@@ -12900,6 +14829,27 @@
       <w:contextualSpacing/>
     </w:pPr>
   </w:style>
+  <w:style w:type="paragraph" w:customStyle="1" w:styleId="code">
+    <w:name w:val="code"/>
+    <w:basedOn w:val="Normal"/>
+    <w:link w:val="codeChar"/>
+    <w:qFormat/>
+    <w:rsid w:val="00874AC1"/>
+    <w:rPr>
+      <w:rFonts w:ascii="Courier New" w:hAnsi="Courier New"/>
+    </w:rPr>
+  </w:style>
+  <w:style w:type="character" w:customStyle="1" w:styleId="codeChar">
+    <w:name w:val="code Char"/>
+    <w:basedOn w:val="DefaultParagraphFont"/>
+    <w:link w:val="code"/>
+    <w:rsid w:val="00874AC1"/>
+    <w:rPr>
+      <w:rFonts w:ascii="Courier New" w:eastAsia="Times New Roman" w:hAnsi="Courier New" w:cs="Times New Roman"/>
+      <w:sz w:val="26"/>
+      <w:lang w:eastAsia="en-GB"/>
+    </w:rPr>
+  </w:style>
 </w:styles>
 </file>
 

</xml_diff>